<commit_message>
Fix Hebrew RTL direction in generated Word documents
- Bake RTL markers directly into YNSHOUF_Template.docx: added <w:bidi/>
  to all 58 paragraph properties, <w:rtl/> + lang he-IL to all 54 run
  properties, RTL docDefaults in styles.xml, and document-level <w:bidi/>
  in settings.xml
- Improve JS post-processing fallback in genReport: regex now matches
  <w:pPr> and <w:rPr> tags with attributes (e.g. w:rsidR), handles
  self-closing tags, and uses {2,} dedup to avoid missed consecutive duplicates

Co-Authored-By: Claude Sonnet 4.6 <noreply@anthropic.com>
</commit_message>
<xml_diff>
--- a/ynshouf-app/ynshouf-app/YNSHOUF_Template.docx
+++ b/ynshouf-app/ynshouf-app/YNSHOUF_Template.docx
@@ -33,10 +33,13 @@
           </w:tcPr>
           <w:p>
             <w:pPr>
-              <w:jc w:val="left"/>
-            </w:pPr>
-            <w:r>
-              <w:rPr>
+              <w:bidi/>
+              <w:jc w:val="right"/>
+            </w:pPr>
+            <w:r>
+              <w:rPr>
+                <w:rtl/>
+                <w:lang w:bidi="he-IL"/>
                 <w:rFonts w:ascii="David" w:cs="David" w:eastAsia="David" w:hAnsi="David"/>
                 <w:sz w:val="20"/>
                 <w:szCs w:val="20"/>
@@ -58,10 +61,13 @@
           </w:tcPr>
           <w:p>
             <w:pPr>
+              <w:bidi/>
               <w:jc w:val="center"/>
             </w:pPr>
             <w:r>
               <w:rPr>
+                <w:rtl/>
+                <w:lang w:bidi="he-IL"/>
                 <w:rFonts w:ascii="David" w:cs="David" w:eastAsia="David" w:hAnsi="David"/>
                 <w:b/>
                 <w:bCs/>
@@ -93,11 +99,14 @@
     </w:tbl>
     <w:p>
       <w:pPr>
+        <w:bidi/>
         <w:spacing w:after="60" w:before="120"/>
         <w:jc w:val="center"/>
       </w:pPr>
       <w:r>
         <w:rPr>
+          <w:rtl/>
+          <w:lang w:bidi="he-IL"/>
           <w:rFonts w:ascii="David" w:cs="David" w:eastAsia="David" w:hAnsi="David"/>
           <w:b/>
           <w:bCs/>
@@ -109,11 +118,14 @@
     </w:p>
     <w:p>
       <w:pPr>
+        <w:bidi/>
         <w:spacing w:after="200"/>
         <w:jc w:val="center"/>
       </w:pPr>
       <w:r>
         <w:rPr>
+          <w:rtl/>
+          <w:lang w:bidi="he-IL"/>
           <w:rFonts w:ascii="David" w:cs="David" w:eastAsia="David" w:hAnsi="David"/>
           <w:sz w:val="24"/>
           <w:szCs w:val="24"/>
@@ -123,6 +135,7 @@
     </w:p>
     <w:p>
       <w:pPr>
+        <w:bidi/>
         <w:pBdr>
           <w:bottom w:val="single" w:color="1A7A4A" w:sz="6" w:space="4"/>
         </w:pBdr>
@@ -131,6 +144,8 @@
       </w:pPr>
       <w:r>
         <w:rPr>
+          <w:rtl/>
+          <w:lang w:bidi="he-IL"/>
           <w:rFonts w:ascii="David" w:cs="David" w:eastAsia="David" w:hAnsi="David"/>
           <w:b/>
           <w:bCs/>
@@ -143,11 +158,14 @@
     </w:p>
     <w:p>
       <w:pPr>
+        <w:bidi/>
         <w:spacing w:after="200" w:before="80"/>
         <w:jc w:val="right"/>
       </w:pPr>
       <w:r>
         <w:rPr>
+          <w:rtl/>
+          <w:lang w:bidi="he-IL"/>
           <w:rFonts w:ascii="David" w:cs="David" w:eastAsia="David" w:hAnsi="David"/>
           <w:sz w:val="22"/>
           <w:szCs w:val="22"/>
@@ -157,6 +175,7 @@
     </w:p>
     <w:p>
       <w:pPr>
+        <w:bidi/>
         <w:pBdr>
           <w:bottom w:val="single" w:color="1A7A4A" w:sz="6" w:space="4"/>
         </w:pBdr>
@@ -165,6 +184,8 @@
       </w:pPr>
       <w:r>
         <w:rPr>
+          <w:rtl/>
+          <w:lang w:bidi="he-IL"/>
           <w:rFonts w:ascii="David" w:cs="David" w:eastAsia="David" w:hAnsi="David"/>
           <w:b/>
           <w:bCs/>
@@ -211,10 +232,13 @@
           </w:tcPr>
           <w:p>
             <w:pPr>
-              <w:jc w:val="right"/>
-            </w:pPr>
-            <w:r>
-              <w:rPr>
+              <w:bidi/>
+              <w:jc w:val="right"/>
+            </w:pPr>
+            <w:r>
+              <w:rPr>
+                <w:rtl/>
+                <w:lang w:bidi="he-IL"/>
                 <w:rFonts w:ascii="David" w:cs="David" w:eastAsia="David" w:hAnsi="David"/>
                 <w:b w:val="false"/>
                 <w:bCs w:val="false"/>
@@ -246,10 +270,13 @@
           </w:tcPr>
           <w:p>
             <w:pPr>
-              <w:jc w:val="right"/>
-            </w:pPr>
-            <w:r>
-              <w:rPr>
+              <w:bidi/>
+              <w:jc w:val="right"/>
+            </w:pPr>
+            <w:r>
+              <w:rPr>
+                <w:rtl/>
+                <w:lang w:bidi="he-IL"/>
                 <w:rFonts w:ascii="David" w:cs="David" w:eastAsia="David" w:hAnsi="David"/>
                 <w:b/>
                 <w:bCs/>
@@ -282,10 +309,13 @@
           </w:tcPr>
           <w:p>
             <w:pPr>
-              <w:jc w:val="right"/>
-            </w:pPr>
-            <w:r>
-              <w:rPr>
+              <w:bidi/>
+              <w:jc w:val="right"/>
+            </w:pPr>
+            <w:r>
+              <w:rPr>
+                <w:rtl/>
+                <w:lang w:bidi="he-IL"/>
                 <w:rFonts w:ascii="David" w:cs="David" w:eastAsia="David" w:hAnsi="David"/>
                 <w:b w:val="false"/>
                 <w:bCs w:val="false"/>
@@ -317,10 +347,13 @@
           </w:tcPr>
           <w:p>
             <w:pPr>
-              <w:jc w:val="right"/>
-            </w:pPr>
-            <w:r>
-              <w:rPr>
+              <w:bidi/>
+              <w:jc w:val="right"/>
+            </w:pPr>
+            <w:r>
+              <w:rPr>
+                <w:rtl/>
+                <w:lang w:bidi="he-IL"/>
                 <w:rFonts w:ascii="David" w:cs="David" w:eastAsia="David" w:hAnsi="David"/>
                 <w:b/>
                 <w:bCs/>
@@ -353,10 +386,13 @@
           </w:tcPr>
           <w:p>
             <w:pPr>
-              <w:jc w:val="right"/>
-            </w:pPr>
-            <w:r>
-              <w:rPr>
+              <w:bidi/>
+              <w:jc w:val="right"/>
+            </w:pPr>
+            <w:r>
+              <w:rPr>
+                <w:rtl/>
+                <w:lang w:bidi="he-IL"/>
                 <w:rFonts w:ascii="David" w:cs="David" w:eastAsia="David" w:hAnsi="David"/>
                 <w:b w:val="false"/>
                 <w:bCs w:val="false"/>
@@ -388,10 +424,13 @@
           </w:tcPr>
           <w:p>
             <w:pPr>
-              <w:jc w:val="right"/>
-            </w:pPr>
-            <w:r>
-              <w:rPr>
+              <w:bidi/>
+              <w:jc w:val="right"/>
+            </w:pPr>
+            <w:r>
+              <w:rPr>
+                <w:rtl/>
+                <w:lang w:bidi="he-IL"/>
                 <w:rFonts w:ascii="David" w:cs="David" w:eastAsia="David" w:hAnsi="David"/>
                 <w:b/>
                 <w:bCs/>
@@ -424,10 +463,13 @@
           </w:tcPr>
           <w:p>
             <w:pPr>
-              <w:jc w:val="right"/>
-            </w:pPr>
-            <w:r>
-              <w:rPr>
+              <w:bidi/>
+              <w:jc w:val="right"/>
+            </w:pPr>
+            <w:r>
+              <w:rPr>
+                <w:rtl/>
+                <w:lang w:bidi="he-IL"/>
                 <w:rFonts w:ascii="David" w:cs="David" w:eastAsia="David" w:hAnsi="David"/>
                 <w:b w:val="false"/>
                 <w:bCs w:val="false"/>
@@ -459,10 +501,13 @@
           </w:tcPr>
           <w:p>
             <w:pPr>
-              <w:jc w:val="right"/>
-            </w:pPr>
-            <w:r>
-              <w:rPr>
+              <w:bidi/>
+              <w:jc w:val="right"/>
+            </w:pPr>
+            <w:r>
+              <w:rPr>
+                <w:rtl/>
+                <w:lang w:bidi="he-IL"/>
                 <w:rFonts w:ascii="David" w:cs="David" w:eastAsia="David" w:hAnsi="David"/>
                 <w:b/>
                 <w:bCs/>
@@ -495,10 +540,13 @@
           </w:tcPr>
           <w:p>
             <w:pPr>
-              <w:jc w:val="right"/>
-            </w:pPr>
-            <w:r>
-              <w:rPr>
+              <w:bidi/>
+              <w:jc w:val="right"/>
+            </w:pPr>
+            <w:r>
+              <w:rPr>
+                <w:rtl/>
+                <w:lang w:bidi="he-IL"/>
                 <w:rFonts w:ascii="David" w:cs="David" w:eastAsia="David" w:hAnsi="David"/>
                 <w:b w:val="false"/>
                 <w:bCs w:val="false"/>
@@ -530,10 +578,13 @@
           </w:tcPr>
           <w:p>
             <w:pPr>
-              <w:jc w:val="right"/>
-            </w:pPr>
-            <w:r>
-              <w:rPr>
+              <w:bidi/>
+              <w:jc w:val="right"/>
+            </w:pPr>
+            <w:r>
+              <w:rPr>
+                <w:rtl/>
+                <w:lang w:bidi="he-IL"/>
                 <w:rFonts w:ascii="David" w:cs="David" w:eastAsia="David" w:hAnsi="David"/>
                 <w:b/>
                 <w:bCs/>
@@ -566,10 +617,13 @@
           </w:tcPr>
           <w:p>
             <w:pPr>
-              <w:jc w:val="right"/>
-            </w:pPr>
-            <w:r>
-              <w:rPr>
+              <w:bidi/>
+              <w:jc w:val="right"/>
+            </w:pPr>
+            <w:r>
+              <w:rPr>
+                <w:rtl/>
+                <w:lang w:bidi="he-IL"/>
                 <w:rFonts w:ascii="David" w:cs="David" w:eastAsia="David" w:hAnsi="David"/>
                 <w:b w:val="false"/>
                 <w:bCs w:val="false"/>
@@ -601,10 +655,13 @@
           </w:tcPr>
           <w:p>
             <w:pPr>
-              <w:jc w:val="right"/>
-            </w:pPr>
-            <w:r>
-              <w:rPr>
+              <w:bidi/>
+              <w:jc w:val="right"/>
+            </w:pPr>
+            <w:r>
+              <w:rPr>
+                <w:rtl/>
+                <w:lang w:bidi="he-IL"/>
                 <w:rFonts w:ascii="David" w:cs="David" w:eastAsia="David" w:hAnsi="David"/>
                 <w:b/>
                 <w:bCs/>
@@ -637,10 +694,13 @@
           </w:tcPr>
           <w:p>
             <w:pPr>
-              <w:jc w:val="right"/>
-            </w:pPr>
-            <w:r>
-              <w:rPr>
+              <w:bidi/>
+              <w:jc w:val="right"/>
+            </w:pPr>
+            <w:r>
+              <w:rPr>
+                <w:rtl/>
+                <w:lang w:bidi="he-IL"/>
                 <w:rFonts w:ascii="David" w:cs="David" w:eastAsia="David" w:hAnsi="David"/>
                 <w:b w:val="false"/>
                 <w:bCs w:val="false"/>
@@ -672,10 +732,13 @@
           </w:tcPr>
           <w:p>
             <w:pPr>
-              <w:jc w:val="right"/>
-            </w:pPr>
-            <w:r>
-              <w:rPr>
+              <w:bidi/>
+              <w:jc w:val="right"/>
+            </w:pPr>
+            <w:r>
+              <w:rPr>
+                <w:rtl/>
+                <w:lang w:bidi="he-IL"/>
                 <w:rFonts w:ascii="David" w:cs="David" w:eastAsia="David" w:hAnsi="David"/>
                 <w:b/>
                 <w:bCs/>
@@ -691,11 +754,13 @@
     </w:tbl>
     <w:p>
       <w:pPr>
+        <w:bidi/>
         <w:spacing w:before="200"/>
       </w:pPr>
     </w:p>
     <w:p>
       <w:pPr>
+        <w:bidi/>
         <w:pBdr>
           <w:bottom w:val="single" w:color="1A7A4A" w:sz="6" w:space="4"/>
         </w:pBdr>
@@ -704,6 +769,8 @@
       </w:pPr>
       <w:r>
         <w:rPr>
+          <w:rtl/>
+          <w:lang w:bidi="he-IL"/>
           <w:rFonts w:ascii="David" w:cs="David" w:eastAsia="David" w:hAnsi="David"/>
           <w:b/>
           <w:bCs/>
@@ -750,10 +817,13 @@
           </w:tcPr>
           <w:p>
             <w:pPr>
-              <w:jc w:val="right"/>
-            </w:pPr>
-            <w:r>
-              <w:rPr>
+              <w:bidi/>
+              <w:jc w:val="right"/>
+            </w:pPr>
+            <w:r>
+              <w:rPr>
+                <w:rtl/>
+                <w:lang w:bidi="he-IL"/>
                 <w:rFonts w:ascii="David" w:cs="David" w:eastAsia="David" w:hAnsi="David"/>
                 <w:b w:val="false"/>
                 <w:bCs w:val="false"/>
@@ -785,10 +855,13 @@
           </w:tcPr>
           <w:p>
             <w:pPr>
-              <w:jc w:val="right"/>
-            </w:pPr>
-            <w:r>
-              <w:rPr>
+              <w:bidi/>
+              <w:jc w:val="right"/>
+            </w:pPr>
+            <w:r>
+              <w:rPr>
+                <w:rtl/>
+                <w:lang w:bidi="he-IL"/>
                 <w:rFonts w:ascii="David" w:cs="David" w:eastAsia="David" w:hAnsi="David"/>
                 <w:b/>
                 <w:bCs/>
@@ -821,10 +894,13 @@
           </w:tcPr>
           <w:p>
             <w:pPr>
-              <w:jc w:val="right"/>
-            </w:pPr>
-            <w:r>
-              <w:rPr>
+              <w:bidi/>
+              <w:jc w:val="right"/>
+            </w:pPr>
+            <w:r>
+              <w:rPr>
+                <w:rtl/>
+                <w:lang w:bidi="he-IL"/>
                 <w:rFonts w:ascii="David" w:cs="David" w:eastAsia="David" w:hAnsi="David"/>
                 <w:b w:val="false"/>
                 <w:bCs w:val="false"/>
@@ -856,10 +932,13 @@
           </w:tcPr>
           <w:p>
             <w:pPr>
-              <w:jc w:val="right"/>
-            </w:pPr>
-            <w:r>
-              <w:rPr>
+              <w:bidi/>
+              <w:jc w:val="right"/>
+            </w:pPr>
+            <w:r>
+              <w:rPr>
+                <w:rtl/>
+                <w:lang w:bidi="he-IL"/>
                 <w:rFonts w:ascii="David" w:cs="David" w:eastAsia="David" w:hAnsi="David"/>
                 <w:b/>
                 <w:bCs/>
@@ -892,10 +971,13 @@
           </w:tcPr>
           <w:p>
             <w:pPr>
-              <w:jc w:val="right"/>
-            </w:pPr>
-            <w:r>
-              <w:rPr>
+              <w:bidi/>
+              <w:jc w:val="right"/>
+            </w:pPr>
+            <w:r>
+              <w:rPr>
+                <w:rtl/>
+                <w:lang w:bidi="he-IL"/>
                 <w:rFonts w:ascii="David" w:cs="David" w:eastAsia="David" w:hAnsi="David"/>
                 <w:b w:val="false"/>
                 <w:bCs w:val="false"/>
@@ -927,10 +1009,13 @@
           </w:tcPr>
           <w:p>
             <w:pPr>
-              <w:jc w:val="right"/>
-            </w:pPr>
-            <w:r>
-              <w:rPr>
+              <w:bidi/>
+              <w:jc w:val="right"/>
+            </w:pPr>
+            <w:r>
+              <w:rPr>
+                <w:rtl/>
+                <w:lang w:bidi="he-IL"/>
                 <w:rFonts w:ascii="David" w:cs="David" w:eastAsia="David" w:hAnsi="David"/>
                 <w:b/>
                 <w:bCs/>
@@ -963,10 +1048,13 @@
           </w:tcPr>
           <w:p>
             <w:pPr>
-              <w:jc w:val="right"/>
-            </w:pPr>
-            <w:r>
-              <w:rPr>
+              <w:bidi/>
+              <w:jc w:val="right"/>
+            </w:pPr>
+            <w:r>
+              <w:rPr>
+                <w:rtl/>
+                <w:lang w:bidi="he-IL"/>
                 <w:rFonts w:ascii="David" w:cs="David" w:eastAsia="David" w:hAnsi="David"/>
                 <w:b w:val="false"/>
                 <w:bCs w:val="false"/>
@@ -998,10 +1086,13 @@
           </w:tcPr>
           <w:p>
             <w:pPr>
-              <w:jc w:val="right"/>
-            </w:pPr>
-            <w:r>
-              <w:rPr>
+              <w:bidi/>
+              <w:jc w:val="right"/>
+            </w:pPr>
+            <w:r>
+              <w:rPr>
+                <w:rtl/>
+                <w:lang w:bidi="he-IL"/>
                 <w:rFonts w:ascii="David" w:cs="David" w:eastAsia="David" w:hAnsi="David"/>
                 <w:b/>
                 <w:bCs/>
@@ -1034,10 +1125,13 @@
           </w:tcPr>
           <w:p>
             <w:pPr>
-              <w:jc w:val="right"/>
-            </w:pPr>
-            <w:r>
-              <w:rPr>
+              <w:bidi/>
+              <w:jc w:val="right"/>
+            </w:pPr>
+            <w:r>
+              <w:rPr>
+                <w:rtl/>
+                <w:lang w:bidi="he-IL"/>
                 <w:rFonts w:ascii="David" w:cs="David" w:eastAsia="David" w:hAnsi="David"/>
                 <w:b w:val="false"/>
                 <w:bCs w:val="false"/>
@@ -1069,10 +1163,13 @@
           </w:tcPr>
           <w:p>
             <w:pPr>
-              <w:jc w:val="right"/>
-            </w:pPr>
-            <w:r>
-              <w:rPr>
+              <w:bidi/>
+              <w:jc w:val="right"/>
+            </w:pPr>
+            <w:r>
+              <w:rPr>
+                <w:rtl/>
+                <w:lang w:bidi="he-IL"/>
                 <w:rFonts w:ascii="David" w:cs="David" w:eastAsia="David" w:hAnsi="David"/>
                 <w:b/>
                 <w:bCs/>
@@ -1105,10 +1202,13 @@
           </w:tcPr>
           <w:p>
             <w:pPr>
-              <w:jc w:val="right"/>
-            </w:pPr>
-            <w:r>
-              <w:rPr>
+              <w:bidi/>
+              <w:jc w:val="right"/>
+            </w:pPr>
+            <w:r>
+              <w:rPr>
+                <w:rtl/>
+                <w:lang w:bidi="he-IL"/>
                 <w:rFonts w:ascii="David" w:cs="David" w:eastAsia="David" w:hAnsi="David"/>
                 <w:b w:val="false"/>
                 <w:bCs w:val="false"/>
@@ -1140,10 +1240,13 @@
           </w:tcPr>
           <w:p>
             <w:pPr>
-              <w:jc w:val="right"/>
-            </w:pPr>
-            <w:r>
-              <w:rPr>
+              <w:bidi/>
+              <w:jc w:val="right"/>
+            </w:pPr>
+            <w:r>
+              <w:rPr>
+                <w:rtl/>
+                <w:lang w:bidi="he-IL"/>
                 <w:rFonts w:ascii="David" w:cs="David" w:eastAsia="David" w:hAnsi="David"/>
                 <w:b/>
                 <w:bCs/>
@@ -1176,10 +1279,13 @@
           </w:tcPr>
           <w:p>
             <w:pPr>
-              <w:jc w:val="right"/>
-            </w:pPr>
-            <w:r>
-              <w:rPr>
+              <w:bidi/>
+              <w:jc w:val="right"/>
+            </w:pPr>
+            <w:r>
+              <w:rPr>
+                <w:rtl/>
+                <w:lang w:bidi="he-IL"/>
                 <w:rFonts w:ascii="David" w:cs="David" w:eastAsia="David" w:hAnsi="David"/>
                 <w:b w:val="false"/>
                 <w:bCs w:val="false"/>
@@ -1211,10 +1317,13 @@
           </w:tcPr>
           <w:p>
             <w:pPr>
-              <w:jc w:val="right"/>
-            </w:pPr>
-            <w:r>
-              <w:rPr>
+              <w:bidi/>
+              <w:jc w:val="right"/>
+            </w:pPr>
+            <w:r>
+              <w:rPr>
+                <w:rtl/>
+                <w:lang w:bidi="he-IL"/>
                 <w:rFonts w:ascii="David" w:cs="David" w:eastAsia="David" w:hAnsi="David"/>
                 <w:b/>
                 <w:bCs/>
@@ -1230,11 +1339,13 @@
     </w:tbl>
     <w:p>
       <w:pPr>
+        <w:bidi/>
         <w:spacing w:before="200"/>
       </w:pPr>
     </w:p>
     <w:p>
       <w:pPr>
+        <w:bidi/>
         <w:pBdr>
           <w:bottom w:val="single" w:color="1A7A4A" w:sz="6" w:space="4"/>
         </w:pBdr>
@@ -1243,6 +1354,8 @@
       </w:pPr>
       <w:r>
         <w:rPr>
+          <w:rtl/>
+          <w:lang w:bidi="he-IL"/>
           <w:rFonts w:ascii="David" w:cs="David" w:eastAsia="David" w:hAnsi="David"/>
           <w:b/>
           <w:bCs/>
@@ -1255,6 +1368,7 @@
     </w:p>
     <w:p>
       <w:pPr>
+        <w:bidi/>
         <w:pBdr>
           <w:top w:val="single" w:color="CCCCCC" w:sz="4"/>
           <w:left w:val="single" w:color="CCCCCC" w:sz="4"/>
@@ -1266,6 +1380,8 @@
       </w:pPr>
       <w:r>
         <w:rPr>
+          <w:rtl/>
+          <w:lang w:bidi="he-IL"/>
           <w:rFonts w:ascii="David" w:cs="David" w:eastAsia="David" w:hAnsi="David"/>
           <w:color w:val="999999"/>
           <w:sz w:val="20"/>
@@ -1276,11 +1392,13 @@
     </w:p>
     <w:p>
       <w:pPr>
+        <w:bidi/>
         <w:spacing w:before="200"/>
       </w:pPr>
     </w:p>
     <w:p>
       <w:pPr>
+        <w:bidi/>
         <w:pBdr>
           <w:bottom w:val="single" w:color="1A7A4A" w:sz="6" w:space="4"/>
         </w:pBdr>
@@ -1289,6 +1407,8 @@
       </w:pPr>
       <w:r>
         <w:rPr>
+          <w:rtl/>
+          <w:lang w:bidi="he-IL"/>
           <w:rFonts w:ascii="David" w:cs="David" w:eastAsia="David" w:hAnsi="David"/>
           <w:b/>
           <w:bCs/>
@@ -1335,10 +1455,13 @@
           </w:tcPr>
           <w:p>
             <w:pPr>
-              <w:jc w:val="right"/>
-            </w:pPr>
-            <w:r>
-              <w:rPr>
+              <w:bidi/>
+              <w:jc w:val="right"/>
+            </w:pPr>
+            <w:r>
+              <w:rPr>
+                <w:rtl/>
+                <w:lang w:bidi="he-IL"/>
                 <w:rFonts w:ascii="David" w:cs="David" w:eastAsia="David" w:hAnsi="David"/>
                 <w:b w:val="false"/>
                 <w:bCs w:val="false"/>
@@ -1370,10 +1493,13 @@
           </w:tcPr>
           <w:p>
             <w:pPr>
-              <w:jc w:val="right"/>
-            </w:pPr>
-            <w:r>
-              <w:rPr>
+              <w:bidi/>
+              <w:jc w:val="right"/>
+            </w:pPr>
+            <w:r>
+              <w:rPr>
+                <w:rtl/>
+                <w:lang w:bidi="he-IL"/>
                 <w:rFonts w:ascii="David" w:cs="David" w:eastAsia="David" w:hAnsi="David"/>
                 <w:b/>
                 <w:bCs/>
@@ -1406,10 +1532,13 @@
           </w:tcPr>
           <w:p>
             <w:pPr>
-              <w:jc w:val="right"/>
-            </w:pPr>
-            <w:r>
-              <w:rPr>
+              <w:bidi/>
+              <w:jc w:val="right"/>
+            </w:pPr>
+            <w:r>
+              <w:rPr>
+                <w:rtl/>
+                <w:lang w:bidi="he-IL"/>
                 <w:rFonts w:ascii="David" w:cs="David" w:eastAsia="David" w:hAnsi="David"/>
                 <w:b w:val="false"/>
                 <w:bCs w:val="false"/>
@@ -1441,10 +1570,13 @@
           </w:tcPr>
           <w:p>
             <w:pPr>
-              <w:jc w:val="right"/>
-            </w:pPr>
-            <w:r>
-              <w:rPr>
+              <w:bidi/>
+              <w:jc w:val="right"/>
+            </w:pPr>
+            <w:r>
+              <w:rPr>
+                <w:rtl/>
+                <w:lang w:bidi="he-IL"/>
                 <w:rFonts w:ascii="David" w:cs="David" w:eastAsia="David" w:hAnsi="David"/>
                 <w:b/>
                 <w:bCs/>
@@ -1477,10 +1609,13 @@
           </w:tcPr>
           <w:p>
             <w:pPr>
-              <w:jc w:val="right"/>
-            </w:pPr>
-            <w:r>
-              <w:rPr>
+              <w:bidi/>
+              <w:jc w:val="right"/>
+            </w:pPr>
+            <w:r>
+              <w:rPr>
+                <w:rtl/>
+                <w:lang w:bidi="he-IL"/>
                 <w:rFonts w:ascii="David" w:cs="David" w:eastAsia="David" w:hAnsi="David"/>
                 <w:b w:val="false"/>
                 <w:bCs w:val="false"/>
@@ -1512,10 +1647,13 @@
           </w:tcPr>
           <w:p>
             <w:pPr>
-              <w:jc w:val="right"/>
-            </w:pPr>
-            <w:r>
-              <w:rPr>
+              <w:bidi/>
+              <w:jc w:val="right"/>
+            </w:pPr>
+            <w:r>
+              <w:rPr>
+                <w:rtl/>
+                <w:lang w:bidi="he-IL"/>
                 <w:rFonts w:ascii="David" w:cs="David" w:eastAsia="David" w:hAnsi="David"/>
                 <w:b/>
                 <w:bCs/>
@@ -1531,11 +1669,13 @@
     </w:tbl>
     <w:p>
       <w:pPr>
+        <w:bidi/>
         <w:spacing w:before="200"/>
       </w:pPr>
     </w:p>
     <w:p>
       <w:pPr>
+        <w:bidi/>
         <w:pBdr>
           <w:bottom w:val="single" w:color="1A7A4A" w:sz="6" w:space="4"/>
         </w:pBdr>
@@ -1544,6 +1684,8 @@
       </w:pPr>
       <w:r>
         <w:rPr>
+          <w:rtl/>
+          <w:lang w:bidi="he-IL"/>
           <w:rFonts w:ascii="David" w:cs="David" w:eastAsia="David" w:hAnsi="David"/>
           <w:b/>
           <w:bCs/>
@@ -1556,6 +1698,7 @@
     </w:p>
     <w:p>
       <w:pPr>
+        <w:bidi/>
         <w:pBdr>
           <w:top w:val="single" w:color="CCCCCC" w:sz="4"/>
           <w:left w:val="single" w:color="CCCCCC" w:sz="4"/>
@@ -1567,6 +1710,8 @@
       </w:pPr>
       <w:r>
         <w:rPr>
+          <w:rtl/>
+          <w:lang w:bidi="he-IL"/>
           <w:rFonts w:ascii="David" w:cs="David" w:eastAsia="David" w:hAnsi="David"/>
           <w:color w:val="999999"/>
           <w:sz w:val="20"/>
@@ -1577,11 +1722,14 @@
     </w:p>
     <w:p>
       <w:pPr>
+        <w:bidi/>
         <w:spacing w:after="160"/>
         <w:jc w:val="right"/>
       </w:pPr>
       <w:r>
         <w:rPr>
+          <w:rtl/>
+          <w:lang w:bidi="he-IL"/>
           <w:rFonts w:ascii="David" w:cs="David" w:eastAsia="David" w:hAnsi="David"/>
           <w:b/>
           <w:bCs/>
@@ -1593,6 +1741,7 @@
     </w:p>
     <w:p>
       <w:pPr>
+        <w:bidi/>
         <w:pBdr>
           <w:top w:val="single" w:color="CCCCCC" w:sz="4"/>
           <w:left w:val="single" w:color="CCCCCC" w:sz="4"/>
@@ -1604,6 +1753,8 @@
       </w:pPr>
       <w:r>
         <w:rPr>
+          <w:rtl/>
+          <w:lang w:bidi="he-IL"/>
           <w:rFonts w:ascii="David" w:cs="David" w:eastAsia="David" w:hAnsi="David"/>
           <w:color w:val="999999"/>
           <w:sz w:val="20"/>
@@ -1614,11 +1765,14 @@
     </w:p>
     <w:p>
       <w:pPr>
+        <w:bidi/>
         <w:spacing w:after="160"/>
         <w:jc w:val="right"/>
       </w:pPr>
       <w:r>
         <w:rPr>
+          <w:rtl/>
+          <w:lang w:bidi="he-IL"/>
           <w:rFonts w:ascii="David" w:cs="David" w:eastAsia="David" w:hAnsi="David"/>
           <w:b/>
           <w:bCs/>
@@ -1630,6 +1784,7 @@
     </w:p>
     <w:p>
       <w:pPr>
+        <w:bidi/>
         <w:pBdr>
           <w:top w:val="single" w:color="CCCCCC" w:sz="4"/>
           <w:left w:val="single" w:color="CCCCCC" w:sz="4"/>
@@ -1641,6 +1796,8 @@
       </w:pPr>
       <w:r>
         <w:rPr>
+          <w:rtl/>
+          <w:lang w:bidi="he-IL"/>
           <w:rFonts w:ascii="David" w:cs="David" w:eastAsia="David" w:hAnsi="David"/>
           <w:color w:val="999999"/>
           <w:sz w:val="20"/>
@@ -1651,11 +1808,14 @@
     </w:p>
     <w:p>
       <w:pPr>
+        <w:bidi/>
         <w:spacing w:after="160"/>
         <w:jc w:val="right"/>
       </w:pPr>
       <w:r>
         <w:rPr>
+          <w:rtl/>
+          <w:lang w:bidi="he-IL"/>
           <w:rFonts w:ascii="David" w:cs="David" w:eastAsia="David" w:hAnsi="David"/>
           <w:b/>
           <w:bCs/>
@@ -1667,6 +1827,7 @@
     </w:p>
     <w:p>
       <w:pPr>
+        <w:bidi/>
         <w:pBdr>
           <w:top w:val="single" w:color="CCCCCC" w:sz="4"/>
           <w:left w:val="single" w:color="CCCCCC" w:sz="4"/>
@@ -1678,6 +1839,8 @@
       </w:pPr>
       <w:r>
         <w:rPr>
+          <w:rtl/>
+          <w:lang w:bidi="he-IL"/>
           <w:rFonts w:ascii="David" w:cs="David" w:eastAsia="David" w:hAnsi="David"/>
           <w:color w:val="999999"/>
           <w:sz w:val="20"/>
@@ -1688,11 +1851,14 @@
     </w:p>
     <w:p>
       <w:pPr>
+        <w:bidi/>
         <w:spacing w:after="160"/>
         <w:jc w:val="right"/>
       </w:pPr>
       <w:r>
         <w:rPr>
+          <w:rtl/>
+          <w:lang w:bidi="he-IL"/>
           <w:rFonts w:ascii="David" w:cs="David" w:eastAsia="David" w:hAnsi="David"/>
           <w:b/>
           <w:bCs/>
@@ -1764,6 +1930,7 @@
 <w:ftr xmlns:wpc="http://schemas.microsoft.com/office/word/2010/wordprocessingCanvas" xmlns:mc="http://schemas.openxmlformats.org/markup-compatibility/2006" xmlns:o="urn:schemas-microsoft-com:office:office" xmlns:r="http://schemas.openxmlformats.org/officeDocument/2006/relationships" xmlns:m="http://schemas.openxmlformats.org/officeDocument/2006/math" xmlns:v="urn:schemas-microsoft-com:vml" xmlns:wp14="http://schemas.microsoft.com/office/word/2010/wordprocessingDrawing" xmlns:wp="http://schemas.openxmlformats.org/drawingml/2006/wordprocessingDrawing" xmlns:w10="urn:schemas-microsoft-com:office:word" xmlns:w="http://schemas.openxmlformats.org/wordprocessingml/2006/main" xmlns:w14="http://schemas.microsoft.com/office/word/2010/wordml" xmlns:w15="http://schemas.microsoft.com/office/word/2012/wordml" xmlns:wpg="http://schemas.microsoft.com/office/word/2010/wordprocessingGroup" xmlns:wpi="http://schemas.microsoft.com/office/word/2010/wordprocessingInk" xmlns:wne="http://schemas.microsoft.com/office/word/2006/wordml" xmlns:wps="http://schemas.microsoft.com/office/word/2010/wordprocessingShape">
   <w:p>
     <w:pPr>
+      <w:bidi/>
       <w:pBdr>
         <w:top w:val="single" w:color="1A7A4A" w:sz="4" w:space="4"/>
       </w:pBdr>
@@ -1772,6 +1939,8 @@
     </w:pPr>
     <w:r>
       <w:rPr>
+        <w:rtl/>
+        <w:lang w:bidi="he-IL"/>
         <w:rFonts w:ascii="David" w:cs="David" w:eastAsia="David" w:hAnsi="David"/>
         <w:color w:val="555555"/>
         <w:sz w:val="18"/>
@@ -1875,10 +2044,13 @@
         </w:tcPr>
         <w:p>
           <w:pPr>
+            <w:bidi/>
             <w:jc w:val="center"/>
           </w:pPr>
           <w:r>
             <w:rPr>
+              <w:rtl/>
+              <w:lang w:bidi="he-IL"/>
               <w:rFonts w:ascii="David" w:cs="David" w:eastAsia="David" w:hAnsi="David"/>
               <w:b/>
               <w:bCs/>
@@ -1891,11 +2063,14 @@
         </w:p>
         <w:p>
           <w:pPr>
+            <w:bidi/>
             <w:spacing w:before="60"/>
             <w:jc w:val="center"/>
           </w:pPr>
           <w:r>
             <w:rPr>
+              <w:rtl/>
+              <w:lang w:bidi="he-IL"/>
               <w:rFonts w:ascii="David" w:cs="David" w:eastAsia="David" w:hAnsi="David"/>
               <w:b/>
               <w:bCs/>
@@ -1926,6 +2101,7 @@
         </w:tcPr>
         <w:p>
           <w:pPr>
+            <w:bidi/>
             <w:jc w:val="center"/>
           </w:pPr>
           <w:r>
@@ -2078,8 +2254,17 @@
 <file path=word/styles.xml><?xml version="1.0" encoding="utf-8"?>
 <w:styles xmlns:mc="http://schemas.openxmlformats.org/markup-compatibility/2006" xmlns:r="http://schemas.openxmlformats.org/officeDocument/2006/relationships" xmlns:w="http://schemas.openxmlformats.org/wordprocessingml/2006/main" xmlns:w14="http://schemas.microsoft.com/office/word/2010/wordml" xmlns:w15="http://schemas.microsoft.com/office/word/2012/wordml" mc:Ignorable="w14 w15">
   <w:docDefaults>
-    <w:rPrDefault/>
-    <w:pPrDefault/>
+    <w:rPrDefault>
+      <w:rPr>
+        <w:rtl/>
+        <w:lang w:bidi="he-IL"/>
+      </w:rPr>
+    </w:rPrDefault>
+    <w:pPrDefault>
+      <w:pPr>
+        <w:bidi/>
+      </w:pPr>
+    </w:pPrDefault>
   </w:docDefaults>
   <w:style w:type="paragraph" w:styleId="Title">
     <w:name w:val="Title"/>
@@ -2087,6 +2272,8 @@
     <w:next w:val="Normal"/>
     <w:qFormat/>
     <w:rPr>
+      <w:rtl/>
+      <w:lang w:bidi="he-IL"/>
       <w:sz w:val="56"/>
       <w:szCs w:val="56"/>
     </w:rPr>
@@ -2097,6 +2284,8 @@
     <w:next w:val="Normal"/>
     <w:qFormat/>
     <w:rPr>
+      <w:rtl/>
+      <w:lang w:bidi="he-IL"/>
       <w:color w:val="2E74B5"/>
       <w:sz w:val="32"/>
       <w:szCs w:val="32"/>
@@ -2108,6 +2297,8 @@
     <w:next w:val="Normal"/>
     <w:qFormat/>
     <w:rPr>
+      <w:rtl/>
+      <w:lang w:bidi="he-IL"/>
       <w:color w:val="2E74B5"/>
       <w:sz w:val="26"/>
       <w:szCs w:val="26"/>
@@ -2119,6 +2310,8 @@
     <w:next w:val="Normal"/>
     <w:qFormat/>
     <w:rPr>
+      <w:rtl/>
+      <w:lang w:bidi="he-IL"/>
       <w:color w:val="1F4D78"/>
       <w:sz w:val="24"/>
       <w:szCs w:val="24"/>
@@ -2130,6 +2323,8 @@
     <w:next w:val="Normal"/>
     <w:qFormat/>
     <w:rPr>
+      <w:rtl/>
+      <w:lang w:bidi="he-IL"/>
       <w:i/>
       <w:iCs/>
       <w:color w:val="2E74B5"/>
@@ -2141,6 +2336,8 @@
     <w:next w:val="Normal"/>
     <w:qFormat/>
     <w:rPr>
+      <w:rtl/>
+      <w:lang w:bidi="he-IL"/>
       <w:color w:val="2E74B5"/>
     </w:rPr>
   </w:style>
@@ -2150,6 +2347,8 @@
     <w:next w:val="Normal"/>
     <w:qFormat/>
     <w:rPr>
+      <w:rtl/>
+      <w:lang w:bidi="he-IL"/>
       <w:color w:val="1F4D78"/>
     </w:rPr>
   </w:style>
@@ -2159,6 +2358,8 @@
     <w:next w:val="Normal"/>
     <w:qFormat/>
     <w:rPr>
+      <w:rtl/>
+      <w:lang w:bidi="he-IL"/>
       <w:b/>
       <w:bCs/>
     </w:rPr>
@@ -2174,6 +2375,8 @@
     <w:uiPriority w:val="99"/>
     <w:unhideWhenUsed/>
     <w:rPr>
+      <w:rtl/>
+      <w:lang w:bidi="he-IL"/>
       <w:color w:val="0563C1"/>
       <w:u w:val="single"/>
     </w:rPr>
@@ -2185,6 +2388,8 @@
     <w:semiHidden/>
     <w:unhideWhenUsed/>
     <w:rPr>
+      <w:rtl/>
+      <w:lang w:bidi="he-IL"/>
       <w:vertAlign w:val="superscript"/>
     </w:rPr>
   </w:style>
@@ -2196,9 +2401,12 @@
     <w:semiHidden/>
     <w:unhideWhenUsed/>
     <w:pPr>
+      <w:bidi/>
       <w:spacing w:after="0" w:line="240" w:lineRule="auto"/>
     </w:pPr>
     <w:rPr>
+      <w:rtl/>
+      <w:lang w:bidi="he-IL"/>
       <w:sz w:val="20"/>
       <w:szCs w:val="20"/>
     </w:rPr>
@@ -2211,6 +2419,8 @@
     <w:semiHidden/>
     <w:unhideWhenUsed/>
     <w:rPr>
+      <w:rtl/>
+      <w:lang w:bidi="he-IL"/>
       <w:sz w:val="20"/>
       <w:szCs w:val="20"/>
     </w:rPr>
@@ -2222,6 +2432,8 @@
     <w:semiHidden/>
     <w:unhideWhenUsed/>
     <w:rPr>
+      <w:rtl/>
+      <w:lang w:bidi="he-IL"/>
       <w:vertAlign w:val="superscript"/>
     </w:rPr>
   </w:style>
@@ -2233,9 +2445,12 @@
     <w:semiHidden/>
     <w:unhideWhenUsed/>
     <w:pPr>
+      <w:bidi/>
       <w:spacing w:after="0" w:line="240" w:lineRule="auto"/>
     </w:pPr>
     <w:rPr>
+      <w:rtl/>
+      <w:lang w:bidi="he-IL"/>
       <w:sz w:val="20"/>
       <w:szCs w:val="20"/>
     </w:rPr>
@@ -2248,6 +2463,8 @@
     <w:semiHidden/>
     <w:unhideWhenUsed/>
     <w:rPr>
+      <w:rtl/>
+      <w:lang w:bidi="he-IL"/>
       <w:sz w:val="20"/>
       <w:szCs w:val="20"/>
     </w:rPr>

</xml_diff>

<commit_message>
fix: footer signature image, QuotaExceededError, and template formatting
- Fix signature image in footer: correct rels Target path (media/ not ../media/),
  use rId1, left-align signature paragraph
- Fix QuotaExceededError: exclude photos from localStorage draft saves
- Template-based genReport: patchDocument + JSZip footer post-processing
- Explicit font/color/size per placeholder (Arial everywhere, blue headers)
- Google Static Maps satellite image for map_image patch
- JSZip CDN added to index.html for footer patching

Co-Authored-By: Claude Sonnet 4.6 <noreply@anthropic.com>
</commit_message>
<xml_diff>
--- a/ynshouf-app/ynshouf-app/YNSHOUF_Template.docx
+++ b/ynshouf-app/ynshouf-app/YNSHOUF_Template.docx
@@ -1,6 +1,6 @@
 
 <file path=word/document.xml><?xml version="1.0" encoding="utf-8"?>
-<w:document xmlns:wpc="http://schemas.microsoft.com/office/word/2010/wordprocessingCanvas" xmlns:cx="http://schemas.microsoft.com/office/drawing/2014/chartex" xmlns:cx1="http://schemas.microsoft.com/office/drawing/2015/9/8/chartex" xmlns:cx2="http://schemas.microsoft.com/office/drawing/2015/10/21/chartex" xmlns:cx3="http://schemas.microsoft.com/office/drawing/2016/5/9/chartex" xmlns:cx4="http://schemas.microsoft.com/office/drawing/2016/5/10/chartex" xmlns:cx5="http://schemas.microsoft.com/office/drawing/2016/5/11/chartex" xmlns:cx6="http://schemas.microsoft.com/office/drawing/2016/5/12/chartex" xmlns:cx7="http://schemas.microsoft.com/office/drawing/2016/5/13/chartex" xmlns:cx8="http://schemas.microsoft.com/office/drawing/2016/5/14/chartex" xmlns:mc="http://schemas.openxmlformats.org/markup-compatibility/2006" xmlns:aink="http://schemas.microsoft.com/office/drawing/2016/ink" xmlns:am3d="http://schemas.microsoft.com/office/drawing/2017/model3d" xmlns:o="urn:schemas-microsoft-com:office:office" xmlns:r="http://schemas.openxmlformats.org/officeDocument/2006/relationships" xmlns:m="http://schemas.openxmlformats.org/officeDocument/2006/math" xmlns:v="urn:schemas-microsoft-com:vml" xmlns:wp14="http://schemas.microsoft.com/office/word/2010/wordprocessingDrawing" xmlns:wp="http://schemas.openxmlformats.org/drawingml/2006/wordprocessingDrawing" xmlns:w10="urn:schemas-microsoft-com:office:word" xmlns:w="http://schemas.openxmlformats.org/wordprocessingml/2006/main" xmlns:w14="http://schemas.microsoft.com/office/word/2010/wordml" xmlns:w15="http://schemas.microsoft.com/office/word/2012/wordml" xmlns:w16cex="http://schemas.microsoft.com/office/word/2018/wordml/cex" xmlns:w16cid="http://schemas.microsoft.com/office/word/2016/wordml/cid" xmlns:w16="http://schemas.microsoft.com/office/word/2018/wordml" xmlns:w16sdtdh="http://schemas.microsoft.com/office/word/2020/wordml/sdtdatahash" xmlns:w16se="http://schemas.microsoft.com/office/word/2015/wordml/symex" xmlns:wpg="http://schemas.microsoft.com/office/word/2010/wordprocessingGroup" xmlns:wpi="http://schemas.microsoft.com/office/word/2010/wordprocessingInk" xmlns:wne="http://schemas.microsoft.com/office/word/2006/wordml" xmlns:wps="http://schemas.microsoft.com/office/word/2010/wordprocessingShape" mc:Ignorable="w14 w15 w16se w16cid w16 w16cex w16sdtdh wp14">
+<w:document xmlns:wpc="http://schemas.microsoft.com/office/word/2010/wordprocessingCanvas" xmlns:mc="http://schemas.openxmlformats.org/markup-compatibility/2006" xmlns:o="urn:schemas-microsoft-com:office:office" xmlns:r="http://schemas.openxmlformats.org/officeDocument/2006/relationships" xmlns:m="http://schemas.openxmlformats.org/officeDocument/2006/math" xmlns:v="urn:schemas-microsoft-com:vml" xmlns:wp14="http://schemas.microsoft.com/office/word/2010/wordprocessingDrawing" xmlns:wp="http://schemas.openxmlformats.org/drawingml/2006/wordprocessingDrawing" xmlns:w10="urn:schemas-microsoft-com:office:word" xmlns:w="http://schemas.openxmlformats.org/wordprocessingml/2006/main" xmlns:w14="http://schemas.microsoft.com/office/word/2010/wordml" xmlns:wpg="http://schemas.microsoft.com/office/word/2010/wordprocessingGroup" xmlns:wpi="http://schemas.microsoft.com/office/word/2010/wordprocessingInk" xmlns:wne="http://schemas.microsoft.com/office/word/2006/wordml" xmlns:wps="http://schemas.microsoft.com/office/word/2010/wordprocessingShape" mc:Ignorable="w14 wp14">
   <w:body>
     <w:p>
       <w:pPr>
@@ -31,6 +31,8 @@
           <w:lang w:bidi="he-IL"/>
         </w:rPr>
       </w:pPr>
+      <w:bookmarkStart w:id="0" w:name="_GoBack"/>
+      <w:bookmarkEnd w:id="0"/>
       <w:r>
         <w:rPr>
           <w:rFonts w:ascii="var(--font-mono)" w:eastAsia="Times New Roman" w:hAnsi="var(--font-mono)" w:cs="Courier New"/>
@@ -44,7 +46,7 @@
     </w:p>
     <w:p>
       <w:pPr>
-        <w:pStyle w:val="a5"/>
+        <w:pStyle w:val="Title"/>
         <w:bidi/>
         <w:spacing w:before="0"/>
         <w:rPr>
@@ -83,7 +85,7 @@
     </w:p>
     <w:p>
       <w:pPr>
-        <w:pStyle w:val="a5"/>
+        <w:pStyle w:val="Title"/>
         <w:bidi/>
         <w:spacing w:before="0" w:after="0" w:line="276" w:lineRule="auto"/>
         <w:rPr>
@@ -99,6 +101,7 @@
       <w:r>
         <w:rPr>
           <w:rFonts w:asciiTheme="minorBidi" w:hAnsiTheme="minorBidi" w:cs="Arial"/>
+          <w:color w:val="1B3A6B"/>
           <w:rtl/>
           <w:lang w:bidi="he-IL"/>
         </w:rPr>
@@ -108,6 +111,7 @@
       <w:r>
         <w:rPr>
           <w:rFonts w:asciiTheme="minorBidi" w:hAnsiTheme="minorBidi" w:cs="Arial"/>
+          <w:color w:val="1B3A6B"/>
           <w:lang w:bidi="he-IL"/>
         </w:rPr>
         <w:t>report_type</w:t>
@@ -116,6 +120,7 @@
       <w:r>
         <w:rPr>
           <w:rFonts w:asciiTheme="minorBidi" w:hAnsiTheme="minorBidi" w:cs="Arial"/>
+          <w:color w:val="1B3A6B"/>
           <w:rtl/>
           <w:lang w:bidi="he-IL"/>
         </w:rPr>
@@ -138,6 +143,7 @@
           <w:rFonts w:asciiTheme="minorBidi" w:hAnsiTheme="minorBidi" w:cs="Arial"/>
           <w:b w:val="0"/>
           <w:bCs w:val="0"/>
+          <w:color w:val="2E74B5"/>
           <w:sz w:val="28"/>
           <w:szCs w:val="28"/>
           <w:rtl/>
@@ -151,6 +157,7 @@
           <w:rFonts w:asciiTheme="minorBidi" w:hAnsiTheme="minorBidi" w:cs="Arial"/>
           <w:b w:val="0"/>
           <w:bCs w:val="0"/>
+          <w:color w:val="2E74B5"/>
           <w:sz w:val="28"/>
           <w:szCs w:val="28"/>
           <w:lang w:bidi="he-IL"/>
@@ -163,6 +170,7 @@
           <w:rFonts w:asciiTheme="minorBidi" w:hAnsiTheme="minorBidi" w:cs="Arial"/>
           <w:b w:val="0"/>
           <w:bCs w:val="0"/>
+          <w:color w:val="2E74B5"/>
           <w:sz w:val="28"/>
           <w:szCs w:val="28"/>
           <w:rtl/>
@@ -173,10 +181,26 @@
     </w:p>
     <w:p>
       <w:pPr>
+        <w:pStyle w:val="TiMiHeading1"/>
+        <w:bidi/>
+        <w:spacing w:before="500" w:after="50"/>
+        <w:rPr>
+          <w:rtl w:val="0"/>
+        </w:rPr>
+      </w:pPr>
+      <w:r>
+        <w:rPr>
+          <w:rFonts w:hint="cs"/>
+        </w:rPr>
+        <w:t>מהות אירוע:</w:t>
+      </w:r>
+    </w:p>
+    <w:p>
+      <w:pPr>
         <w:bidi/>
         <w:spacing w:before="100" w:beforeAutospacing="1" w:after="100" w:afterAutospacing="1" w:line="360" w:lineRule="auto"/>
         <w:rPr>
-          <w:rFonts w:asciiTheme="minorBidi" w:eastAsia="Times New Roman" w:hAnsiTheme="minorBidi" w:hint="cs"/>
+          <w:rFonts w:asciiTheme="minorBidi" w:eastAsia="Times New Roman" w:hAnsiTheme="minorBidi"/>
           <w:color w:val="1F497D" w:themeColor="text2"/>
           <w:rtl/>
           <w:lang w:bidi="he-IL"/>
@@ -185,7 +209,6 @@
       <w:r>
         <w:rPr>
           <w:rFonts w:asciiTheme="minorBidi" w:eastAsia="Times New Roman" w:hAnsiTheme="minorBidi" w:cs="Arial"/>
-          <w:b/>
           <w:bCs/>
           <w:color w:val="1F497D" w:themeColor="text2"/>
           <w:rtl/>
@@ -197,7 +220,6 @@
       <w:r>
         <w:rPr>
           <w:rFonts w:asciiTheme="minorBidi" w:eastAsia="Times New Roman" w:hAnsiTheme="minorBidi"/>
-          <w:b/>
           <w:bCs/>
           <w:color w:val="1F497D" w:themeColor="text2"/>
           <w:lang w:bidi="he-IL"/>
@@ -208,7 +230,6 @@
       <w:r>
         <w:rPr>
           <w:rFonts w:asciiTheme="minorBidi" w:eastAsia="Times New Roman" w:hAnsiTheme="minorBidi" w:cs="Arial"/>
-          <w:b/>
           <w:bCs/>
           <w:color w:val="1F497D" w:themeColor="text2"/>
           <w:rtl/>
@@ -286,13 +307,6 @@
         <w:bidi/>
         <w:spacing w:before="500" w:after="50"/>
       </w:pPr>
-    </w:p>
-    <w:p>
-      <w:pPr>
-        <w:pStyle w:val="TiMiHeading1"/>
-        <w:bidi/>
-        <w:spacing w:before="500" w:after="50"/>
-      </w:pPr>
       <w:r>
         <w:t>כללי</w:t>
       </w:r>
@@ -306,7 +320,7 @@
     <w:tbl>
       <w:tblPr>
         <w:bidiVisual/>
-        <w:tblW w:w="0" w:type="auto"/>
+        <w:tblW w:w="9010" w:type="dxa"/>
         <w:tblBorders>
           <w:top w:val="single" w:sz="4" w:space="0" w:color="auto"/>
           <w:left w:val="single" w:sz="4" w:space="0" w:color="auto"/>
@@ -326,6 +340,9 @@
         <w:gridCol w:w="4505"/>
       </w:tblGrid>
       <w:tr>
+        <w:trPr>
+          <w:cantSplit/>
+        </w:trPr>
         <w:tc>
           <w:tcPr>
             <w:tcW w:w="4505" w:type="dxa"/>
@@ -349,15 +366,7 @@
               <w:bidi/>
             </w:pPr>
             <w:r>
-              <w:t>{{</w:t>
-            </w:r>
-            <w:proofErr w:type="spellStart"/>
-            <w:r>
-              <w:t>report_id</w:t>
-            </w:r>
-            <w:proofErr w:type="spellEnd"/>
-            <w:r>
-              <w:t>}}</w:t>
+              <w:t>מספר דוח</w:t>
             </w:r>
           </w:p>
         </w:tc>
@@ -370,12 +379,6 @@
               <w:bottom w:val="single" w:sz="1" w:space="0" w:color="CCCCCC"/>
               <w:right w:val="single" w:sz="1" w:space="0" w:color="CCCCCC"/>
             </w:tcBorders>
-            <w:tcMar>
-              <w:top w:w="100" w:type="dxa"/>
-              <w:left w:w="100" w:type="dxa"/>
-              <w:bottom w:w="100" w:type="dxa"/>
-              <w:right w:w="100" w:type="dxa"/>
-            </w:tcMar>
             <w:vAlign w:val="center"/>
           </w:tcPr>
           <w:p>
@@ -383,10 +386,16 @@
               <w:pStyle w:val="TiMiNormal"/>
               <w:bidi/>
             </w:pPr>
+            <w:r>
+              <w:t>{{report_id}}</w:t>
+            </w:r>
           </w:p>
         </w:tc>
       </w:tr>
       <w:tr>
+        <w:trPr>
+          <w:cantSplit/>
+        </w:trPr>
         <w:tc>
           <w:tcPr>
             <w:tcW w:w="4505" w:type="dxa"/>
@@ -410,15 +419,7 @@
               <w:bidi/>
             </w:pPr>
             <w:r>
-              <w:t>{{</w:t>
-            </w:r>
-            <w:proofErr w:type="spellStart"/>
-            <w:r>
-              <w:t>inspector_name</w:t>
-            </w:r>
-            <w:proofErr w:type="spellEnd"/>
-            <w:r>
-              <w:t>}}</w:t>
+              <w:t>שם פקח</w:t>
             </w:r>
           </w:p>
         </w:tc>
@@ -431,12 +432,6 @@
               <w:bottom w:val="single" w:sz="1" w:space="0" w:color="CCCCCC"/>
               <w:right w:val="single" w:sz="1" w:space="0" w:color="CCCCCC"/>
             </w:tcBorders>
-            <w:tcMar>
-              <w:top w:w="100" w:type="dxa"/>
-              <w:left w:w="100" w:type="dxa"/>
-              <w:bottom w:w="100" w:type="dxa"/>
-              <w:right w:w="100" w:type="dxa"/>
-            </w:tcMar>
             <w:vAlign w:val="center"/>
           </w:tcPr>
           <w:p>
@@ -444,10 +439,16 @@
               <w:pStyle w:val="TiMiNormal"/>
               <w:bidi/>
             </w:pPr>
+            <w:r>
+              <w:t>{{inspector_name}}</w:t>
+            </w:r>
           </w:p>
         </w:tc>
       </w:tr>
       <w:tr>
+        <w:trPr>
+          <w:cantSplit/>
+        </w:trPr>
         <w:tc>
           <w:tcPr>
             <w:tcW w:w="4505" w:type="dxa"/>
@@ -471,18 +472,36 @@
               <w:bidi/>
             </w:pPr>
             <w:r>
-              <w:t>{{</w:t>
-            </w:r>
-            <w:proofErr w:type="spellStart"/>
-            <w:r>
-              <w:t>inspector_num</w:t>
-            </w:r>
-            <w:proofErr w:type="spellEnd"/>
-            <w:r>
-              <w:t>}}</w:t>
+              <w:t>מספר פקח</w:t>
             </w:r>
           </w:p>
         </w:tc>
+        <w:tc>
+          <w:tcPr>
+            <w:tcW w:w="4505" w:type="dxa"/>
+            <w:tcBorders>
+              <w:top w:val="single" w:sz="1" w:space="0" w:color="CCCCCC"/>
+              <w:left w:val="single" w:sz="1" w:space="0" w:color="CCCCCC"/>
+              <w:bottom w:val="single" w:sz="1" w:space="0" w:color="CCCCCC"/>
+              <w:right w:val="single" w:sz="1" w:space="0" w:color="CCCCCC"/>
+            </w:tcBorders>
+            <w:vAlign w:val="center"/>
+          </w:tcPr>
+          <w:p>
+            <w:pPr>
+              <w:pStyle w:val="TiMiNormal"/>
+              <w:bidi/>
+            </w:pPr>
+            <w:r>
+              <w:t>{{inspector_num}}</w:t>
+            </w:r>
+          </w:p>
+        </w:tc>
+      </w:tr>
+      <w:tr>
+        <w:trPr>
+          <w:cantSplit/>
+        </w:trPr>
         <w:tc>
           <w:tcPr>
             <w:tcW w:w="4505" w:type="dxa"/>
@@ -506,47 +525,7 @@
               <w:bidi/>
             </w:pPr>
             <w:r>
-              <w:t xml:space="preserve"> </w:t>
-            </w:r>
-          </w:p>
-        </w:tc>
-      </w:tr>
-      <w:tr>
-        <w:tc>
-          <w:tcPr>
-            <w:tcW w:w="4505" w:type="dxa"/>
-            <w:tcBorders>
-              <w:top w:val="single" w:sz="1" w:space="0" w:color="CCCCCC"/>
-              <w:left w:val="single" w:sz="1" w:space="0" w:color="CCCCCC"/>
-              <w:bottom w:val="single" w:sz="1" w:space="0" w:color="CCCCCC"/>
-              <w:right w:val="single" w:sz="1" w:space="0" w:color="CCCCCC"/>
-            </w:tcBorders>
-            <w:tcMar>
-              <w:top w:w="100" w:type="dxa"/>
-              <w:left w:w="100" w:type="dxa"/>
-              <w:bottom w:w="100" w:type="dxa"/>
-              <w:right w:w="100" w:type="dxa"/>
-            </w:tcMar>
-            <w:vAlign w:val="center"/>
-          </w:tcPr>
-          <w:p>
-            <w:pPr>
-              <w:pStyle w:val="TiMiNormal"/>
-              <w:bidi/>
-              <w:rPr>
-                <w:rFonts w:hint="cs"/>
-              </w:rPr>
-            </w:pPr>
-            <w:r>
-              <w:t>{{</w:t>
-            </w:r>
-            <w:proofErr w:type="spellStart"/>
-            <w:r>
-              <w:t>date</w:t>
-            </w:r>
-            <w:proofErr w:type="spellEnd"/>
-            <w:r>
-              <w:t>}}</w:t>
+              <w:t>מספר פקח</w:t>
             </w:r>
           </w:p>
         </w:tc>
@@ -559,12 +538,6 @@
               <w:bottom w:val="single" w:sz="1" w:space="0" w:color="CCCCCC"/>
               <w:right w:val="single" w:sz="1" w:space="0" w:color="CCCCCC"/>
             </w:tcBorders>
-            <w:tcMar>
-              <w:top w:w="100" w:type="dxa"/>
-              <w:left w:w="100" w:type="dxa"/>
-              <w:bottom w:w="100" w:type="dxa"/>
-              <w:right w:w="100" w:type="dxa"/>
-            </w:tcMar>
             <w:vAlign w:val="center"/>
           </w:tcPr>
           <w:p>
@@ -572,10 +545,16 @@
               <w:pStyle w:val="TiMiNormal"/>
               <w:bidi/>
             </w:pPr>
+            <w:r>
+              <w:t>{{date}}</w:t>
+            </w:r>
           </w:p>
         </w:tc>
       </w:tr>
       <w:tr>
+        <w:trPr>
+          <w:cantSplit/>
+        </w:trPr>
         <w:tc>
           <w:tcPr>
             <w:tcW w:w="4505" w:type="dxa"/>
@@ -599,15 +578,7 @@
               <w:bidi/>
             </w:pPr>
             <w:r>
-              <w:t>{{</w:t>
-            </w:r>
-            <w:proofErr w:type="spellStart"/>
-            <w:r>
-              <w:t>time</w:t>
-            </w:r>
-            <w:proofErr w:type="spellEnd"/>
-            <w:r>
-              <w:t>}}</w:t>
+              <w:t>שעה</w:t>
             </w:r>
           </w:p>
         </w:tc>
@@ -620,12 +591,6 @@
               <w:bottom w:val="single" w:sz="1" w:space="0" w:color="CCCCCC"/>
               <w:right w:val="single" w:sz="1" w:space="0" w:color="CCCCCC"/>
             </w:tcBorders>
-            <w:tcMar>
-              <w:top w:w="100" w:type="dxa"/>
-              <w:left w:w="100" w:type="dxa"/>
-              <w:bottom w:w="100" w:type="dxa"/>
-              <w:right w:w="100" w:type="dxa"/>
-            </w:tcMar>
             <w:vAlign w:val="center"/>
           </w:tcPr>
           <w:p>
@@ -633,10 +598,16 @@
               <w:pStyle w:val="TiMiNormal"/>
               <w:bidi/>
             </w:pPr>
+            <w:r>
+              <w:t>{{time}}</w:t>
+            </w:r>
           </w:p>
         </w:tc>
       </w:tr>
       <w:tr>
+        <w:trPr>
+          <w:cantSplit/>
+        </w:trPr>
         <w:tc>
           <w:tcPr>
             <w:tcW w:w="4505" w:type="dxa"/>
@@ -660,15 +631,7 @@
               <w:bidi/>
             </w:pPr>
             <w:r>
-              <w:t>{{</w:t>
-            </w:r>
-            <w:proofErr w:type="spellStart"/>
-            <w:r>
-              <w:t>report_type</w:t>
-            </w:r>
-            <w:proofErr w:type="spellEnd"/>
-            <w:r>
-              <w:t>}}</w:t>
+              <w:t>סוג אירוע</w:t>
             </w:r>
           </w:p>
         </w:tc>
@@ -681,12 +644,6 @@
               <w:bottom w:val="single" w:sz="1" w:space="0" w:color="CCCCCC"/>
               <w:right w:val="single" w:sz="1" w:space="0" w:color="CCCCCC"/>
             </w:tcBorders>
-            <w:tcMar>
-              <w:top w:w="100" w:type="dxa"/>
-              <w:left w:w="100" w:type="dxa"/>
-              <w:bottom w:w="100" w:type="dxa"/>
-              <w:right w:w="100" w:type="dxa"/>
-            </w:tcMar>
             <w:vAlign w:val="center"/>
           </w:tcPr>
           <w:p>
@@ -694,10 +651,16 @@
               <w:pStyle w:val="TiMiNormal"/>
               <w:bidi/>
             </w:pPr>
+            <w:r>
+              <w:t>{{report_type}}</w:t>
+            </w:r>
           </w:p>
         </w:tc>
       </w:tr>
       <w:tr>
+        <w:trPr>
+          <w:cantSplit/>
+        </w:trPr>
         <w:tc>
           <w:tcPr>
             <w:tcW w:w="4505" w:type="dxa"/>
@@ -721,15 +684,7 @@
               <w:bidi/>
             </w:pPr>
             <w:r>
-              <w:t>{{</w:t>
-            </w:r>
-            <w:proofErr w:type="spellStart"/>
-            <w:r>
-              <w:t>location</w:t>
-            </w:r>
-            <w:proofErr w:type="spellEnd"/>
-            <w:r>
-              <w:t>}}</w:t>
+              <w:t>מיקום</w:t>
             </w:r>
           </w:p>
         </w:tc>
@@ -742,12 +697,6 @@
               <w:bottom w:val="single" w:sz="1" w:space="0" w:color="CCCCCC"/>
               <w:right w:val="single" w:sz="1" w:space="0" w:color="CCCCCC"/>
             </w:tcBorders>
-            <w:tcMar>
-              <w:top w:w="100" w:type="dxa"/>
-              <w:left w:w="100" w:type="dxa"/>
-              <w:bottom w:w="100" w:type="dxa"/>
-              <w:right w:w="100" w:type="dxa"/>
-            </w:tcMar>
             <w:vAlign w:val="center"/>
           </w:tcPr>
           <w:p>
@@ -755,10 +704,16 @@
               <w:pStyle w:val="TiMiNormal"/>
               <w:bidi/>
             </w:pPr>
+            <w:r>
+              <w:t>{{location}}</w:t>
+            </w:r>
           </w:p>
         </w:tc>
       </w:tr>
       <w:tr>
+        <w:trPr>
+          <w:cantSplit/>
+        </w:trPr>
         <w:tc>
           <w:tcPr>
             <w:tcW w:w="4505" w:type="dxa"/>
@@ -782,15 +737,7 @@
               <w:bidi/>
             </w:pPr>
             <w:r>
-              <w:t>{{</w:t>
-            </w:r>
-            <w:proofErr w:type="spellStart"/>
-            <w:r>
-              <w:t>place_name</w:t>
-            </w:r>
-            <w:proofErr w:type="spellEnd"/>
-            <w:r>
-              <w:t>}}</w:t>
+              <w:t>שם המקום</w:t>
             </w:r>
           </w:p>
         </w:tc>
@@ -803,12 +750,6 @@
               <w:bottom w:val="single" w:sz="1" w:space="0" w:color="CCCCCC"/>
               <w:right w:val="single" w:sz="1" w:space="0" w:color="CCCCCC"/>
             </w:tcBorders>
-            <w:tcMar>
-              <w:top w:w="100" w:type="dxa"/>
-              <w:left w:w="100" w:type="dxa"/>
-              <w:bottom w:w="100" w:type="dxa"/>
-              <w:right w:w="100" w:type="dxa"/>
-            </w:tcMar>
             <w:vAlign w:val="center"/>
           </w:tcPr>
           <w:p>
@@ -816,10 +757,16 @@
               <w:pStyle w:val="TiMiNormal"/>
               <w:bidi/>
             </w:pPr>
+            <w:r>
+              <w:t>{{place_name}}</w:t>
+            </w:r>
           </w:p>
         </w:tc>
       </w:tr>
       <w:tr>
+        <w:trPr>
+          <w:cantSplit/>
+        </w:trPr>
         <w:tc>
           <w:tcPr>
             <w:tcW w:w="4505" w:type="dxa"/>
@@ -843,15 +790,7 @@
               <w:bidi/>
             </w:pPr>
             <w:r>
-              <w:t>{{</w:t>
-            </w:r>
-            <w:proofErr w:type="spellStart"/>
-            <w:r>
-              <w:t>coord_gps</w:t>
-            </w:r>
-            <w:proofErr w:type="spellEnd"/>
-            <w:r>
-              <w:t>}}</w:t>
+              <w:t>קואורדינטות GPS</w:t>
             </w:r>
           </w:p>
         </w:tc>
@@ -864,12 +803,6 @@
               <w:bottom w:val="single" w:sz="1" w:space="0" w:color="CCCCCC"/>
               <w:right w:val="single" w:sz="1" w:space="0" w:color="CCCCCC"/>
             </w:tcBorders>
-            <w:tcMar>
-              <w:top w:w="100" w:type="dxa"/>
-              <w:left w:w="100" w:type="dxa"/>
-              <w:bottom w:w="100" w:type="dxa"/>
-              <w:right w:w="100" w:type="dxa"/>
-            </w:tcMar>
             <w:vAlign w:val="center"/>
           </w:tcPr>
           <w:p>
@@ -877,10 +810,16 @@
               <w:pStyle w:val="TiMiNormal"/>
               <w:bidi/>
             </w:pPr>
+            <w:r>
+              <w:t>{{coord_gps}}</w:t>
+            </w:r>
           </w:p>
         </w:tc>
       </w:tr>
       <w:tr>
+        <w:trPr>
+          <w:cantSplit/>
+        </w:trPr>
         <w:tc>
           <w:tcPr>
             <w:tcW w:w="4505" w:type="dxa"/>
@@ -904,40 +843,8 @@
               <w:bidi/>
             </w:pPr>
             <w:r>
-              <w:rPr>
-                <w:rStyle w:val="HTMLCode"/>
-                <w:rFonts w:ascii="Arial" w:eastAsia="Arial" w:hAnsi="Arial" w:cs="Arial"/>
-                <w:sz w:val="24"/>
-                <w:szCs w:val="24"/>
-              </w:rPr>
-              <w:t>{{</w:t>
+              <w:t>קואורדינטות ITM</w:t>
             </w:r>
-            <w:proofErr w:type="spellStart"/>
-            <w:r>
-              <w:rPr>
-                <w:rStyle w:val="HTMLCode"/>
-                <w:rFonts w:ascii="Arial" w:eastAsia="Arial" w:hAnsi="Arial" w:cs="Arial"/>
-                <w:sz w:val="24"/>
-                <w:szCs w:val="24"/>
-              </w:rPr>
-              <w:t>coord_itm</w:t>
-            </w:r>
-            <w:proofErr w:type="spellEnd"/>
-            <w:r>
-              <w:rPr>
-                <w:rStyle w:val="HTMLCode"/>
-                <w:rFonts w:ascii="Arial" w:eastAsia="Arial" w:hAnsi="Arial" w:cs="Arial"/>
-                <w:sz w:val="24"/>
-                <w:szCs w:val="24"/>
-              </w:rPr>
-              <w:t>}}</w:t>
-            </w:r>
-          </w:p>
-          <w:p>
-            <w:pPr>
-              <w:pStyle w:val="TiMiNormal"/>
-              <w:bidi/>
-            </w:pPr>
           </w:p>
         </w:tc>
         <w:tc>
@@ -949,14 +856,23 @@
               <w:bottom w:val="single" w:sz="1" w:space="0" w:color="CCCCCC"/>
               <w:right w:val="single" w:sz="1" w:space="0" w:color="CCCCCC"/>
             </w:tcBorders>
-            <w:tcMar>
-              <w:top w:w="100" w:type="dxa"/>
-              <w:left w:w="100" w:type="dxa"/>
-              <w:bottom w:w="100" w:type="dxa"/>
-              <w:right w:w="100" w:type="dxa"/>
-            </w:tcMar>
             <w:vAlign w:val="center"/>
           </w:tcPr>
+          <w:p>
+            <w:pPr>
+              <w:pStyle w:val="TiMiNormal"/>
+              <w:bidi/>
+            </w:pPr>
+            <w:r>
+              <w:rPr>
+                <w:rStyle w:val="HTMLCode"/>
+                <w:rFonts w:ascii="Arial" w:eastAsia="Arial" w:hAnsi="Arial" w:cs="Arial"/>
+                <w:sz w:val="24"/>
+                <w:szCs w:val="24"/>
+              </w:rPr>
+              <w:t>{{coord_itm}}</w:t>
+            </w:r>
+          </w:p>
           <w:p>
             <w:pPr>
               <w:pStyle w:val="TiMiNormal"/>
@@ -971,9 +887,6 @@
         <w:pStyle w:val="TiMiHeading1"/>
         <w:bidi/>
         <w:spacing w:before="500" w:after="50"/>
-        <w:rPr>
-          <w:rFonts w:hint="cs"/>
-        </w:rPr>
       </w:pPr>
     </w:p>
     <w:p>
@@ -1017,7 +930,7 @@
     <w:tbl>
       <w:tblPr>
         <w:bidiVisual/>
-        <w:tblW w:w="0" w:type="auto"/>
+        <w:tblW w:w="9010" w:type="dxa"/>
         <w:tblBorders>
           <w:top w:val="single" w:sz="4" w:space="0" w:color="auto"/>
           <w:left w:val="single" w:sz="4" w:space="0" w:color="auto"/>
@@ -1037,6 +950,9 @@
         <w:gridCol w:w="4505"/>
       </w:tblGrid>
       <w:tr>
+        <w:trPr>
+          <w:cantSplit/>
+        </w:trPr>
         <w:tc>
           <w:tcPr>
             <w:tcW w:w="4505" w:type="dxa"/>
@@ -1060,15 +976,7 @@
               <w:bidi/>
             </w:pPr>
             <w:r>
-              <w:t>{{</w:t>
-            </w:r>
-            <w:proofErr w:type="spellStart"/>
-            <w:r>
-              <w:t>v_plate</w:t>
-            </w:r>
-            <w:proofErr w:type="spellEnd"/>
-            <w:r>
-              <w:t>}}</w:t>
+              <w:t>לוחית רישוי</w:t>
             </w:r>
           </w:p>
         </w:tc>
@@ -1081,12 +989,6 @@
               <w:bottom w:val="single" w:sz="1" w:space="0" w:color="CCCCCC"/>
               <w:right w:val="single" w:sz="1" w:space="0" w:color="CCCCCC"/>
             </w:tcBorders>
-            <w:tcMar>
-              <w:top w:w="100" w:type="dxa"/>
-              <w:left w:w="100" w:type="dxa"/>
-              <w:bottom w:w="100" w:type="dxa"/>
-              <w:right w:w="100" w:type="dxa"/>
-            </w:tcMar>
             <w:vAlign w:val="center"/>
           </w:tcPr>
           <w:p>
@@ -1094,10 +996,16 @@
               <w:pStyle w:val="TiMiNormal"/>
               <w:bidi/>
             </w:pPr>
+            <w:r>
+              <w:t>{{v_plate}}</w:t>
+            </w:r>
           </w:p>
         </w:tc>
       </w:tr>
       <w:tr>
+        <w:trPr>
+          <w:cantSplit/>
+        </w:trPr>
         <w:tc>
           <w:tcPr>
             <w:tcW w:w="4505" w:type="dxa"/>
@@ -1121,15 +1029,7 @@
               <w:bidi/>
             </w:pPr>
             <w:r>
-              <w:t>{{</w:t>
-            </w:r>
-            <w:proofErr w:type="spellStart"/>
-            <w:r>
-              <w:t>v_type</w:t>
-            </w:r>
-            <w:proofErr w:type="spellEnd"/>
-            <w:r>
-              <w:t>}}</w:t>
+              <w:t>סוג רכב</w:t>
             </w:r>
           </w:p>
         </w:tc>
@@ -1142,12 +1042,6 @@
               <w:bottom w:val="single" w:sz="1" w:space="0" w:color="CCCCCC"/>
               <w:right w:val="single" w:sz="1" w:space="0" w:color="CCCCCC"/>
             </w:tcBorders>
-            <w:tcMar>
-              <w:top w:w="100" w:type="dxa"/>
-              <w:left w:w="100" w:type="dxa"/>
-              <w:bottom w:w="100" w:type="dxa"/>
-              <w:right w:w="100" w:type="dxa"/>
-            </w:tcMar>
             <w:vAlign w:val="center"/>
           </w:tcPr>
           <w:p>
@@ -1155,10 +1049,16 @@
               <w:pStyle w:val="TiMiNormal"/>
               <w:bidi/>
             </w:pPr>
+            <w:r>
+              <w:t>{{v_type}}</w:t>
+            </w:r>
           </w:p>
         </w:tc>
       </w:tr>
       <w:tr>
+        <w:trPr>
+          <w:cantSplit/>
+        </w:trPr>
         <w:tc>
           <w:tcPr>
             <w:tcW w:w="4505" w:type="dxa"/>
@@ -1182,18 +1082,36 @@
               <w:bidi/>
             </w:pPr>
             <w:r>
-              <w:t>{{</w:t>
-            </w:r>
-            <w:proofErr w:type="spellStart"/>
-            <w:r>
-              <w:t>v_owner</w:t>
-            </w:r>
-            <w:proofErr w:type="spellEnd"/>
-            <w:r>
-              <w:t>}}</w:t>
+              <w:t>בעלים / מבצע</w:t>
             </w:r>
           </w:p>
         </w:tc>
+        <w:tc>
+          <w:tcPr>
+            <w:tcW w:w="4505" w:type="dxa"/>
+            <w:tcBorders>
+              <w:top w:val="single" w:sz="1" w:space="0" w:color="CCCCCC"/>
+              <w:left w:val="single" w:sz="1" w:space="0" w:color="CCCCCC"/>
+              <w:bottom w:val="single" w:sz="1" w:space="0" w:color="CCCCCC"/>
+              <w:right w:val="single" w:sz="1" w:space="0" w:color="CCCCCC"/>
+            </w:tcBorders>
+            <w:vAlign w:val="center"/>
+          </w:tcPr>
+          <w:p>
+            <w:pPr>
+              <w:pStyle w:val="TiMiNormal"/>
+              <w:bidi/>
+            </w:pPr>
+            <w:r>
+              <w:t>{{v_owner}}</w:t>
+            </w:r>
+          </w:p>
+        </w:tc>
+      </w:tr>
+      <w:tr>
+        <w:trPr>
+          <w:cantSplit/>
+        </w:trPr>
         <w:tc>
           <w:tcPr>
             <w:tcW w:w="4505" w:type="dxa"/>
@@ -1217,47 +1135,7 @@
               <w:bidi/>
             </w:pPr>
             <w:r>
-              <w:t xml:space="preserve"> </w:t>
-            </w:r>
-          </w:p>
-        </w:tc>
-      </w:tr>
-      <w:tr>
-        <w:tc>
-          <w:tcPr>
-            <w:tcW w:w="4505" w:type="dxa"/>
-            <w:tcBorders>
-              <w:top w:val="single" w:sz="1" w:space="0" w:color="CCCCCC"/>
-              <w:left w:val="single" w:sz="1" w:space="0" w:color="CCCCCC"/>
-              <w:bottom w:val="single" w:sz="1" w:space="0" w:color="CCCCCC"/>
-              <w:right w:val="single" w:sz="1" w:space="0" w:color="CCCCCC"/>
-            </w:tcBorders>
-            <w:tcMar>
-              <w:top w:w="100" w:type="dxa"/>
-              <w:left w:w="100" w:type="dxa"/>
-              <w:bottom w:w="100" w:type="dxa"/>
-              <w:right w:w="100" w:type="dxa"/>
-            </w:tcMar>
-            <w:vAlign w:val="center"/>
-          </w:tcPr>
-          <w:p>
-            <w:pPr>
-              <w:pStyle w:val="TiMiNormal"/>
-              <w:bidi/>
-              <w:rPr>
-                <w:rFonts w:hint="cs"/>
-              </w:rPr>
-            </w:pPr>
-            <w:r>
-              <w:t>{{</w:t>
-            </w:r>
-            <w:proofErr w:type="spellStart"/>
-            <w:r>
-              <w:t>v_id</w:t>
-            </w:r>
-            <w:proofErr w:type="spellEnd"/>
-            <w:r>
-              <w:t>}}</w:t>
+              <w:t>מספר ת.ז / ח.פ</w:t>
             </w:r>
           </w:p>
         </w:tc>
@@ -1270,12 +1148,6 @@
               <w:bottom w:val="single" w:sz="1" w:space="0" w:color="CCCCCC"/>
               <w:right w:val="single" w:sz="1" w:space="0" w:color="CCCCCC"/>
             </w:tcBorders>
-            <w:tcMar>
-              <w:top w:w="100" w:type="dxa"/>
-              <w:left w:w="100" w:type="dxa"/>
-              <w:bottom w:w="100" w:type="dxa"/>
-              <w:right w:w="100" w:type="dxa"/>
-            </w:tcMar>
             <w:vAlign w:val="center"/>
           </w:tcPr>
           <w:p>
@@ -1283,10 +1155,16 @@
               <w:pStyle w:val="TiMiNormal"/>
               <w:bidi/>
             </w:pPr>
+            <w:r>
+              <w:t>{{v_id}}</w:t>
+            </w:r>
           </w:p>
         </w:tc>
       </w:tr>
       <w:tr>
+        <w:trPr>
+          <w:cantSplit/>
+        </w:trPr>
         <w:tc>
           <w:tcPr>
             <w:tcW w:w="4505" w:type="dxa"/>
@@ -1310,15 +1188,7 @@
               <w:bidi/>
             </w:pPr>
             <w:r>
-              <w:t>{{</w:t>
-            </w:r>
-            <w:proofErr w:type="spellStart"/>
-            <w:r>
-              <w:t>v_addr</w:t>
-            </w:r>
-            <w:proofErr w:type="spellEnd"/>
-            <w:r>
-              <w:t>}}</w:t>
+              <w:t>כתובת בעלים</w:t>
             </w:r>
           </w:p>
         </w:tc>
@@ -1331,12 +1201,6 @@
               <w:bottom w:val="single" w:sz="1" w:space="0" w:color="CCCCCC"/>
               <w:right w:val="single" w:sz="1" w:space="0" w:color="CCCCCC"/>
             </w:tcBorders>
-            <w:tcMar>
-              <w:top w:w="100" w:type="dxa"/>
-              <w:left w:w="100" w:type="dxa"/>
-              <w:bottom w:w="100" w:type="dxa"/>
-              <w:right w:w="100" w:type="dxa"/>
-            </w:tcMar>
             <w:vAlign w:val="center"/>
           </w:tcPr>
           <w:p>
@@ -1344,10 +1208,16 @@
               <w:pStyle w:val="TiMiNormal"/>
               <w:bidi/>
             </w:pPr>
+            <w:r>
+              <w:t>{{v_addr}}</w:t>
+            </w:r>
           </w:p>
         </w:tc>
       </w:tr>
       <w:tr>
+        <w:trPr>
+          <w:cantSplit/>
+        </w:trPr>
         <w:tc>
           <w:tcPr>
             <w:tcW w:w="4505" w:type="dxa"/>
@@ -1371,15 +1241,7 @@
               <w:bidi/>
             </w:pPr>
             <w:r>
-              <w:t>{{</w:t>
-            </w:r>
-            <w:proofErr w:type="spellStart"/>
-            <w:r>
-              <w:t>violation</w:t>
-            </w:r>
-            <w:proofErr w:type="spellEnd"/>
-            <w:r>
-              <w:t>}}</w:t>
+              <w:t>תיאור העבירה</w:t>
             </w:r>
           </w:p>
         </w:tc>
@@ -1392,12 +1254,6 @@
               <w:bottom w:val="single" w:sz="1" w:space="0" w:color="CCCCCC"/>
               <w:right w:val="single" w:sz="1" w:space="0" w:color="CCCCCC"/>
             </w:tcBorders>
-            <w:tcMar>
-              <w:top w:w="100" w:type="dxa"/>
-              <w:left w:w="100" w:type="dxa"/>
-              <w:bottom w:w="100" w:type="dxa"/>
-              <w:right w:w="100" w:type="dxa"/>
-            </w:tcMar>
             <w:vAlign w:val="center"/>
           </w:tcPr>
           <w:p>
@@ -1405,10 +1261,16 @@
               <w:pStyle w:val="TiMiNormal"/>
               <w:bidi/>
             </w:pPr>
+            <w:r>
+              <w:t>{{violation}}</w:t>
+            </w:r>
           </w:p>
         </w:tc>
       </w:tr>
       <w:tr>
+        <w:trPr>
+          <w:cantSplit/>
+        </w:trPr>
         <w:tc>
           <w:tcPr>
             <w:tcW w:w="4505" w:type="dxa"/>
@@ -1432,21 +1294,7 @@
               <w:bidi/>
             </w:pPr>
             <w:r>
-              <w:t>{</w:t>
-            </w:r>
-            <w:r>
-              <w:t xml:space="preserve"> </w:t>
-            </w:r>
-            <w:r>
-              <w:t>{{</w:t>
-            </w:r>
-            <w:proofErr w:type="spellStart"/>
-            <w:r>
-              <w:t>v_waste</w:t>
-            </w:r>
-            <w:proofErr w:type="spellEnd"/>
-            <w:r>
-              <w:t>}}</w:t>
+              <w:t>סוג פסולת</w:t>
             </w:r>
           </w:p>
         </w:tc>
@@ -1459,12 +1307,6 @@
               <w:bottom w:val="single" w:sz="1" w:space="0" w:color="CCCCCC"/>
               <w:right w:val="single" w:sz="1" w:space="0" w:color="CCCCCC"/>
             </w:tcBorders>
-            <w:tcMar>
-              <w:top w:w="100" w:type="dxa"/>
-              <w:left w:w="100" w:type="dxa"/>
-              <w:bottom w:w="100" w:type="dxa"/>
-              <w:right w:w="100" w:type="dxa"/>
-            </w:tcMar>
             <w:vAlign w:val="center"/>
           </w:tcPr>
           <w:p>
@@ -1472,6 +1314,9 @@
               <w:pStyle w:val="TiMiNormal"/>
               <w:bidi/>
             </w:pPr>
+            <w:r>
+              <w:t>{ {{v_waste}}</w:t>
+            </w:r>
           </w:p>
         </w:tc>
       </w:tr>
@@ -1506,13 +1351,7 @@
         <w:rPr>
           <w:rFonts w:hint="cs"/>
         </w:rPr>
-        <w:t>מפה</w:t>
-      </w:r>
-      <w:r>
-        <w:rPr>
-          <w:rFonts w:hint="cs"/>
-        </w:rPr>
-        <w:t>:</w:t>
+        <w:t>מפה:</w:t>
       </w:r>
     </w:p>
     <w:p>
@@ -1599,7 +1438,7 @@
     <w:tbl>
       <w:tblPr>
         <w:bidiVisual/>
-        <w:tblW w:w="0" w:type="auto"/>
+        <w:tblW w:w="9010" w:type="dxa"/>
         <w:tblBorders>
           <w:top w:val="single" w:sz="4" w:space="0" w:color="auto"/>
           <w:left w:val="single" w:sz="4" w:space="0" w:color="auto"/>
@@ -1619,6 +1458,9 @@
         <w:gridCol w:w="4505"/>
       </w:tblGrid>
       <w:tr>
+        <w:trPr>
+          <w:cantSplit/>
+        </w:trPr>
         <w:tc>
           <w:tcPr>
             <w:tcW w:w="4505" w:type="dxa"/>
@@ -1642,15 +1484,7 @@
               <w:bidi/>
             </w:pPr>
             <w:r>
-              <w:t>{{</w:t>
-            </w:r>
-            <w:proofErr w:type="spellStart"/>
-            <w:r>
-              <w:t>jurisdiction</w:t>
-            </w:r>
-            <w:proofErr w:type="spellEnd"/>
-            <w:r>
-              <w:t>}}</w:t>
+              <w:t>רשות מקומית</w:t>
             </w:r>
           </w:p>
         </w:tc>
@@ -1663,12 +1497,6 @@
               <w:bottom w:val="single" w:sz="1" w:space="0" w:color="CCCCCC"/>
               <w:right w:val="single" w:sz="1" w:space="0" w:color="CCCCCC"/>
             </w:tcBorders>
-            <w:tcMar>
-              <w:top w:w="100" w:type="dxa"/>
-              <w:left w:w="100" w:type="dxa"/>
-              <w:bottom w:w="100" w:type="dxa"/>
-              <w:right w:w="100" w:type="dxa"/>
-            </w:tcMar>
             <w:vAlign w:val="center"/>
           </w:tcPr>
           <w:p>
@@ -1676,10 +1504,16 @@
               <w:pStyle w:val="TiMiNormal"/>
               <w:bidi/>
             </w:pPr>
+            <w:r>
+              <w:t>{{jurisdiction}}</w:t>
+            </w:r>
           </w:p>
         </w:tc>
       </w:tr>
       <w:tr>
+        <w:trPr>
+          <w:cantSplit/>
+        </w:trPr>
         <w:tc>
           <w:tcPr>
             <w:tcW w:w="4505" w:type="dxa"/>
@@ -1703,15 +1537,7 @@
               <w:bidi/>
             </w:pPr>
             <w:r>
-              <w:t>{{</w:t>
-            </w:r>
-            <w:proofErr w:type="spellStart"/>
-            <w:r>
-              <w:t>block</w:t>
-            </w:r>
-            <w:proofErr w:type="spellEnd"/>
-            <w:r>
-              <w:t>}}</w:t>
+              <w:t>גוש</w:t>
             </w:r>
           </w:p>
         </w:tc>
@@ -1724,12 +1550,6 @@
               <w:bottom w:val="single" w:sz="1" w:space="0" w:color="CCCCCC"/>
               <w:right w:val="single" w:sz="1" w:space="0" w:color="CCCCCC"/>
             </w:tcBorders>
-            <w:tcMar>
-              <w:top w:w="100" w:type="dxa"/>
-              <w:left w:w="100" w:type="dxa"/>
-              <w:bottom w:w="100" w:type="dxa"/>
-              <w:right w:w="100" w:type="dxa"/>
-            </w:tcMar>
             <w:vAlign w:val="center"/>
           </w:tcPr>
           <w:p>
@@ -1737,10 +1557,16 @@
               <w:pStyle w:val="TiMiNormal"/>
               <w:bidi/>
             </w:pPr>
+            <w:r>
+              <w:t>{{block}}</w:t>
+            </w:r>
           </w:p>
         </w:tc>
       </w:tr>
       <w:tr>
+        <w:trPr>
+          <w:cantSplit/>
+        </w:trPr>
         <w:tc>
           <w:tcPr>
             <w:tcW w:w="4505" w:type="dxa"/>
@@ -1764,15 +1590,7 @@
               <w:bidi/>
             </w:pPr>
             <w:r>
-              <w:t>{{</w:t>
-            </w:r>
-            <w:proofErr w:type="spellStart"/>
-            <w:r>
-              <w:t>parcel</w:t>
-            </w:r>
-            <w:proofErr w:type="spellEnd"/>
-            <w:r>
-              <w:t>}}</w:t>
+              <w:t>חלקה</w:t>
             </w:r>
           </w:p>
         </w:tc>
@@ -1785,12 +1603,6 @@
               <w:bottom w:val="single" w:sz="1" w:space="0" w:color="CCCCCC"/>
               <w:right w:val="single" w:sz="1" w:space="0" w:color="CCCCCC"/>
             </w:tcBorders>
-            <w:tcMar>
-              <w:top w:w="100" w:type="dxa"/>
-              <w:left w:w="100" w:type="dxa"/>
-              <w:bottom w:w="100" w:type="dxa"/>
-              <w:right w:w="100" w:type="dxa"/>
-            </w:tcMar>
             <w:vAlign w:val="center"/>
           </w:tcPr>
           <w:p>
@@ -1799,7 +1611,7 @@
               <w:bidi/>
             </w:pPr>
             <w:r>
-              <w:t xml:space="preserve"> </w:t>
+              <w:t>{{parcel}}</w:t>
             </w:r>
           </w:p>
         </w:tc>
@@ -1815,13 +1627,8 @@
         <w:rPr>
           <w:rFonts w:hint="cs"/>
         </w:rPr>
-        <w:t>תמונות</w:t>
-      </w:r>
-      <w:r>
-        <w:rPr>
-          <w:rFonts w:hint="cs"/>
-        </w:rPr>
-        <w:t>:</w:t>
+        <w:lastRenderedPageBreak/>
+        <w:t>תמונות:</w:t>
       </w:r>
     </w:p>
     <w:p>
@@ -1836,41 +1643,36 @@
           <w:sz w:val="24"/>
           <w:szCs w:val="24"/>
         </w:rPr>
-        <w:t>{{</w:t>
-      </w:r>
-      <w:proofErr w:type="spellStart"/>
-      <w:r>
-        <w:rPr>
-          <w:rStyle w:val="HTMLCode"/>
-          <w:rFonts w:ascii="Arial" w:eastAsia="Arial" w:hAnsi="Arial" w:cs="Arial"/>
-          <w:sz w:val="24"/>
-          <w:szCs w:val="24"/>
-        </w:rPr>
-        <w:t>photos</w:t>
-      </w:r>
-      <w:proofErr w:type="spellEnd"/>
-      <w:r>
-        <w:rPr>
-          <w:rStyle w:val="HTMLCode"/>
-          <w:rFonts w:ascii="Arial" w:eastAsia="Arial" w:hAnsi="Arial" w:cs="Arial"/>
-          <w:sz w:val="24"/>
-          <w:szCs w:val="24"/>
-        </w:rPr>
-        <w:t>}}</w:t>
+        <w:t>{{photos}}</w:t>
       </w:r>
     </w:p>
     <w:p>
       <w:pPr>
         <w:pStyle w:val="TiMiNormal"/>
         <w:bidi/>
-        <w:rPr>
-          <w:rFonts w:hint="cs"/>
-        </w:rPr>
-      </w:pPr>
+      </w:pPr>
+    </w:p>
+    <w:p>
+      <w:pPr>
+        <w:pStyle w:val="TiMiHeading1"/>
+        <w:jc w:val="right"/>
+      </w:pPr>
+      <w:r>
+        <w:t>חתימה ואישור</w:t>
+      </w:r>
+    </w:p>
+    <w:p>
+      <w:pPr>
+        <w:pStyle w:val="TiMiNormal"/>
+        <w:jc w:val="right"/>
+      </w:pPr>
+      <w:r>
+        <w:t>{{signature}}</w:t>
+      </w:r>
     </w:p>
     <w:sectPr>
-      <w:headerReference w:type="default" r:id="rId9"/>
-      <w:footerReference w:type="default" r:id="rId10"/>
+      <w:headerReference w:type="default" r:id="rId10"/>
+      <w:footerReference w:type="default" r:id="rId11"/>
       <w:type w:val="continuous"/>
       <w:pgSz w:w="11906" w:h="16838"/>
       <w:pgMar w:top="1440" w:right="1440" w:bottom="1440" w:left="1440" w:header="708" w:footer="708" w:gutter="0"/>
@@ -1882,7 +1684,7 @@
 </file>
 
 <file path=word/endnotes.xml><?xml version="1.0" encoding="utf-8"?>
-<w:endnotes xmlns:wpc="http://schemas.microsoft.com/office/word/2010/wordprocessingCanvas" xmlns:cx="http://schemas.microsoft.com/office/drawing/2014/chartex" xmlns:cx1="http://schemas.microsoft.com/office/drawing/2015/9/8/chartex" xmlns:cx2="http://schemas.microsoft.com/office/drawing/2015/10/21/chartex" xmlns:cx3="http://schemas.microsoft.com/office/drawing/2016/5/9/chartex" xmlns:cx4="http://schemas.microsoft.com/office/drawing/2016/5/10/chartex" xmlns:cx5="http://schemas.microsoft.com/office/drawing/2016/5/11/chartex" xmlns:cx6="http://schemas.microsoft.com/office/drawing/2016/5/12/chartex" xmlns:cx7="http://schemas.microsoft.com/office/drawing/2016/5/13/chartex" xmlns:cx8="http://schemas.microsoft.com/office/drawing/2016/5/14/chartex" xmlns:mc="http://schemas.openxmlformats.org/markup-compatibility/2006" xmlns:aink="http://schemas.microsoft.com/office/drawing/2016/ink" xmlns:am3d="http://schemas.microsoft.com/office/drawing/2017/model3d" xmlns:o="urn:schemas-microsoft-com:office:office" xmlns:r="http://schemas.openxmlformats.org/officeDocument/2006/relationships" xmlns:m="http://schemas.openxmlformats.org/officeDocument/2006/math" xmlns:v="urn:schemas-microsoft-com:vml" xmlns:wp14="http://schemas.microsoft.com/office/word/2010/wordprocessingDrawing" xmlns:wp="http://schemas.openxmlformats.org/drawingml/2006/wordprocessingDrawing" xmlns:w10="urn:schemas-microsoft-com:office:word" xmlns:w="http://schemas.openxmlformats.org/wordprocessingml/2006/main" xmlns:w14="http://schemas.microsoft.com/office/word/2010/wordml" xmlns:w15="http://schemas.microsoft.com/office/word/2012/wordml" xmlns:w16cex="http://schemas.microsoft.com/office/word/2018/wordml/cex" xmlns:w16cid="http://schemas.microsoft.com/office/word/2016/wordml/cid" xmlns:w16="http://schemas.microsoft.com/office/word/2018/wordml" xmlns:w16sdtdh="http://schemas.microsoft.com/office/word/2020/wordml/sdtdatahash" xmlns:w16se="http://schemas.microsoft.com/office/word/2015/wordml/symex" xmlns:wpg="http://schemas.microsoft.com/office/word/2010/wordprocessingGroup" xmlns:wpi="http://schemas.microsoft.com/office/word/2010/wordprocessingInk" xmlns:wne="http://schemas.microsoft.com/office/word/2006/wordml" xmlns:wps="http://schemas.microsoft.com/office/word/2010/wordprocessingShape" mc:Ignorable="w14 w15 w16se w16cid w16 w16cex w16sdtdh wp14">
+<w:endnotes xmlns:wpc="http://schemas.microsoft.com/office/word/2010/wordprocessingCanvas" xmlns:mc="http://schemas.openxmlformats.org/markup-compatibility/2006" xmlns:o="urn:schemas-microsoft-com:office:office" xmlns:r="http://schemas.openxmlformats.org/officeDocument/2006/relationships" xmlns:m="http://schemas.openxmlformats.org/officeDocument/2006/math" xmlns:v="urn:schemas-microsoft-com:vml" xmlns:wp14="http://schemas.microsoft.com/office/word/2010/wordprocessingDrawing" xmlns:wp="http://schemas.openxmlformats.org/drawingml/2006/wordprocessingDrawing" xmlns:w10="urn:schemas-microsoft-com:office:word" xmlns:w="http://schemas.openxmlformats.org/wordprocessingml/2006/main" xmlns:w14="http://schemas.microsoft.com/office/word/2010/wordml" xmlns:wpg="http://schemas.microsoft.com/office/word/2010/wordprocessingGroup" xmlns:wpi="http://schemas.microsoft.com/office/word/2010/wordprocessingInk" xmlns:wne="http://schemas.microsoft.com/office/word/2006/wordml" xmlns:wps="http://schemas.microsoft.com/office/word/2010/wordprocessingShape" mc:Ignorable="w14 wp14">
   <w:endnote w:type="separator" w:id="-1">
     <w:p>
       <w:pPr>
@@ -1907,207 +1709,35 @@
 </file>
 
 <file path=word/footer1.xml><?xml version="1.0" encoding="utf-8"?>
-<w:ftr xmlns:wpc="http://schemas.microsoft.com/office/word/2010/wordprocessingCanvas" xmlns:cx="http://schemas.microsoft.com/office/drawing/2014/chartex" xmlns:cx1="http://schemas.microsoft.com/office/drawing/2015/9/8/chartex" xmlns:cx2="http://schemas.microsoft.com/office/drawing/2015/10/21/chartex" xmlns:cx3="http://schemas.microsoft.com/office/drawing/2016/5/9/chartex" xmlns:cx4="http://schemas.microsoft.com/office/drawing/2016/5/10/chartex" xmlns:cx5="http://schemas.microsoft.com/office/drawing/2016/5/11/chartex" xmlns:cx6="http://schemas.microsoft.com/office/drawing/2016/5/12/chartex" xmlns:cx7="http://schemas.microsoft.com/office/drawing/2016/5/13/chartex" xmlns:cx8="http://schemas.microsoft.com/office/drawing/2016/5/14/chartex" xmlns:mc="http://schemas.openxmlformats.org/markup-compatibility/2006" xmlns:aink="http://schemas.microsoft.com/office/drawing/2016/ink" xmlns:am3d="http://schemas.microsoft.com/office/drawing/2017/model3d" xmlns:o="urn:schemas-microsoft-com:office:office" xmlns:r="http://schemas.openxmlformats.org/officeDocument/2006/relationships" xmlns:m="http://schemas.openxmlformats.org/officeDocument/2006/math" xmlns:v="urn:schemas-microsoft-com:vml" xmlns:wp14="http://schemas.microsoft.com/office/word/2010/wordprocessingDrawing" xmlns:wp="http://schemas.openxmlformats.org/drawingml/2006/wordprocessingDrawing" xmlns:w10="urn:schemas-microsoft-com:office:word" xmlns:w="http://schemas.openxmlformats.org/wordprocessingml/2006/main" xmlns:w14="http://schemas.microsoft.com/office/word/2010/wordml" xmlns:w15="http://schemas.microsoft.com/office/word/2012/wordml" xmlns:w16cex="http://schemas.microsoft.com/office/word/2018/wordml/cex" xmlns:w16cid="http://schemas.microsoft.com/office/word/2016/wordml/cid" xmlns:w16="http://schemas.microsoft.com/office/word/2018/wordml" xmlns:w16sdtdh="http://schemas.microsoft.com/office/word/2020/wordml/sdtdatahash" xmlns:w16se="http://schemas.microsoft.com/office/word/2015/wordml/symex" xmlns:wpg="http://schemas.microsoft.com/office/word/2010/wordprocessingGroup" xmlns:wpi="http://schemas.microsoft.com/office/word/2010/wordprocessingInk" xmlns:wne="http://schemas.microsoft.com/office/word/2006/wordml" xmlns:wps="http://schemas.microsoft.com/office/word/2010/wordprocessingShape" mc:Ignorable="w14 w15 w16se w16cid w16 w16cex w16sdtdh wp14">
+<w:ftr xmlns:wpc="http://schemas.microsoft.com/office/word/2010/wordprocessingCanvas" xmlns:mc="http://schemas.openxmlformats.org/markup-compatibility/2006" xmlns:o="urn:schemas-microsoft-com:office:office" xmlns:r="http://schemas.openxmlformats.org/officeDocument/2006/relationships" xmlns:m="http://schemas.openxmlformats.org/officeDocument/2006/math" xmlns:v="urn:schemas-microsoft-com:vml" xmlns:wp14="http://schemas.microsoft.com/office/word/2010/wordprocessingDrawing" xmlns:wp="http://schemas.openxmlformats.org/drawingml/2006/wordprocessingDrawing" xmlns:w10="urn:schemas-microsoft-com:office:word" xmlns:w="http://schemas.openxmlformats.org/wordprocessingml/2006/main" xmlns:w14="http://schemas.microsoft.com/office/word/2010/wordml" xmlns:wpg="http://schemas.microsoft.com/office/word/2010/wordprocessingGroup" xmlns:wpi="http://schemas.microsoft.com/office/word/2010/wordprocessingInk" xmlns:wne="http://schemas.microsoft.com/office/word/2006/wordml" xmlns:wps="http://schemas.microsoft.com/office/word/2010/wordprocessingShape" mc:Ignorable="w14 wp14">
   <w:p>
     <w:pPr>
-      <w:pStyle w:val="af2"/>
+      <w:pStyle w:val="Footer"/>
       <w:bidi/>
+      <w:jc w:val="center"/>
       <w:rPr>
         <w:lang w:bidi="he-IL"/>
       </w:rPr>
     </w:pPr>
-    <w:r>
-      <w:rPr>
-        <w:lang w:bidi="he-IL"/>
-      </w:rPr>
-      <w:t>{{</w:t>
-    </w:r>
     <w:proofErr w:type="spellStart"/>
-    <w:r>
-      <w:rPr>
-        <w:lang w:bidi="he-IL"/>
-      </w:rPr>
-      <w:t>inspector_name</w:t>
-    </w:r>
+    <w:proofErr w:type="spellEnd"/>
+    <w:proofErr w:type="gramStart"/>
+    <w:proofErr w:type="gramEnd"/>
+    <w:proofErr w:type="spellStart"/>
     <w:proofErr w:type="spellEnd"/>
     <w:r>
       <w:rPr>
-        <w:lang w:bidi="he-IL"/>
+        <w:rFonts w:ascii="Arial" w:hAnsi="Arial"/>
+        <w:sz w:val="20"/>
       </w:rPr>
-      <w:t>}</w:t>
+      <w:t>YNSHOUF_NAME , מספר עובד YNSHOUF_NUM, פקח נגב מערבי, ינשוו"פ, רט"ג</w:t>
     </w:r>
-    <w:proofErr w:type="gramStart"/>
-    <w:r>
-      <w:rPr>
-        <w:lang w:bidi="he-IL"/>
-      </w:rPr>
-      <w:t>} ,</w:t>
-    </w:r>
-    <w:proofErr w:type="gramEnd"/>
-    <w:r>
-      <w:rPr>
-        <w:lang w:bidi="he-IL"/>
-      </w:rPr>
-      <w:t xml:space="preserve"> </w:t>
-    </w:r>
-    <w:r>
-      <w:rPr>
-        <w:rFonts w:cs="Arial" w:hint="cs"/>
-        <w:rtl/>
-        <w:lang w:bidi="he-IL"/>
-      </w:rPr>
-      <w:t>מספר</w:t>
-    </w:r>
-    <w:r>
-      <w:rPr>
-        <w:rFonts w:cs="Arial"/>
-        <w:rtl/>
-        <w:lang w:bidi="he-IL"/>
-      </w:rPr>
-      <w:t xml:space="preserve"> </w:t>
-    </w:r>
-    <w:r>
-      <w:rPr>
-        <w:rFonts w:cs="Arial" w:hint="cs"/>
-        <w:rtl/>
-        <w:lang w:bidi="he-IL"/>
-      </w:rPr>
-      <w:t>עובד</w:t>
-    </w:r>
-    <w:r>
-      <w:rPr>
-        <w:lang w:bidi="he-IL"/>
-      </w:rPr>
-      <w:t xml:space="preserve"> {{</w:t>
-    </w:r>
-    <w:proofErr w:type="spellStart"/>
-    <w:r>
-      <w:rPr>
-        <w:lang w:bidi="he-IL"/>
-      </w:rPr>
-      <w:t>inspector_num</w:t>
-    </w:r>
-    <w:proofErr w:type="spellEnd"/>
-    <w:r>
-      <w:rPr>
-        <w:lang w:bidi="he-IL"/>
-      </w:rPr>
-      <w:t xml:space="preserve">}}, </w:t>
-    </w:r>
-    <w:r>
-      <w:rPr>
-        <w:rFonts w:cs="Arial" w:hint="cs"/>
-        <w:rtl/>
-        <w:lang w:bidi="he-IL"/>
-      </w:rPr>
-      <w:t>פקח</w:t>
-    </w:r>
-    <w:r>
-      <w:rPr>
-        <w:rFonts w:cs="Arial"/>
-        <w:rtl/>
-        <w:lang w:bidi="he-IL"/>
-      </w:rPr>
-      <w:t xml:space="preserve"> </w:t>
-    </w:r>
-    <w:r>
-      <w:rPr>
-        <w:rFonts w:cs="Arial" w:hint="cs"/>
-        <w:rtl/>
-        <w:lang w:bidi="he-IL"/>
-      </w:rPr>
-      <w:t>נגב</w:t>
-    </w:r>
-    <w:r>
-      <w:rPr>
-        <w:rFonts w:cs="Arial"/>
-        <w:rtl/>
-        <w:lang w:bidi="he-IL"/>
-      </w:rPr>
-      <w:t xml:space="preserve"> </w:t>
-    </w:r>
-    <w:r>
-      <w:rPr>
-        <w:rFonts w:cs="Arial" w:hint="cs"/>
-        <w:rtl/>
-        <w:lang w:bidi="he-IL"/>
-      </w:rPr>
-      <w:t>מערבי</w:t>
-    </w:r>
-    <w:r>
-      <w:rPr>
-        <w:rFonts w:cs="Arial"/>
-        <w:rtl/>
-        <w:lang w:bidi="he-IL"/>
-      </w:rPr>
-      <w:t xml:space="preserve">, </w:t>
-    </w:r>
-    <w:proofErr w:type="spellStart"/>
-    <w:r>
-      <w:rPr>
-        <w:rFonts w:cs="Arial" w:hint="cs"/>
-        <w:rtl/>
-        <w:lang w:bidi="he-IL"/>
-      </w:rPr>
-      <w:t>ינשו</w:t>
-    </w:r>
-    <w:r>
-      <w:rPr>
-        <w:rFonts w:cs="Arial"/>
-        <w:rtl/>
-        <w:lang w:bidi="he-IL"/>
-      </w:rPr>
-      <w:t>"</w:t>
-    </w:r>
-    <w:r>
-      <w:rPr>
-        <w:rFonts w:cs="Arial" w:hint="cs"/>
-        <w:rtl/>
-        <w:lang w:bidi="he-IL"/>
-      </w:rPr>
-      <w:t>פ</w:t>
-    </w:r>
-    <w:proofErr w:type="spellEnd"/>
-    <w:r>
-      <w:rPr>
-        <w:rFonts w:cs="Arial"/>
-        <w:rtl/>
-        <w:lang w:bidi="he-IL"/>
-      </w:rPr>
-      <w:t xml:space="preserve">, </w:t>
-    </w:r>
-    <w:proofErr w:type="spellStart"/>
-    <w:r>
-      <w:rPr>
-        <w:rFonts w:cs="Arial" w:hint="cs"/>
-        <w:rtl/>
-        <w:lang w:bidi="he-IL"/>
-      </w:rPr>
-      <w:t>רט</w:t>
-    </w:r>
-    <w:r>
-      <w:rPr>
-        <w:rFonts w:cs="Arial"/>
-        <w:rtl/>
-        <w:lang w:bidi="he-IL"/>
-      </w:rPr>
-      <w:t>"</w:t>
-    </w:r>
-    <w:r>
-      <w:rPr>
-        <w:rFonts w:cs="Arial" w:hint="cs"/>
-        <w:rtl/>
-        <w:lang w:bidi="he-IL"/>
-      </w:rPr>
-      <w:t>ג</w:t>
-    </w:r>
-    <w:proofErr w:type="spellEnd"/>
   </w:p>
 </w:ftr>
 </file>
 
 <file path=word/footnotes.xml><?xml version="1.0" encoding="utf-8"?>
-<w:footnotes xmlns:wpc="http://schemas.microsoft.com/office/word/2010/wordprocessingCanvas" xmlns:cx="http://schemas.microsoft.com/office/drawing/2014/chartex" xmlns:cx1="http://schemas.microsoft.com/office/drawing/2015/9/8/chartex" xmlns:cx2="http://schemas.microsoft.com/office/drawing/2015/10/21/chartex" xmlns:cx3="http://schemas.microsoft.com/office/drawing/2016/5/9/chartex" xmlns:cx4="http://schemas.microsoft.com/office/drawing/2016/5/10/chartex" xmlns:cx5="http://schemas.microsoft.com/office/drawing/2016/5/11/chartex" xmlns:cx6="http://schemas.microsoft.com/office/drawing/2016/5/12/chartex" xmlns:cx7="http://schemas.microsoft.com/office/drawing/2016/5/13/chartex" xmlns:cx8="http://schemas.microsoft.com/office/drawing/2016/5/14/chartex" xmlns:mc="http://schemas.openxmlformats.org/markup-compatibility/2006" xmlns:aink="http://schemas.microsoft.com/office/drawing/2016/ink" xmlns:am3d="http://schemas.microsoft.com/office/drawing/2017/model3d" xmlns:o="urn:schemas-microsoft-com:office:office" xmlns:r="http://schemas.openxmlformats.org/officeDocument/2006/relationships" xmlns:m="http://schemas.openxmlformats.org/officeDocument/2006/math" xmlns:v="urn:schemas-microsoft-com:vml" xmlns:wp14="http://schemas.microsoft.com/office/word/2010/wordprocessingDrawing" xmlns:wp="http://schemas.openxmlformats.org/drawingml/2006/wordprocessingDrawing" xmlns:w10="urn:schemas-microsoft-com:office:word" xmlns:w="http://schemas.openxmlformats.org/wordprocessingml/2006/main" xmlns:w14="http://schemas.microsoft.com/office/word/2010/wordml" xmlns:w15="http://schemas.microsoft.com/office/word/2012/wordml" xmlns:w16cex="http://schemas.microsoft.com/office/word/2018/wordml/cex" xmlns:w16cid="http://schemas.microsoft.com/office/word/2016/wordml/cid" xmlns:w16="http://schemas.microsoft.com/office/word/2018/wordml" xmlns:w16sdtdh="http://schemas.microsoft.com/office/word/2020/wordml/sdtdatahash" xmlns:w16se="http://schemas.microsoft.com/office/word/2015/wordml/symex" xmlns:wpg="http://schemas.microsoft.com/office/word/2010/wordprocessingGroup" xmlns:wpi="http://schemas.microsoft.com/office/word/2010/wordprocessingInk" xmlns:wne="http://schemas.microsoft.com/office/word/2006/wordml" xmlns:wps="http://schemas.microsoft.com/office/word/2010/wordprocessingShape" mc:Ignorable="w14 w15 w16se w16cid w16 w16cex w16sdtdh wp14">
+<w:footnotes xmlns:wpc="http://schemas.microsoft.com/office/word/2010/wordprocessingCanvas" xmlns:mc="http://schemas.openxmlformats.org/markup-compatibility/2006" xmlns:o="urn:schemas-microsoft-com:office:office" xmlns:r="http://schemas.openxmlformats.org/officeDocument/2006/relationships" xmlns:m="http://schemas.openxmlformats.org/officeDocument/2006/math" xmlns:v="urn:schemas-microsoft-com:vml" xmlns:wp14="http://schemas.microsoft.com/office/word/2010/wordprocessingDrawing" xmlns:wp="http://schemas.openxmlformats.org/drawingml/2006/wordprocessingDrawing" xmlns:w10="urn:schemas-microsoft-com:office:word" xmlns:w="http://schemas.openxmlformats.org/wordprocessingml/2006/main" xmlns:w14="http://schemas.microsoft.com/office/word/2010/wordml" xmlns:wpg="http://schemas.microsoft.com/office/word/2010/wordprocessingGroup" xmlns:wpi="http://schemas.microsoft.com/office/word/2010/wordprocessingInk" xmlns:wne="http://schemas.microsoft.com/office/word/2006/wordml" xmlns:wps="http://schemas.microsoft.com/office/word/2010/wordprocessingShape" mc:Ignorable="w14 wp14">
   <w:footnote w:type="separator" w:id="-1">
     <w:p>
       <w:r>
@@ -2126,7 +1756,7 @@
 </file>
 
 <file path=word/header1.xml><?xml version="1.0" encoding="utf-8"?>
-<w:hdr xmlns:wpc="http://schemas.microsoft.com/office/word/2010/wordprocessingCanvas" xmlns:cx="http://schemas.microsoft.com/office/drawing/2014/chartex" xmlns:cx1="http://schemas.microsoft.com/office/drawing/2015/9/8/chartex" xmlns:cx2="http://schemas.microsoft.com/office/drawing/2015/10/21/chartex" xmlns:cx3="http://schemas.microsoft.com/office/drawing/2016/5/9/chartex" xmlns:cx4="http://schemas.microsoft.com/office/drawing/2016/5/10/chartex" xmlns:cx5="http://schemas.microsoft.com/office/drawing/2016/5/11/chartex" xmlns:cx6="http://schemas.microsoft.com/office/drawing/2016/5/12/chartex" xmlns:cx7="http://schemas.microsoft.com/office/drawing/2016/5/13/chartex" xmlns:cx8="http://schemas.microsoft.com/office/drawing/2016/5/14/chartex" xmlns:mc="http://schemas.openxmlformats.org/markup-compatibility/2006" xmlns:aink="http://schemas.microsoft.com/office/drawing/2016/ink" xmlns:am3d="http://schemas.microsoft.com/office/drawing/2017/model3d" xmlns:o="urn:schemas-microsoft-com:office:office" xmlns:r="http://schemas.openxmlformats.org/officeDocument/2006/relationships" xmlns:m="http://schemas.openxmlformats.org/officeDocument/2006/math" xmlns:v="urn:schemas-microsoft-com:vml" xmlns:wp14="http://schemas.microsoft.com/office/word/2010/wordprocessingDrawing" xmlns:wp="http://schemas.openxmlformats.org/drawingml/2006/wordprocessingDrawing" xmlns:w10="urn:schemas-microsoft-com:office:word" xmlns:w="http://schemas.openxmlformats.org/wordprocessingml/2006/main" xmlns:w14="http://schemas.microsoft.com/office/word/2010/wordml" xmlns:w15="http://schemas.microsoft.com/office/word/2012/wordml" xmlns:w16cex="http://schemas.microsoft.com/office/word/2018/wordml/cex" xmlns:w16cid="http://schemas.microsoft.com/office/word/2016/wordml/cid" xmlns:w16="http://schemas.microsoft.com/office/word/2018/wordml" xmlns:w16sdtdh="http://schemas.microsoft.com/office/word/2020/wordml/sdtdatahash" xmlns:w16se="http://schemas.microsoft.com/office/word/2015/wordml/symex" xmlns:wpg="http://schemas.microsoft.com/office/word/2010/wordprocessingGroup" xmlns:wpi="http://schemas.microsoft.com/office/word/2010/wordprocessingInk" xmlns:wne="http://schemas.microsoft.com/office/word/2006/wordml" xmlns:wps="http://schemas.microsoft.com/office/word/2010/wordprocessingShape" mc:Ignorable="w14 w15 w16se w16cid w16 w16cex w16sdtdh wp14">
+<w:hdr xmlns:wpc="http://schemas.microsoft.com/office/word/2010/wordprocessingCanvas" xmlns:mc="http://schemas.openxmlformats.org/markup-compatibility/2006" xmlns:o="urn:schemas-microsoft-com:office:office" xmlns:r="http://schemas.openxmlformats.org/officeDocument/2006/relationships" xmlns:m="http://schemas.openxmlformats.org/officeDocument/2006/math" xmlns:v="urn:schemas-microsoft-com:vml" xmlns:wp14="http://schemas.microsoft.com/office/word/2010/wordprocessingDrawing" xmlns:wp="http://schemas.openxmlformats.org/drawingml/2006/wordprocessingDrawing" xmlns:w10="urn:schemas-microsoft-com:office:word" xmlns:w="http://schemas.openxmlformats.org/wordprocessingml/2006/main" xmlns:w14="http://schemas.microsoft.com/office/word/2010/wordml" xmlns:wpg="http://schemas.microsoft.com/office/word/2010/wordprocessingGroup" xmlns:wpi="http://schemas.microsoft.com/office/word/2010/wordprocessingInk" xmlns:wne="http://schemas.microsoft.com/office/word/2006/wordml" xmlns:wps="http://schemas.microsoft.com/office/word/2010/wordprocessingShape" mc:Ignorable="w14 wp14">
   <w:tbl>
     <w:tblPr>
       <w:bidiVisual/>
@@ -2135,9 +1765,9 @@
       <w:tblLook w:val="04A0" w:firstRow="1" w:lastRow="0" w:firstColumn="1" w:lastColumn="0" w:noHBand="0" w:noVBand="1"/>
     </w:tblPr>
     <w:tblGrid>
-      <w:gridCol w:w="1642"/>
-      <w:gridCol w:w="4956"/>
-      <w:gridCol w:w="1644"/>
+      <w:gridCol w:w="1689"/>
+      <w:gridCol w:w="5078"/>
+      <w:gridCol w:w="1691"/>
     </w:tblGrid>
     <w:tr>
       <w:tc>
@@ -2147,7 +1777,7 @@
         </w:tcPr>
         <w:p>
           <w:pPr>
-            <w:pStyle w:val="af0"/>
+            <w:pStyle w:val="Header"/>
             <w:rPr>
               <w:rtl/>
             </w:rPr>
@@ -2225,7 +1855,7 @@
         </w:tcPr>
         <w:p>
           <w:pPr>
-            <w:pStyle w:val="af0"/>
+            <w:pStyle w:val="Header"/>
             <w:rPr>
               <w:rtl/>
             </w:rPr>
@@ -2233,7 +1863,7 @@
         </w:p>
         <w:p>
           <w:pPr>
-            <w:pStyle w:val="af0"/>
+            <w:pStyle w:val="Header"/>
             <w:jc w:val="center"/>
             <w:rPr>
               <w:rFonts w:cs="David"/>
@@ -2259,7 +1889,7 @@
         </w:p>
         <w:p>
           <w:pPr>
-            <w:pStyle w:val="af0"/>
+            <w:pStyle w:val="Header"/>
             <w:jc w:val="center"/>
             <w:rPr>
               <w:rFonts w:cs="David"/>
@@ -2274,7 +1904,7 @@
         </w:p>
         <w:p>
           <w:pPr>
-            <w:pStyle w:val="af0"/>
+            <w:pStyle w:val="Header"/>
             <w:jc w:val="center"/>
             <w:rPr>
               <w:rFonts w:cs="David"/>
@@ -2312,7 +1942,7 @@
         </w:tcPr>
         <w:p>
           <w:pPr>
-            <w:pStyle w:val="af0"/>
+            <w:pStyle w:val="Header"/>
             <w:rPr>
               <w:rtl/>
             </w:rPr>
@@ -2385,7 +2015,7 @@
                   </wp:anchor>
                 </w:drawing>
               </mc:Choice>
-              <mc:Fallback xmlns:w16sdtfl="http://schemas.microsoft.com/office/word/2024/wordml/sdtformatlock" xmlns:w16du="http://schemas.microsoft.com/office/word/2023/wordml/word16du" xmlns:oel="http://schemas.microsoft.com/office/2019/extlst">
+              <mc:Fallback xmlns:oel="http://schemas.microsoft.com/office/2019/extlst" xmlns:w16du="http://schemas.microsoft.com/office/word/2023/wordml/word16du" xmlns:w16sdtfl="http://schemas.microsoft.com/office/word/2024/wordml/sdtformatlock" xmlns:w16se="http://schemas.microsoft.com/office/word/2015/wordml/symex" xmlns:w16sdtdh="http://schemas.microsoft.com/office/word/2020/wordml/sdtdatahash" xmlns:w16="http://schemas.microsoft.com/office/word/2018/wordml" xmlns:w16cid="http://schemas.microsoft.com/office/word/2016/wordml/cid" xmlns:w16cex="http://schemas.microsoft.com/office/word/2018/wordml/cex" xmlns:w15="http://schemas.microsoft.com/office/word/2012/wordml" xmlns:am3d="http://schemas.microsoft.com/office/drawing/2017/model3d" xmlns:aink="http://schemas.microsoft.com/office/drawing/2016/ink" xmlns:cx8="http://schemas.microsoft.com/office/drawing/2016/5/14/chartex" xmlns:cx7="http://schemas.microsoft.com/office/drawing/2016/5/13/chartex" xmlns:cx6="http://schemas.microsoft.com/office/drawing/2016/5/12/chartex" xmlns:cx5="http://schemas.microsoft.com/office/drawing/2016/5/11/chartex" xmlns:cx4="http://schemas.microsoft.com/office/drawing/2016/5/10/chartex" xmlns:cx3="http://schemas.microsoft.com/office/drawing/2016/5/9/chartex" xmlns:cx2="http://schemas.microsoft.com/office/drawing/2015/10/21/chartex" xmlns:cx1="http://schemas.microsoft.com/office/drawing/2015/9/8/chartex" xmlns:cx="http://schemas.microsoft.com/office/drawing/2014/chartex">
                 <w:pict>
                   <v:shapetype w14:anchorId="08E5290B" id="_x0000_t32" coordsize="21600,21600" o:spt="32" o:oned="t" path="m,l21600,21600e" filled="f">
                     <v:path arrowok="t" fillok="f" o:connecttype="none"/>
@@ -2402,15 +2032,15 @@
   </w:tbl>
   <w:p>
     <w:pPr>
-      <w:pStyle w:val="af0"/>
+      <w:pStyle w:val="Header"/>
     </w:pPr>
   </w:p>
 </w:hdr>
 </file>
 
 <file path=word/numbering.xml><?xml version="1.0" encoding="utf-8"?>
-<w:numbering xmlns:wpc="http://schemas.microsoft.com/office/word/2010/wordprocessingCanvas" xmlns:cx="http://schemas.microsoft.com/office/drawing/2014/chartex" xmlns:cx1="http://schemas.microsoft.com/office/drawing/2015/9/8/chartex" xmlns:cx2="http://schemas.microsoft.com/office/drawing/2015/10/21/chartex" xmlns:cx3="http://schemas.microsoft.com/office/drawing/2016/5/9/chartex" xmlns:cx4="http://schemas.microsoft.com/office/drawing/2016/5/10/chartex" xmlns:cx5="http://schemas.microsoft.com/office/drawing/2016/5/11/chartex" xmlns:cx6="http://schemas.microsoft.com/office/drawing/2016/5/12/chartex" xmlns:cx7="http://schemas.microsoft.com/office/drawing/2016/5/13/chartex" xmlns:cx8="http://schemas.microsoft.com/office/drawing/2016/5/14/chartex" xmlns:mc="http://schemas.openxmlformats.org/markup-compatibility/2006" xmlns:aink="http://schemas.microsoft.com/office/drawing/2016/ink" xmlns:am3d="http://schemas.microsoft.com/office/drawing/2017/model3d" xmlns:o="urn:schemas-microsoft-com:office:office" xmlns:r="http://schemas.openxmlformats.org/officeDocument/2006/relationships" xmlns:m="http://schemas.openxmlformats.org/officeDocument/2006/math" xmlns:v="urn:schemas-microsoft-com:vml" xmlns:wp14="http://schemas.microsoft.com/office/word/2010/wordprocessingDrawing" xmlns:wp="http://schemas.openxmlformats.org/drawingml/2006/wordprocessingDrawing" xmlns:w10="urn:schemas-microsoft-com:office:word" xmlns:w="http://schemas.openxmlformats.org/wordprocessingml/2006/main" xmlns:w14="http://schemas.microsoft.com/office/word/2010/wordml" xmlns:w15="http://schemas.microsoft.com/office/word/2012/wordml" xmlns:w16cex="http://schemas.microsoft.com/office/word/2018/wordml/cex" xmlns:w16cid="http://schemas.microsoft.com/office/word/2016/wordml/cid" xmlns:w16="http://schemas.microsoft.com/office/word/2018/wordml" xmlns:w16sdtdh="http://schemas.microsoft.com/office/word/2020/wordml/sdtdatahash" xmlns:w16se="http://schemas.microsoft.com/office/word/2015/wordml/symex" xmlns:wpg="http://schemas.microsoft.com/office/word/2010/wordprocessingGroup" xmlns:wpi="http://schemas.microsoft.com/office/word/2010/wordprocessingInk" xmlns:wne="http://schemas.microsoft.com/office/word/2006/wordml" xmlns:wps="http://schemas.microsoft.com/office/word/2010/wordprocessingShape" mc:Ignorable="w14 w15 w16se w16cid w16 w16cex w16sdtdh wp14">
-  <w:abstractNum w:abstractNumId="0" w15:restartNumberingAfterBreak="0">
+<w:numbering xmlns:wpc="http://schemas.microsoft.com/office/word/2010/wordprocessingCanvas" xmlns:mc="http://schemas.openxmlformats.org/markup-compatibility/2006" xmlns:o="urn:schemas-microsoft-com:office:office" xmlns:r="http://schemas.openxmlformats.org/officeDocument/2006/relationships" xmlns:m="http://schemas.openxmlformats.org/officeDocument/2006/math" xmlns:v="urn:schemas-microsoft-com:vml" xmlns:wp14="http://schemas.microsoft.com/office/word/2010/wordprocessingDrawing" xmlns:wp="http://schemas.openxmlformats.org/drawingml/2006/wordprocessingDrawing" xmlns:w10="urn:schemas-microsoft-com:office:word" xmlns:w="http://schemas.openxmlformats.org/wordprocessingml/2006/main" xmlns:w14="http://schemas.microsoft.com/office/word/2010/wordml" xmlns:wpg="http://schemas.microsoft.com/office/word/2010/wordprocessingGroup" xmlns:wpi="http://schemas.microsoft.com/office/word/2010/wordprocessingInk" xmlns:wne="http://schemas.microsoft.com/office/word/2006/wordml" xmlns:wps="http://schemas.microsoft.com/office/word/2010/wordprocessingShape" mc:Ignorable="w14 wp14">
+  <w:abstractNum w:abstractNumId="0">
     <w:nsid w:val="EA454B4C"/>
     <w:multiLevelType w:val="multilevel"/>
     <w:tmpl w:val="89A05A4A"/>
@@ -2514,7 +2144,7 @@
       </w:pPr>
     </w:lvl>
   </w:abstractNum>
-  <w:abstractNum w:abstractNumId="1" w15:restartNumberingAfterBreak="0">
+  <w:abstractNum w:abstractNumId="1">
     <w:nsid w:val="08747425"/>
     <w:multiLevelType w:val="hybridMultilevel"/>
     <w:tmpl w:val="01F2E3F0"/>
@@ -2603,7 +2233,7 @@
       </w:pPr>
     </w:lvl>
   </w:abstractNum>
-  <w:abstractNum w:abstractNumId="2" w15:restartNumberingAfterBreak="0">
+  <w:abstractNum w:abstractNumId="2">
     <w:nsid w:val="0FFC729B"/>
     <w:multiLevelType w:val="hybridMultilevel"/>
     <w:tmpl w:val="9926EEC0"/>
@@ -2692,7 +2322,7 @@
       </w:pPr>
     </w:lvl>
   </w:abstractNum>
-  <w:abstractNum w:abstractNumId="3" w15:restartNumberingAfterBreak="0">
+  <w:abstractNum w:abstractNumId="3">
     <w:nsid w:val="170CD2DE"/>
     <w:multiLevelType w:val="multilevel"/>
     <w:tmpl w:val="0D442708"/>
@@ -2796,7 +2426,7 @@
       </w:pPr>
     </w:lvl>
   </w:abstractNum>
-  <w:abstractNum w:abstractNumId="4" w15:restartNumberingAfterBreak="0">
+  <w:abstractNum w:abstractNumId="4">
     <w:nsid w:val="27F5238F"/>
     <w:multiLevelType w:val="hybridMultilevel"/>
     <w:tmpl w:val="C4FC9170"/>
@@ -2885,7 +2515,7 @@
       </w:pPr>
     </w:lvl>
   </w:abstractNum>
-  <w:abstractNum w:abstractNumId="5" w15:restartNumberingAfterBreak="0">
+  <w:abstractNum w:abstractNumId="5">
     <w:nsid w:val="286A1C51"/>
     <w:multiLevelType w:val="hybridMultilevel"/>
     <w:tmpl w:val="301ABA9E"/>
@@ -2974,7 +2604,7 @@
       </w:pPr>
     </w:lvl>
   </w:abstractNum>
-  <w:abstractNum w:abstractNumId="6" w15:restartNumberingAfterBreak="0">
+  <w:abstractNum w:abstractNumId="6">
     <w:nsid w:val="2B051AB2"/>
     <w:multiLevelType w:val="hybridMultilevel"/>
     <w:tmpl w:val="7E6C67FA"/>
@@ -3063,7 +2693,7 @@
       </w:pPr>
     </w:lvl>
   </w:abstractNum>
-  <w:abstractNum w:abstractNumId="7" w15:restartNumberingAfterBreak="0">
+  <w:abstractNum w:abstractNumId="7">
     <w:nsid w:val="2C1AE401"/>
     <w:multiLevelType w:val="multilevel"/>
     <w:tmpl w:val="D9E49F08"/>
@@ -3167,7 +2797,7 @@
       </w:pPr>
     </w:lvl>
   </w:abstractNum>
-  <w:abstractNum w:abstractNumId="8" w15:restartNumberingAfterBreak="0">
+  <w:abstractNum w:abstractNumId="8">
     <w:nsid w:val="4864558C"/>
     <w:multiLevelType w:val="hybridMultilevel"/>
     <w:tmpl w:val="2A22D9B8"/>
@@ -3256,7 +2886,7 @@
       </w:pPr>
     </w:lvl>
   </w:abstractNum>
-  <w:abstractNum w:abstractNumId="9" w15:restartNumberingAfterBreak="0">
+  <w:abstractNum w:abstractNumId="9">
     <w:nsid w:val="52AD0683"/>
     <w:multiLevelType w:val="hybridMultilevel"/>
     <w:tmpl w:val="82E0379E"/>
@@ -3345,7 +2975,7 @@
       </w:pPr>
     </w:lvl>
   </w:abstractNum>
-  <w:abstractNum w:abstractNumId="10" w15:restartNumberingAfterBreak="0">
+  <w:abstractNum w:abstractNumId="10">
     <w:nsid w:val="60F97BDD"/>
     <w:multiLevelType w:val="hybridMultilevel"/>
     <w:tmpl w:val="82F0A80A"/>
@@ -3434,7 +3064,7 @@
       </w:pPr>
     </w:lvl>
   </w:abstractNum>
-  <w:abstractNum w:abstractNumId="11" w15:restartNumberingAfterBreak="0">
+  <w:abstractNum w:abstractNumId="11">
     <w:nsid w:val="657035CB"/>
     <w:multiLevelType w:val="hybridMultilevel"/>
     <w:tmpl w:val="CE9E1FCA"/>
@@ -3523,7 +3153,7 @@
       </w:pPr>
     </w:lvl>
   </w:abstractNum>
-  <w:abstractNum w:abstractNumId="12" w15:restartNumberingAfterBreak="0">
+  <w:abstractNum w:abstractNumId="12">
     <w:nsid w:val="6E7134A1"/>
     <w:multiLevelType w:val="hybridMultilevel"/>
     <w:tmpl w:val="C082C094"/>
@@ -3612,7 +3242,7 @@
       </w:pPr>
     </w:lvl>
   </w:abstractNum>
-  <w:abstractNum w:abstractNumId="13" w15:restartNumberingAfterBreak="0">
+  <w:abstractNum w:abstractNumId="13">
     <w:nsid w:val="77695AC3"/>
     <w:multiLevelType w:val="hybridMultilevel"/>
     <w:tmpl w:val="30D4B7B2"/>
@@ -3747,7 +3377,7 @@
 </file>
 
 <file path=word/styles.xml><?xml version="1.0" encoding="utf-8"?>
-<w:styles xmlns:mc="http://schemas.openxmlformats.org/markup-compatibility/2006" xmlns:r="http://schemas.openxmlformats.org/officeDocument/2006/relationships" xmlns:w="http://schemas.openxmlformats.org/wordprocessingml/2006/main" xmlns:w14="http://schemas.microsoft.com/office/word/2010/wordml" xmlns:w15="http://schemas.microsoft.com/office/word/2012/wordml" xmlns:w16cex="http://schemas.microsoft.com/office/word/2018/wordml/cex" xmlns:w16cid="http://schemas.microsoft.com/office/word/2016/wordml/cid" xmlns:w16="http://schemas.microsoft.com/office/word/2018/wordml" xmlns:w16sdtdh="http://schemas.microsoft.com/office/word/2020/wordml/sdtdatahash" xmlns:w16se="http://schemas.microsoft.com/office/word/2015/wordml/symex" mc:Ignorable="w14 w15 w16se w16cid w16 w16cex w16sdtdh">
+<w:styles xmlns:mc="http://schemas.openxmlformats.org/markup-compatibility/2006" xmlns:r="http://schemas.openxmlformats.org/officeDocument/2006/relationships" xmlns:w="http://schemas.openxmlformats.org/wordprocessingml/2006/main" xmlns:w14="http://schemas.microsoft.com/office/word/2010/wordml" mc:Ignorable="w14">
   <w:docDefaults>
     <w:rPrDefault>
       <w:rPr>
@@ -3763,350 +3393,282 @@
       </w:pPr>
     </w:pPrDefault>
   </w:docDefaults>
-  <w:latentStyles w:defLockedState="0" w:defUIPriority="0" w:defSemiHidden="0" w:defUnhideWhenUsed="0" w:defQFormat="0" w:count="376">
-    <w:lsdException w:name="index 1" w:semiHidden="1" w:unhideWhenUsed="1"/>
-    <w:lsdException w:name="index 7" w:semiHidden="1" w:unhideWhenUsed="1"/>
-    <w:lsdException w:name="index 8" w:semiHidden="1" w:unhideWhenUsed="1"/>
-    <w:lsdException w:name="index 9" w:semiHidden="1" w:unhideWhenUsed="1"/>
-    <w:lsdException w:name="toc 1" w:semiHidden="1" w:unhideWhenUsed="1"/>
-    <w:lsdException w:name="toc 2" w:semiHidden="1" w:unhideWhenUsed="1"/>
-    <w:lsdException w:name="toc 3" w:semiHidden="1" w:unhideWhenUsed="1"/>
-    <w:lsdException w:name="toc 4" w:semiHidden="1" w:unhideWhenUsed="1"/>
-    <w:lsdException w:name="toc 5" w:semiHidden="1" w:unhideWhenUsed="1"/>
-    <w:lsdException w:name="toc 6" w:semiHidden="1" w:unhideWhenUsed="1"/>
-    <w:lsdException w:name="toc 7" w:semiHidden="1" w:unhideWhenUsed="1"/>
-    <w:lsdException w:name="toc 8" w:semiHidden="1" w:unhideWhenUsed="1"/>
-    <w:lsdException w:name="toc 9" w:semiHidden="1" w:unhideWhenUsed="1"/>
-    <w:lsdException w:name="Normal Indent" w:semiHidden="1" w:unhideWhenUsed="1"/>
-    <w:lsdException w:name="footnote text" w:semiHidden="1" w:unhideWhenUsed="1"/>
-    <w:lsdException w:name="annotation text" w:semiHidden="1" w:unhideWhenUsed="1"/>
-    <w:lsdException w:name="header" w:semiHidden="1" w:uiPriority="99" w:unhideWhenUsed="1"/>
-    <w:lsdException w:name="footer" w:semiHidden="1" w:unhideWhenUsed="1"/>
-    <w:lsdException w:name="index heading" w:semiHidden="1" w:unhideWhenUsed="1"/>
-    <w:lsdException w:name="caption" w:semiHidden="1" w:unhideWhenUsed="1"/>
-    <w:lsdException w:name="table of figures" w:semiHidden="1" w:unhideWhenUsed="1"/>
-    <w:lsdException w:name="envelope address" w:semiHidden="1" w:unhideWhenUsed="1"/>
-    <w:lsdException w:name="envelope return" w:semiHidden="1" w:unhideWhenUsed="1"/>
-    <w:lsdException w:name="footnote reference" w:semiHidden="1" w:unhideWhenUsed="1"/>
-    <w:lsdException w:name="annotation reference" w:semiHidden="1" w:unhideWhenUsed="1"/>
-    <w:lsdException w:name="line number" w:semiHidden="1" w:unhideWhenUsed="1"/>
-    <w:lsdException w:name="page number" w:semiHidden="1" w:unhideWhenUsed="1"/>
-    <w:lsdException w:name="endnote reference" w:semiHidden="1" w:unhideWhenUsed="1"/>
-    <w:lsdException w:name="endnote text" w:semiHidden="1" w:unhideWhenUsed="1"/>
-    <w:lsdException w:name="table of authorities" w:semiHidden="1" w:unhideWhenUsed="1"/>
-    <w:lsdException w:name="macro" w:semiHidden="1" w:unhideWhenUsed="1"/>
-    <w:lsdException w:name="toa heading" w:semiHidden="1" w:unhideWhenUsed="1"/>
-    <w:lsdException w:name="List" w:semiHidden="1" w:unhideWhenUsed="1"/>
-    <w:lsdException w:name="List Bullet" w:semiHidden="1" w:unhideWhenUsed="1"/>
-    <w:lsdException w:name="List Number" w:semiHidden="1" w:unhideWhenUsed="1"/>
-    <w:lsdException w:name="List 2" w:semiHidden="1" w:unhideWhenUsed="1"/>
-    <w:lsdException w:name="List 3" w:semiHidden="1" w:unhideWhenUsed="1"/>
-    <w:lsdException w:name="List 4" w:semiHidden="1" w:unhideWhenUsed="1"/>
-    <w:lsdException w:name="List 5" w:semiHidden="1" w:unhideWhenUsed="1"/>
-    <w:lsdException w:name="List Bullet 2" w:semiHidden="1" w:unhideWhenUsed="1"/>
-    <w:lsdException w:name="List Bullet 3" w:semiHidden="1" w:unhideWhenUsed="1"/>
-    <w:lsdException w:name="List Bullet 4" w:semiHidden="1" w:unhideWhenUsed="1"/>
-    <w:lsdException w:name="List Bullet 5" w:semiHidden="1" w:unhideWhenUsed="1"/>
-    <w:lsdException w:name="List Number 3" w:semiHidden="1" w:unhideWhenUsed="1"/>
-    <w:lsdException w:name="List Number 4" w:semiHidden="1" w:unhideWhenUsed="1"/>
-    <w:lsdException w:name="Closing" w:semiHidden="1" w:unhideWhenUsed="1"/>
-    <w:lsdException w:name="Signature" w:semiHidden="1" w:unhideWhenUsed="1"/>
-    <w:lsdException w:name="Default Paragraph Font" w:semiHidden="1" w:unhideWhenUsed="1"/>
-    <w:lsdException w:name="Body Text" w:semiHidden="1" w:unhideWhenUsed="1" w:qFormat="1"/>
-    <w:lsdException w:name="Body Text Indent" w:semiHidden="1" w:unhideWhenUsed="1"/>
-    <w:lsdException w:name="List Continue" w:semiHidden="1" w:unhideWhenUsed="1"/>
-    <w:lsdException w:name="List Continue 2" w:semiHidden="1" w:unhideWhenUsed="1"/>
-    <w:lsdException w:name="List Continue 3" w:semiHidden="1" w:unhideWhenUsed="1"/>
-    <w:lsdException w:name="List Continue 4" w:semiHidden="1" w:unhideWhenUsed="1"/>
-    <w:lsdException w:name="List Continue 5" w:semiHidden="1" w:unhideWhenUsed="1"/>
-    <w:lsdException w:name="Message Header" w:semiHidden="1" w:unhideWhenUsed="1"/>
-    <w:lsdException w:name="Salutation" w:semiHidden="1" w:unhideWhenUsed="1"/>
-    <w:lsdException w:name="Date" w:semiHidden="1" w:unhideWhenUsed="1"/>
-    <w:lsdException w:name="Body Text First Indent" w:semiHidden="1" w:unhideWhenUsed="1"/>
-    <w:lsdException w:name="Body Text First Indent 2" w:semiHidden="1" w:unhideWhenUsed="1"/>
-    <w:lsdException w:name="Note Heading" w:semiHidden="1" w:unhideWhenUsed="1"/>
-    <w:lsdException w:name="Body Text 2" w:semiHidden="1" w:unhideWhenUsed="1"/>
-    <w:lsdException w:name="Body Text 3" w:semiHidden="1" w:unhideWhenUsed="1"/>
-    <w:lsdException w:name="Body Text Indent 2" w:semiHidden="1" w:unhideWhenUsed="1"/>
-    <w:lsdException w:name="Strong" w:uiPriority="22" w:qFormat="1"/>
-    <w:lsdException w:name="Document Map" w:semiHidden="1" w:unhideWhenUsed="1"/>
-    <w:lsdException w:name="Plain Text" w:semiHidden="1" w:unhideWhenUsed="1"/>
-    <w:lsdException w:name="E-mail Signature" w:semiHidden="1" w:unhideWhenUsed="1"/>
-    <w:lsdException w:name="HTML Top of Form" w:semiHidden="1" w:unhideWhenUsed="1"/>
-    <w:lsdException w:name="HTML Bottom of Form" w:semiHidden="1" w:unhideWhenUsed="1"/>
-    <w:lsdException w:name="Normal (Web)" w:semiHidden="1" w:unhideWhenUsed="1"/>
-    <w:lsdException w:name="HTML Acronym" w:semiHidden="1" w:unhideWhenUsed="1"/>
-    <w:lsdException w:name="HTML Address" w:semiHidden="1" w:unhideWhenUsed="1"/>
-    <w:lsdException w:name="HTML Cite" w:semiHidden="1" w:unhideWhenUsed="1"/>
-    <w:lsdException w:name="HTML Code" w:semiHidden="1" w:uiPriority="99" w:unhideWhenUsed="1"/>
-    <w:lsdException w:name="HTML Definition" w:semiHidden="1" w:unhideWhenUsed="1"/>
-    <w:lsdException w:name="HTML Keyboard" w:semiHidden="1" w:unhideWhenUsed="1"/>
-    <w:lsdException w:name="HTML Preformatted" w:semiHidden="1" w:uiPriority="99" w:unhideWhenUsed="1"/>
-    <w:lsdException w:name="HTML Sample" w:semiHidden="1" w:unhideWhenUsed="1"/>
-    <w:lsdException w:name="HTML Typewriter" w:semiHidden="1" w:unhideWhenUsed="1"/>
-    <w:lsdException w:name="HTML Variable" w:semiHidden="1" w:unhideWhenUsed="1"/>
-    <w:lsdException w:name="Normal Table" w:semiHidden="1" w:unhideWhenUsed="1"/>
-    <w:lsdException w:name="annotation subject" w:semiHidden="1" w:unhideWhenUsed="1"/>
-    <w:lsdException w:name="No List" w:semiHidden="1" w:unhideWhenUsed="1"/>
-    <w:lsdException w:name="Outline List 1" w:semiHidden="1" w:unhideWhenUsed="1"/>
-    <w:lsdException w:name="Outline List 2" w:semiHidden="1" w:unhideWhenUsed="1"/>
-    <w:lsdException w:name="Outline List 3" w:semiHidden="1" w:unhideWhenUsed="1"/>
-    <w:lsdException w:name="Table Simple 1" w:semiHidden="1" w:unhideWhenUsed="1"/>
-    <w:lsdException w:name="Table Simple 2" w:semiHidden="1" w:unhideWhenUsed="1"/>
-    <w:lsdException w:name="Table Simple 3" w:semiHidden="1" w:unhideWhenUsed="1"/>
-    <w:lsdException w:name="Table Classic 1" w:semiHidden="1" w:unhideWhenUsed="1"/>
-    <w:lsdException w:name="Table Classic 2" w:semiHidden="1" w:unhideWhenUsed="1"/>
-    <w:lsdException w:name="Table Classic 3" w:semiHidden="1" w:unhideWhenUsed="1"/>
-    <w:lsdException w:name="Table Classic 4" w:semiHidden="1" w:unhideWhenUsed="1"/>
-    <w:lsdException w:name="Table Colorful 1" w:semiHidden="1" w:unhideWhenUsed="1"/>
-    <w:lsdException w:name="Table Colorful 2" w:semiHidden="1" w:unhideWhenUsed="1"/>
-    <w:lsdException w:name="Table Colorful 3" w:semiHidden="1" w:unhideWhenUsed="1"/>
-    <w:lsdException w:name="Table Columns 1" w:semiHidden="1" w:unhideWhenUsed="1"/>
-    <w:lsdException w:name="Table Columns 2" w:semiHidden="1" w:unhideWhenUsed="1"/>
-    <w:lsdException w:name="Table Columns 3" w:semiHidden="1" w:unhideWhenUsed="1"/>
-    <w:lsdException w:name="Table Columns 4" w:semiHidden="1" w:unhideWhenUsed="1"/>
-    <w:lsdException w:name="Table Columns 5" w:semiHidden="1" w:unhideWhenUsed="1"/>
-    <w:lsdException w:name="Table Grid 1" w:semiHidden="1" w:unhideWhenUsed="1"/>
-    <w:lsdException w:name="Table Grid 2" w:semiHidden="1" w:unhideWhenUsed="1"/>
-    <w:lsdException w:name="Table Grid 3" w:semiHidden="1" w:unhideWhenUsed="1"/>
-    <w:lsdException w:name="Table Grid 4" w:semiHidden="1" w:unhideWhenUsed="1"/>
-    <w:lsdException w:name="Table Grid 5" w:semiHidden="1" w:unhideWhenUsed="1"/>
-    <w:lsdException w:name="Table Grid 6" w:semiHidden="1" w:unhideWhenUsed="1"/>
-    <w:lsdException w:name="Table Grid 7" w:semiHidden="1" w:unhideWhenUsed="1"/>
-    <w:lsdException w:name="Table Grid 8" w:semiHidden="1" w:unhideWhenUsed="1"/>
-    <w:lsdException w:name="Table List 1" w:semiHidden="1" w:unhideWhenUsed="1"/>
-    <w:lsdException w:name="Table List 2" w:semiHidden="1" w:unhideWhenUsed="1"/>
-    <w:lsdException w:name="Table List 3" w:semiHidden="1" w:unhideWhenUsed="1"/>
-    <w:lsdException w:name="Table List 4" w:semiHidden="1" w:unhideWhenUsed="1"/>
-    <w:lsdException w:name="Table List 5" w:semiHidden="1" w:unhideWhenUsed="1"/>
-    <w:lsdException w:name="Table List 6" w:semiHidden="1" w:unhideWhenUsed="1"/>
-    <w:lsdException w:name="Table List 7" w:semiHidden="1" w:unhideWhenUsed="1"/>
-    <w:lsdException w:name="Table List 8" w:semiHidden="1" w:unhideWhenUsed="1"/>
-    <w:lsdException w:name="Table 3D effects 1" w:semiHidden="1" w:unhideWhenUsed="1"/>
-    <w:lsdException w:name="Table 3D effects 2" w:semiHidden="1" w:unhideWhenUsed="1"/>
-    <w:lsdException w:name="Table 3D effects 3" w:semiHidden="1" w:unhideWhenUsed="1"/>
-    <w:lsdException w:name="Table Contemporary" w:semiHidden="1" w:unhideWhenUsed="1"/>
-    <w:lsdException w:name="Table Elegant" w:semiHidden="1" w:unhideWhenUsed="1"/>
-    <w:lsdException w:name="Table Professional" w:semiHidden="1" w:unhideWhenUsed="1"/>
-    <w:lsdException w:name="Table Subtle 1" w:semiHidden="1" w:unhideWhenUsed="1"/>
-    <w:lsdException w:name="Table Subtle 2" w:semiHidden="1" w:unhideWhenUsed="1"/>
-    <w:lsdException w:name="Table Web 1" w:semiHidden="1" w:unhideWhenUsed="1"/>
-    <w:lsdException w:name="Table Web 2" w:semiHidden="1" w:unhideWhenUsed="1"/>
-    <w:lsdException w:name="Table Web 3" w:semiHidden="1" w:unhideWhenUsed="1"/>
-    <w:lsdException w:name="Balloon Text" w:semiHidden="1" w:unhideWhenUsed="1"/>
-    <w:lsdException w:name="Table Theme" w:semiHidden="1" w:unhideWhenUsed="1"/>
-    <w:lsdException w:name="Placeholder Text" w:semiHidden="1"/>
-    <w:lsdException w:name="Light Shading"/>
-    <w:lsdException w:name="Light List"/>
-    <w:lsdException w:name="Light Grid"/>
-    <w:lsdException w:name="Medium Shading 1"/>
-    <w:lsdException w:name="Medium Shading 2"/>
-    <w:lsdException w:name="Medium List 1"/>
-    <w:lsdException w:name="Medium List 2"/>
-    <w:lsdException w:name="Medium Grid 1"/>
-    <w:lsdException w:name="Medium Grid 2"/>
-    <w:lsdException w:name="Medium Grid 3"/>
-    <w:lsdException w:name="Dark List"/>
-    <w:lsdException w:name="Colorful Shading"/>
-    <w:lsdException w:name="Colorful List"/>
-    <w:lsdException w:name="Colorful Grid"/>
-    <w:lsdException w:name="Light Shading Accent 1"/>
-    <w:lsdException w:name="Light List Accent 1"/>
-    <w:lsdException w:name="Light Grid Accent 1"/>
-    <w:lsdException w:name="Medium Shading 1 Accent 1"/>
-    <w:lsdException w:name="Medium Shading 2 Accent 1"/>
-    <w:lsdException w:name="Medium List 1 Accent 1"/>
-    <w:lsdException w:name="Revision" w:semiHidden="1"/>
-    <w:lsdException w:name="Medium List 2 Accent 1"/>
-    <w:lsdException w:name="Medium Grid 1 Accent 1"/>
-    <w:lsdException w:name="Medium Grid 2 Accent 1"/>
-    <w:lsdException w:name="Medium Grid 3 Accent 1"/>
-    <w:lsdException w:name="Dark List Accent 1"/>
-    <w:lsdException w:name="Colorful Shading Accent 1"/>
-    <w:lsdException w:name="Colorful List Accent 1"/>
-    <w:lsdException w:name="Colorful Grid Accent 1"/>
-    <w:lsdException w:name="Light Shading Accent 2"/>
-    <w:lsdException w:name="Light List Accent 2"/>
-    <w:lsdException w:name="Light Grid Accent 2"/>
-    <w:lsdException w:name="Medium Shading 1 Accent 2"/>
-    <w:lsdException w:name="Medium Shading 2 Accent 2"/>
-    <w:lsdException w:name="Medium List 1 Accent 2"/>
-    <w:lsdException w:name="Medium List 2 Accent 2"/>
-    <w:lsdException w:name="Medium Grid 1 Accent 2"/>
-    <w:lsdException w:name="Medium Grid 2 Accent 2"/>
-    <w:lsdException w:name="Medium Grid 3 Accent 2"/>
-    <w:lsdException w:name="Dark List Accent 2"/>
-    <w:lsdException w:name="Colorful Shading Accent 2"/>
-    <w:lsdException w:name="Colorful List Accent 2"/>
-    <w:lsdException w:name="Colorful Grid Accent 2"/>
-    <w:lsdException w:name="Light Shading Accent 3"/>
-    <w:lsdException w:name="Light List Accent 3"/>
-    <w:lsdException w:name="Light Grid Accent 3"/>
-    <w:lsdException w:name="Medium Shading 1 Accent 3"/>
-    <w:lsdException w:name="Medium Shading 2 Accent 3"/>
-    <w:lsdException w:name="Medium List 1 Accent 3"/>
-    <w:lsdException w:name="Medium List 2 Accent 3"/>
-    <w:lsdException w:name="Medium Grid 1 Accent 3"/>
-    <w:lsdException w:name="Medium Grid 2 Accent 3"/>
-    <w:lsdException w:name="Medium Grid 3 Accent 3"/>
-    <w:lsdException w:name="Dark List Accent 3"/>
-    <w:lsdException w:name="Colorful Shading Accent 3"/>
-    <w:lsdException w:name="Colorful List Accent 3"/>
-    <w:lsdException w:name="Colorful Grid Accent 3"/>
-    <w:lsdException w:name="Light Shading Accent 4"/>
-    <w:lsdException w:name="Light List Accent 4"/>
-    <w:lsdException w:name="Light Grid Accent 4"/>
-    <w:lsdException w:name="Medium Shading 1 Accent 4"/>
-    <w:lsdException w:name="Medium Shading 2 Accent 4"/>
-    <w:lsdException w:name="Medium List 1 Accent 4"/>
-    <w:lsdException w:name="Medium List 2 Accent 4"/>
-    <w:lsdException w:name="Medium Grid 1 Accent 4"/>
-    <w:lsdException w:name="Medium Grid 2 Accent 4"/>
-    <w:lsdException w:name="Medium Grid 3 Accent 4"/>
-    <w:lsdException w:name="Dark List Accent 4"/>
-    <w:lsdException w:name="Colorful Shading Accent 4"/>
-    <w:lsdException w:name="Colorful List Accent 4"/>
-    <w:lsdException w:name="Colorful Grid Accent 4"/>
-    <w:lsdException w:name="Light Shading Accent 5"/>
-    <w:lsdException w:name="Light List Accent 5"/>
-    <w:lsdException w:name="Light Grid Accent 5"/>
-    <w:lsdException w:name="Medium Shading 1 Accent 5"/>
-    <w:lsdException w:name="Medium Shading 2 Accent 5"/>
-    <w:lsdException w:name="Medium List 1 Accent 5"/>
-    <w:lsdException w:name="Medium List 2 Accent 5"/>
-    <w:lsdException w:name="Medium Grid 1 Accent 5"/>
-    <w:lsdException w:name="Medium Grid 2 Accent 5"/>
-    <w:lsdException w:name="Medium Grid 3 Accent 5"/>
-    <w:lsdException w:name="Dark List Accent 5"/>
-    <w:lsdException w:name="Colorful Shading Accent 5"/>
-    <w:lsdException w:name="Colorful List Accent 5"/>
-    <w:lsdException w:name="Colorful Grid Accent 5"/>
-    <w:lsdException w:name="Light Shading Accent 6"/>
-    <w:lsdException w:name="Light List Accent 6"/>
-    <w:lsdException w:name="Light Grid Accent 6"/>
-    <w:lsdException w:name="Medium Shading 1 Accent 6"/>
-    <w:lsdException w:name="Medium Shading 2 Accent 6"/>
-    <w:lsdException w:name="Medium List 1 Accent 6"/>
-    <w:lsdException w:name="Medium List 2 Accent 6"/>
-    <w:lsdException w:name="Medium Grid 1 Accent 6"/>
-    <w:lsdException w:name="Medium Grid 2 Accent 6"/>
-    <w:lsdException w:name="Medium Grid 3 Accent 6"/>
-    <w:lsdException w:name="Dark List Accent 6"/>
-    <w:lsdException w:name="Colorful Shading Accent 6"/>
-    <w:lsdException w:name="Colorful List Accent 6"/>
-    <w:lsdException w:name="Colorful Grid Accent 6"/>
-    <w:lsdException w:name="Bibliography" w:semiHidden="1" w:unhideWhenUsed="1"/>
-    <w:lsdException w:name="TOC Heading" w:semiHidden="1" w:unhideWhenUsed="1"/>
-    <w:lsdException w:name="Grid Table 4" w:uiPriority="49"/>
-    <w:lsdException w:name="Grid Table 5 Dark" w:uiPriority="50"/>
-    <w:lsdException w:name="Grid Table 6 Colorful" w:uiPriority="51"/>
-    <w:lsdException w:name="Grid Table 7 Colorful" w:uiPriority="52"/>
-    <w:lsdException w:name="Grid Table 1 Light Accent 1" w:uiPriority="46"/>
-    <w:lsdException w:name="Grid Table 2 Accent 1" w:uiPriority="47"/>
-    <w:lsdException w:name="Grid Table 3 Accent 1" w:uiPriority="48"/>
-    <w:lsdException w:name="Grid Table 4 Accent 1" w:uiPriority="49"/>
-    <w:lsdException w:name="Grid Table 5 Dark Accent 1" w:uiPriority="50"/>
-    <w:lsdException w:name="Grid Table 6 Colorful Accent 1" w:uiPriority="51"/>
-    <w:lsdException w:name="Grid Table 7 Colorful Accent 1" w:uiPriority="52"/>
-    <w:lsdException w:name="Grid Table 1 Light Accent 2" w:uiPriority="46"/>
-    <w:lsdException w:name="Grid Table 2 Accent 2" w:uiPriority="47"/>
-    <w:lsdException w:name="Grid Table 3 Accent 2" w:uiPriority="48"/>
-    <w:lsdException w:name="Grid Table 4 Accent 2" w:uiPriority="49"/>
-    <w:lsdException w:name="Grid Table 5 Dark Accent 2" w:uiPriority="50"/>
-    <w:lsdException w:name="Grid Table 6 Colorful Accent 2" w:uiPriority="51"/>
-    <w:lsdException w:name="Grid Table 7 Colorful Accent 2" w:uiPriority="52"/>
-    <w:lsdException w:name="Grid Table 1 Light Accent 3" w:uiPriority="46"/>
-    <w:lsdException w:name="Grid Table 2 Accent 3" w:uiPriority="47"/>
-    <w:lsdException w:name="Grid Table 3 Accent 3" w:uiPriority="48"/>
-    <w:lsdException w:name="Grid Table 4 Accent 3" w:uiPriority="49"/>
-    <w:lsdException w:name="Grid Table 5 Dark Accent 3" w:uiPriority="50"/>
-    <w:lsdException w:name="Grid Table 6 Colorful Accent 3" w:uiPriority="51"/>
-    <w:lsdException w:name="Grid Table 7 Colorful Accent 3" w:uiPriority="52"/>
-    <w:lsdException w:name="Grid Table 1 Light Accent 4" w:uiPriority="46"/>
-    <w:lsdException w:name="Grid Table 2 Accent 4" w:uiPriority="47"/>
-    <w:lsdException w:name="Grid Table 3 Accent 4" w:uiPriority="48"/>
-    <w:lsdException w:name="Grid Table 4 Accent 4" w:uiPriority="49"/>
-    <w:lsdException w:name="Grid Table 5 Dark Accent 4" w:uiPriority="50"/>
-    <w:lsdException w:name="Grid Table 6 Colorful Accent 4" w:uiPriority="51"/>
-    <w:lsdException w:name="Grid Table 7 Colorful Accent 4" w:uiPriority="52"/>
-    <w:lsdException w:name="Grid Table 1 Light Accent 5" w:uiPriority="46"/>
-    <w:lsdException w:name="Grid Table 2 Accent 5" w:uiPriority="47"/>
-    <w:lsdException w:name="Grid Table 3 Accent 5" w:uiPriority="48"/>
-    <w:lsdException w:name="Grid Table 4 Accent 5" w:uiPriority="49"/>
-    <w:lsdException w:name="Grid Table 5 Dark Accent 5" w:uiPriority="50"/>
-    <w:lsdException w:name="Grid Table 6 Colorful Accent 5" w:uiPriority="51"/>
-    <w:lsdException w:name="Grid Table 7 Colorful Accent 5" w:uiPriority="52"/>
-    <w:lsdException w:name="Grid Table 1 Light Accent 6" w:uiPriority="46"/>
-    <w:lsdException w:name="Grid Table 2 Accent 6" w:uiPriority="47"/>
-    <w:lsdException w:name="Grid Table 3 Accent 6" w:uiPriority="48"/>
-    <w:lsdException w:name="Grid Table 4 Accent 6" w:uiPriority="49"/>
-    <w:lsdException w:name="Grid Table 5 Dark Accent 6" w:uiPriority="50"/>
-    <w:lsdException w:name="Grid Table 6 Colorful Accent 6" w:uiPriority="51"/>
-    <w:lsdException w:name="Grid Table 7 Colorful Accent 6" w:uiPriority="52"/>
-    <w:lsdException w:name="List Table 1 Light" w:uiPriority="46"/>
-    <w:lsdException w:name="List Table 2" w:uiPriority="47"/>
-    <w:lsdException w:name="List Table 3" w:uiPriority="48"/>
-    <w:lsdException w:name="List Table 4" w:uiPriority="49"/>
-    <w:lsdException w:name="List Table 5 Dark" w:uiPriority="50"/>
-    <w:lsdException w:name="List Table 6 Colorful" w:uiPriority="51"/>
-    <w:lsdException w:name="List Table 7 Colorful" w:uiPriority="52"/>
-    <w:lsdException w:name="List Table 1 Light Accent 1" w:uiPriority="46"/>
-    <w:lsdException w:name="List Table 2 Accent 1" w:uiPriority="47"/>
-    <w:lsdException w:name="List Table 3 Accent 1" w:uiPriority="48"/>
-    <w:lsdException w:name="List Table 4 Accent 1" w:uiPriority="49"/>
-    <w:lsdException w:name="List Table 5 Dark Accent 1" w:uiPriority="50"/>
-    <w:lsdException w:name="List Table 6 Colorful Accent 1" w:uiPriority="51"/>
-    <w:lsdException w:name="List Table 7 Colorful Accent 1" w:uiPriority="52"/>
-    <w:lsdException w:name="List Table 1 Light Accent 2" w:uiPriority="46"/>
-    <w:lsdException w:name="List Table 2 Accent 2" w:uiPriority="47"/>
-    <w:lsdException w:name="List Table 3 Accent 2" w:uiPriority="48"/>
-    <w:lsdException w:name="List Table 4 Accent 2" w:uiPriority="49"/>
-    <w:lsdException w:name="List Table 5 Dark Accent 2" w:uiPriority="50"/>
-    <w:lsdException w:name="List Table 6 Colorful Accent 2" w:uiPriority="51"/>
-    <w:lsdException w:name="List Table 7 Colorful Accent 2" w:uiPriority="52"/>
-    <w:lsdException w:name="List Table 1 Light Accent 3" w:uiPriority="46"/>
-    <w:lsdException w:name="List Table 2 Accent 3" w:uiPriority="47"/>
-    <w:lsdException w:name="List Table 3 Accent 3" w:uiPriority="48"/>
-    <w:lsdException w:name="List Table 4 Accent 3" w:uiPriority="49"/>
-    <w:lsdException w:name="List Table 5 Dark Accent 3" w:uiPriority="50"/>
-    <w:lsdException w:name="List Table 6 Colorful Accent 3" w:uiPriority="51"/>
-    <w:lsdException w:name="List Table 7 Colorful Accent 3" w:uiPriority="52"/>
-    <w:lsdException w:name="List Table 1 Light Accent 4" w:uiPriority="46"/>
-    <w:lsdException w:name="List Table 2 Accent 4" w:uiPriority="47"/>
-    <w:lsdException w:name="List Table 3 Accent 4" w:uiPriority="48"/>
-    <w:lsdException w:name="List Table 4 Accent 4" w:uiPriority="49"/>
-    <w:lsdException w:name="List Table 5 Dark Accent 4" w:uiPriority="50"/>
-    <w:lsdException w:name="List Table 6 Colorful Accent 4" w:uiPriority="51"/>
-    <w:lsdException w:name="List Table 7 Colorful Accent 4" w:uiPriority="52"/>
-    <w:lsdException w:name="List Table 1 Light Accent 5" w:uiPriority="46"/>
-    <w:lsdException w:name="List Table 2 Accent 5" w:uiPriority="47"/>
-    <w:lsdException w:name="List Table 3 Accent 5" w:uiPriority="48"/>
-    <w:lsdException w:name="List Table 4 Accent 5" w:uiPriority="49"/>
-    <w:lsdException w:name="List Table 5 Dark Accent 5" w:uiPriority="50"/>
-    <w:lsdException w:name="List Table 6 Colorful Accent 5" w:uiPriority="51"/>
-    <w:lsdException w:name="List Table 7 Colorful Accent 5" w:uiPriority="52"/>
-    <w:lsdException w:name="List Table 1 Light Accent 6" w:uiPriority="46"/>
-    <w:lsdException w:name="List Table 2 Accent 6" w:uiPriority="47"/>
-    <w:lsdException w:name="List Table 3 Accent 6" w:uiPriority="48"/>
-    <w:lsdException w:name="List Table 4 Accent 6" w:uiPriority="49"/>
-    <w:lsdException w:name="List Table 5 Dark Accent 6" w:uiPriority="50"/>
-    <w:lsdException w:name="List Table 6 Colorful Accent 6" w:uiPriority="51"/>
-    <w:lsdException w:name="List Table 7 Colorful Accent 6" w:uiPriority="52"/>
-    <w:lsdException w:name="Mention" w:semiHidden="1" w:uiPriority="99" w:unhideWhenUsed="1"/>
-    <w:lsdException w:name="Smart Hyperlink" w:semiHidden="1" w:uiPriority="99" w:unhideWhenUsed="1"/>
-    <w:lsdException w:name="Hashtag" w:semiHidden="1" w:uiPriority="99" w:unhideWhenUsed="1"/>
-    <w:lsdException w:name="Unresolved Mention" w:semiHidden="1" w:uiPriority="99" w:unhideWhenUsed="1"/>
-    <w:lsdException w:name="Smart Link" w:semiHidden="1" w:uiPriority="99" w:unhideWhenUsed="1"/>
+  <w:latentStyles w:defLockedState="0" w:defUIPriority="0" w:defSemiHidden="1" w:defUnhideWhenUsed="0" w:defQFormat="0" w:count="267">
+    <w:lsdException w:name="Normal" w:semiHidden="0"/>
+    <w:lsdException w:name="heading 1" w:semiHidden="0"/>
+    <w:lsdException w:name="heading 2" w:semiHidden="0"/>
+    <w:lsdException w:name="heading 3" w:semiHidden="0"/>
+    <w:lsdException w:name="heading 4" w:semiHidden="0"/>
+    <w:lsdException w:name="heading 5" w:semiHidden="0"/>
+    <w:lsdException w:name="heading 6" w:semiHidden="0"/>
+    <w:lsdException w:name="heading 7" w:semiHidden="0"/>
+    <w:lsdException w:name="heading 8" w:semiHidden="0"/>
+    <w:lsdException w:name="heading 9" w:semiHidden="0"/>
+    <w:lsdException w:name="index 1" w:unhideWhenUsed="1"/>
+    <w:lsdException w:name="index 2" w:semiHidden="0"/>
+    <w:lsdException w:name="index 3" w:semiHidden="0"/>
+    <w:lsdException w:name="index 4" w:semiHidden="0"/>
+    <w:lsdException w:name="index 5" w:semiHidden="0"/>
+    <w:lsdException w:name="index 6" w:semiHidden="0"/>
+    <w:lsdException w:name="index 7" w:unhideWhenUsed="1"/>
+    <w:lsdException w:name="index 8" w:unhideWhenUsed="1"/>
+    <w:lsdException w:name="index 9" w:unhideWhenUsed="1"/>
+    <w:lsdException w:name="toc 1" w:unhideWhenUsed="1"/>
+    <w:lsdException w:name="toc 2" w:unhideWhenUsed="1"/>
+    <w:lsdException w:name="toc 3" w:unhideWhenUsed="1"/>
+    <w:lsdException w:name="toc 4" w:unhideWhenUsed="1"/>
+    <w:lsdException w:name="toc 5" w:unhideWhenUsed="1"/>
+    <w:lsdException w:name="toc 6" w:unhideWhenUsed="1"/>
+    <w:lsdException w:name="toc 7" w:unhideWhenUsed="1"/>
+    <w:lsdException w:name="toc 8" w:unhideWhenUsed="1"/>
+    <w:lsdException w:name="toc 9" w:unhideWhenUsed="1"/>
+    <w:lsdException w:name="Normal Indent" w:unhideWhenUsed="1"/>
+    <w:lsdException w:name="footnote text" w:unhideWhenUsed="1"/>
+    <w:lsdException w:name="annotation text" w:unhideWhenUsed="1"/>
+    <w:lsdException w:name="header" w:uiPriority="99" w:unhideWhenUsed="1"/>
+    <w:lsdException w:name="footer" w:unhideWhenUsed="1"/>
+    <w:lsdException w:name="index heading" w:unhideWhenUsed="1"/>
+    <w:lsdException w:name="caption" w:unhideWhenUsed="1"/>
+    <w:lsdException w:name="table of figures" w:unhideWhenUsed="1"/>
+    <w:lsdException w:name="envelope address" w:unhideWhenUsed="1"/>
+    <w:lsdException w:name="envelope return" w:unhideWhenUsed="1"/>
+    <w:lsdException w:name="footnote reference" w:unhideWhenUsed="1"/>
+    <w:lsdException w:name="annotation reference" w:unhideWhenUsed="1"/>
+    <w:lsdException w:name="line number" w:unhideWhenUsed="1"/>
+    <w:lsdException w:name="page number" w:unhideWhenUsed="1"/>
+    <w:lsdException w:name="endnote reference" w:unhideWhenUsed="1"/>
+    <w:lsdException w:name="endnote text" w:unhideWhenUsed="1"/>
+    <w:lsdException w:name="table of authorities" w:unhideWhenUsed="1"/>
+    <w:lsdException w:name="macro" w:unhideWhenUsed="1"/>
+    <w:lsdException w:name="toa heading" w:unhideWhenUsed="1"/>
+    <w:lsdException w:name="List" w:unhideWhenUsed="1"/>
+    <w:lsdException w:name="List Bullet" w:unhideWhenUsed="1"/>
+    <w:lsdException w:name="List Number" w:unhideWhenUsed="1"/>
+    <w:lsdException w:name="List 2" w:unhideWhenUsed="1"/>
+    <w:lsdException w:name="List 3" w:unhideWhenUsed="1"/>
+    <w:lsdException w:name="List 4" w:unhideWhenUsed="1"/>
+    <w:lsdException w:name="List 5" w:unhideWhenUsed="1"/>
+    <w:lsdException w:name="List Bullet 2" w:unhideWhenUsed="1"/>
+    <w:lsdException w:name="List Bullet 3" w:unhideWhenUsed="1"/>
+    <w:lsdException w:name="List Bullet 4" w:unhideWhenUsed="1"/>
+    <w:lsdException w:name="List Bullet 5" w:unhideWhenUsed="1"/>
+    <w:lsdException w:name="List Number 2" w:semiHidden="0"/>
+    <w:lsdException w:name="List Number 3" w:unhideWhenUsed="1"/>
+    <w:lsdException w:name="List Number 4" w:unhideWhenUsed="1"/>
+    <w:lsdException w:name="List Number 5" w:semiHidden="0"/>
+    <w:lsdException w:name="Title" w:semiHidden="0"/>
+    <w:lsdException w:name="Closing" w:unhideWhenUsed="1"/>
+    <w:lsdException w:name="Signature" w:unhideWhenUsed="1"/>
+    <w:lsdException w:name="Default Paragraph Font" w:unhideWhenUsed="1"/>
+    <w:lsdException w:name="Body Text" w:unhideWhenUsed="1" w:qFormat="1"/>
+    <w:lsdException w:name="Body Text Indent" w:unhideWhenUsed="1"/>
+    <w:lsdException w:name="List Continue" w:unhideWhenUsed="1"/>
+    <w:lsdException w:name="List Continue 2" w:unhideWhenUsed="1"/>
+    <w:lsdException w:name="List Continue 3" w:unhideWhenUsed="1"/>
+    <w:lsdException w:name="List Continue 4" w:unhideWhenUsed="1"/>
+    <w:lsdException w:name="List Continue 5" w:unhideWhenUsed="1"/>
+    <w:lsdException w:name="Message Header" w:unhideWhenUsed="1"/>
+    <w:lsdException w:name="Subtitle" w:semiHidden="0"/>
+    <w:lsdException w:name="Salutation" w:unhideWhenUsed="1"/>
+    <w:lsdException w:name="Date" w:unhideWhenUsed="1"/>
+    <w:lsdException w:name="Body Text First Indent" w:unhideWhenUsed="1"/>
+    <w:lsdException w:name="Body Text First Indent 2" w:unhideWhenUsed="1"/>
+    <w:lsdException w:name="Note Heading" w:unhideWhenUsed="1"/>
+    <w:lsdException w:name="Body Text 2" w:unhideWhenUsed="1"/>
+    <w:lsdException w:name="Body Text 3" w:unhideWhenUsed="1"/>
+    <w:lsdException w:name="Body Text Indent 2" w:unhideWhenUsed="1"/>
+    <w:lsdException w:name="Body Text Indent 3" w:semiHidden="0"/>
+    <w:lsdException w:name="Block Text" w:semiHidden="0"/>
+    <w:lsdException w:name="Hyperlink" w:semiHidden="0"/>
+    <w:lsdException w:name="FollowedHyperlink" w:semiHidden="0"/>
+    <w:lsdException w:name="Strong" w:semiHidden="0" w:uiPriority="22" w:qFormat="1"/>
+    <w:lsdException w:name="Emphasis" w:semiHidden="0"/>
+    <w:lsdException w:name="Document Map" w:unhideWhenUsed="1"/>
+    <w:lsdException w:name="Plain Text" w:unhideWhenUsed="1"/>
+    <w:lsdException w:name="E-mail Signature" w:unhideWhenUsed="1"/>
+    <w:lsdException w:name="HTML Top of Form" w:unhideWhenUsed="1"/>
+    <w:lsdException w:name="HTML Bottom of Form" w:unhideWhenUsed="1"/>
+    <w:lsdException w:name="Normal (Web)" w:unhideWhenUsed="1"/>
+    <w:lsdException w:name="HTML Acronym" w:unhideWhenUsed="1"/>
+    <w:lsdException w:name="HTML Address" w:unhideWhenUsed="1"/>
+    <w:lsdException w:name="HTML Cite" w:unhideWhenUsed="1"/>
+    <w:lsdException w:name="HTML Code" w:uiPriority="99" w:unhideWhenUsed="1"/>
+    <w:lsdException w:name="HTML Definition" w:unhideWhenUsed="1"/>
+    <w:lsdException w:name="HTML Keyboard" w:unhideWhenUsed="1"/>
+    <w:lsdException w:name="HTML Preformatted" w:uiPriority="99" w:unhideWhenUsed="1"/>
+    <w:lsdException w:name="HTML Sample" w:unhideWhenUsed="1"/>
+    <w:lsdException w:name="HTML Typewriter" w:unhideWhenUsed="1"/>
+    <w:lsdException w:name="HTML Variable" w:unhideWhenUsed="1"/>
+    <w:lsdException w:name="Normal Table" w:unhideWhenUsed="1"/>
+    <w:lsdException w:name="annotation subject" w:unhideWhenUsed="1"/>
+    <w:lsdException w:name="No List" w:unhideWhenUsed="1"/>
+    <w:lsdException w:name="Outline List 1" w:unhideWhenUsed="1"/>
+    <w:lsdException w:name="Outline List 2" w:unhideWhenUsed="1"/>
+    <w:lsdException w:name="Outline List 3" w:unhideWhenUsed="1"/>
+    <w:lsdException w:name="Table Simple 1" w:unhideWhenUsed="1"/>
+    <w:lsdException w:name="Table Simple 2" w:unhideWhenUsed="1"/>
+    <w:lsdException w:name="Table Simple 3" w:unhideWhenUsed="1"/>
+    <w:lsdException w:name="Table Classic 1" w:unhideWhenUsed="1"/>
+    <w:lsdException w:name="Table Classic 2" w:unhideWhenUsed="1"/>
+    <w:lsdException w:name="Table Classic 3" w:unhideWhenUsed="1"/>
+    <w:lsdException w:name="Table Classic 4" w:unhideWhenUsed="1"/>
+    <w:lsdException w:name="Table Colorful 1" w:unhideWhenUsed="1"/>
+    <w:lsdException w:name="Table Colorful 2" w:unhideWhenUsed="1"/>
+    <w:lsdException w:name="Table Colorful 3" w:unhideWhenUsed="1"/>
+    <w:lsdException w:name="Table Columns 1" w:unhideWhenUsed="1"/>
+    <w:lsdException w:name="Table Columns 2" w:unhideWhenUsed="1"/>
+    <w:lsdException w:name="Table Columns 3" w:unhideWhenUsed="1"/>
+    <w:lsdException w:name="Table Columns 4" w:unhideWhenUsed="1"/>
+    <w:lsdException w:name="Table Columns 5" w:unhideWhenUsed="1"/>
+    <w:lsdException w:name="Table Grid 1" w:unhideWhenUsed="1"/>
+    <w:lsdException w:name="Table Grid 2" w:unhideWhenUsed="1"/>
+    <w:lsdException w:name="Table Grid 3" w:unhideWhenUsed="1"/>
+    <w:lsdException w:name="Table Grid 4" w:unhideWhenUsed="1"/>
+    <w:lsdException w:name="Table Grid 5" w:unhideWhenUsed="1"/>
+    <w:lsdException w:name="Table Grid 6" w:unhideWhenUsed="1"/>
+    <w:lsdException w:name="Table Grid 7" w:unhideWhenUsed="1"/>
+    <w:lsdException w:name="Table Grid 8" w:unhideWhenUsed="1"/>
+    <w:lsdException w:name="Table List 1" w:unhideWhenUsed="1"/>
+    <w:lsdException w:name="Table List 2" w:unhideWhenUsed="1"/>
+    <w:lsdException w:name="Table List 3" w:unhideWhenUsed="1"/>
+    <w:lsdException w:name="Table List 4" w:unhideWhenUsed="1"/>
+    <w:lsdException w:name="Table List 5" w:unhideWhenUsed="1"/>
+    <w:lsdException w:name="Table List 6" w:unhideWhenUsed="1"/>
+    <w:lsdException w:name="Table List 7" w:unhideWhenUsed="1"/>
+    <w:lsdException w:name="Table List 8" w:unhideWhenUsed="1"/>
+    <w:lsdException w:name="Table 3D effects 1" w:unhideWhenUsed="1"/>
+    <w:lsdException w:name="Table 3D effects 2" w:unhideWhenUsed="1"/>
+    <w:lsdException w:name="Table 3D effects 3" w:unhideWhenUsed="1"/>
+    <w:lsdException w:name="Table Contemporary" w:unhideWhenUsed="1"/>
+    <w:lsdException w:name="Table Elegant" w:unhideWhenUsed="1"/>
+    <w:lsdException w:name="Table Professional" w:unhideWhenUsed="1"/>
+    <w:lsdException w:name="Table Subtle 1" w:unhideWhenUsed="1"/>
+    <w:lsdException w:name="Table Subtle 2" w:unhideWhenUsed="1"/>
+    <w:lsdException w:name="Table Web 1" w:unhideWhenUsed="1"/>
+    <w:lsdException w:name="Table Web 2" w:unhideWhenUsed="1"/>
+    <w:lsdException w:name="Table Web 3" w:unhideWhenUsed="1"/>
+    <w:lsdException w:name="Balloon Text" w:unhideWhenUsed="1"/>
+    <w:lsdException w:name="Table Grid" w:semiHidden="0"/>
+    <w:lsdException w:name="Table Theme" w:unhideWhenUsed="1"/>
+    <w:lsdException w:name="No Spacing" w:semiHidden="0"/>
+    <w:lsdException w:name="Light Shading" w:semiHidden="0"/>
+    <w:lsdException w:name="Light List" w:semiHidden="0"/>
+    <w:lsdException w:name="Light Grid" w:semiHidden="0"/>
+    <w:lsdException w:name="Medium Shading 1" w:semiHidden="0"/>
+    <w:lsdException w:name="Medium Shading 2" w:semiHidden="0"/>
+    <w:lsdException w:name="Medium List 1" w:semiHidden="0"/>
+    <w:lsdException w:name="Medium List 2" w:semiHidden="0"/>
+    <w:lsdException w:name="Medium Grid 1" w:semiHidden="0"/>
+    <w:lsdException w:name="Medium Grid 2" w:semiHidden="0"/>
+    <w:lsdException w:name="Medium Grid 3" w:semiHidden="0"/>
+    <w:lsdException w:name="Dark List" w:semiHidden="0"/>
+    <w:lsdException w:name="Colorful Shading" w:semiHidden="0"/>
+    <w:lsdException w:name="Colorful List" w:semiHidden="0"/>
+    <w:lsdException w:name="Colorful Grid" w:semiHidden="0"/>
+    <w:lsdException w:name="Light Shading Accent 1" w:semiHidden="0"/>
+    <w:lsdException w:name="Light List Accent 1" w:semiHidden="0"/>
+    <w:lsdException w:name="Light Grid Accent 1" w:semiHidden="0"/>
+    <w:lsdException w:name="Medium Shading 1 Accent 1" w:semiHidden="0"/>
+    <w:lsdException w:name="Medium Shading 2 Accent 1" w:semiHidden="0"/>
+    <w:lsdException w:name="Medium List 1 Accent 1" w:semiHidden="0"/>
+    <w:lsdException w:name="List Paragraph" w:semiHidden="0"/>
+    <w:lsdException w:name="Quote" w:semiHidden="0"/>
+    <w:lsdException w:name="Intense Quote" w:semiHidden="0"/>
+    <w:lsdException w:name="Medium List 2 Accent 1" w:semiHidden="0"/>
+    <w:lsdException w:name="Medium Grid 1 Accent 1" w:semiHidden="0"/>
+    <w:lsdException w:name="Medium Grid 2 Accent 1" w:semiHidden="0"/>
+    <w:lsdException w:name="Medium Grid 3 Accent 1" w:semiHidden="0"/>
+    <w:lsdException w:name="Dark List Accent 1" w:semiHidden="0"/>
+    <w:lsdException w:name="Colorful Shading Accent 1" w:semiHidden="0"/>
+    <w:lsdException w:name="Colorful List Accent 1" w:semiHidden="0"/>
+    <w:lsdException w:name="Colorful Grid Accent 1" w:semiHidden="0"/>
+    <w:lsdException w:name="Light Shading Accent 2" w:semiHidden="0"/>
+    <w:lsdException w:name="Light List Accent 2" w:semiHidden="0"/>
+    <w:lsdException w:name="Light Grid Accent 2" w:semiHidden="0"/>
+    <w:lsdException w:name="Medium Shading 1 Accent 2" w:semiHidden="0"/>
+    <w:lsdException w:name="Medium Shading 2 Accent 2" w:semiHidden="0"/>
+    <w:lsdException w:name="Medium List 1 Accent 2" w:semiHidden="0"/>
+    <w:lsdException w:name="Medium List 2 Accent 2" w:semiHidden="0"/>
+    <w:lsdException w:name="Medium Grid 1 Accent 2" w:semiHidden="0"/>
+    <w:lsdException w:name="Medium Grid 2 Accent 2" w:semiHidden="0"/>
+    <w:lsdException w:name="Medium Grid 3 Accent 2" w:semiHidden="0"/>
+    <w:lsdException w:name="Dark List Accent 2" w:semiHidden="0"/>
+    <w:lsdException w:name="Colorful Shading Accent 2" w:semiHidden="0"/>
+    <w:lsdException w:name="Colorful List Accent 2" w:semiHidden="0"/>
+    <w:lsdException w:name="Colorful Grid Accent 2" w:semiHidden="0"/>
+    <w:lsdException w:name="Light Shading Accent 3" w:semiHidden="0"/>
+    <w:lsdException w:name="Light List Accent 3" w:semiHidden="0"/>
+    <w:lsdException w:name="Light Grid Accent 3" w:semiHidden="0"/>
+    <w:lsdException w:name="Medium Shading 1 Accent 3" w:semiHidden="0"/>
+    <w:lsdException w:name="Medium Shading 2 Accent 3" w:semiHidden="0"/>
+    <w:lsdException w:name="Medium List 1 Accent 3" w:semiHidden="0"/>
+    <w:lsdException w:name="Medium List 2 Accent 3" w:semiHidden="0"/>
+    <w:lsdException w:name="Medium Grid 1 Accent 3" w:semiHidden="0"/>
+    <w:lsdException w:name="Medium Grid 2 Accent 3" w:semiHidden="0"/>
+    <w:lsdException w:name="Medium Grid 3 Accent 3" w:semiHidden="0"/>
+    <w:lsdException w:name="Dark List Accent 3" w:semiHidden="0"/>
+    <w:lsdException w:name="Colorful Shading Accent 3" w:semiHidden="0"/>
+    <w:lsdException w:name="Colorful List Accent 3" w:semiHidden="0"/>
+    <w:lsdException w:name="Colorful Grid Accent 3" w:semiHidden="0"/>
+    <w:lsdException w:name="Light Shading Accent 4" w:semiHidden="0"/>
+    <w:lsdException w:name="Light List Accent 4" w:semiHidden="0"/>
+    <w:lsdException w:name="Light Grid Accent 4" w:semiHidden="0"/>
+    <w:lsdException w:name="Medium Shading 1 Accent 4" w:semiHidden="0"/>
+    <w:lsdException w:name="Medium Shading 2 Accent 4" w:semiHidden="0"/>
+    <w:lsdException w:name="Medium List 1 Accent 4" w:semiHidden="0"/>
+    <w:lsdException w:name="Medium List 2 Accent 4" w:semiHidden="0"/>
+    <w:lsdException w:name="Medium Grid 1 Accent 4" w:semiHidden="0"/>
+    <w:lsdException w:name="Medium Grid 2 Accent 4" w:semiHidden="0"/>
+    <w:lsdException w:name="Medium Grid 3 Accent 4" w:semiHidden="0"/>
+    <w:lsdException w:name="Dark List Accent 4" w:semiHidden="0"/>
+    <w:lsdException w:name="Colorful Shading Accent 4" w:semiHidden="0"/>
+    <w:lsdException w:name="Colorful List Accent 4" w:semiHidden="0"/>
+    <w:lsdException w:name="Colorful Grid Accent 4" w:semiHidden="0"/>
+    <w:lsdException w:name="Light Shading Accent 5" w:semiHidden="0"/>
+    <w:lsdException w:name="Light List Accent 5" w:semiHidden="0"/>
+    <w:lsdException w:name="Light Grid Accent 5" w:semiHidden="0"/>
+    <w:lsdException w:name="Medium Shading 1 Accent 5" w:semiHidden="0"/>
+    <w:lsdException w:name="Medium Shading 2 Accent 5" w:semiHidden="0"/>
+    <w:lsdException w:name="Medium List 1 Accent 5" w:semiHidden="0"/>
+    <w:lsdException w:name="Medium List 2 Accent 5" w:semiHidden="0"/>
+    <w:lsdException w:name="Medium Grid 1 Accent 5" w:semiHidden="0"/>
+    <w:lsdException w:name="Medium Grid 2 Accent 5" w:semiHidden="0"/>
+    <w:lsdException w:name="Medium Grid 3 Accent 5" w:semiHidden="0"/>
+    <w:lsdException w:name="Dark List Accent 5" w:semiHidden="0"/>
+    <w:lsdException w:name="Colorful Shading Accent 5" w:semiHidden="0"/>
+    <w:lsdException w:name="Colorful List Accent 5" w:semiHidden="0"/>
+    <w:lsdException w:name="Colorful Grid Accent 5" w:semiHidden="0"/>
+    <w:lsdException w:name="Light Shading Accent 6" w:semiHidden="0"/>
+    <w:lsdException w:name="Light List Accent 6" w:semiHidden="0"/>
+    <w:lsdException w:name="Light Grid Accent 6" w:semiHidden="0"/>
+    <w:lsdException w:name="Medium Shading 1 Accent 6" w:semiHidden="0"/>
+    <w:lsdException w:name="Medium Shading 2 Accent 6" w:semiHidden="0"/>
+    <w:lsdException w:name="Medium List 1 Accent 6" w:semiHidden="0"/>
+    <w:lsdException w:name="Medium List 2 Accent 6" w:semiHidden="0"/>
+    <w:lsdException w:name="Medium Grid 1 Accent 6" w:semiHidden="0"/>
+    <w:lsdException w:name="Medium Grid 2 Accent 6" w:semiHidden="0"/>
+    <w:lsdException w:name="Medium Grid 3 Accent 6" w:semiHidden="0"/>
+    <w:lsdException w:name="Dark List Accent 6" w:semiHidden="0"/>
+    <w:lsdException w:name="Colorful Shading Accent 6" w:semiHidden="0"/>
+    <w:lsdException w:name="Colorful List Accent 6" w:semiHidden="0"/>
+    <w:lsdException w:name="Colorful Grid Accent 6" w:semiHidden="0"/>
+    <w:lsdException w:name="Subtle Emphasis" w:semiHidden="0"/>
+    <w:lsdException w:name="Intense Emphasis" w:semiHidden="0"/>
+    <w:lsdException w:name="Subtle Reference" w:semiHidden="0"/>
+    <w:lsdException w:name="Intense Reference" w:semiHidden="0"/>
+    <w:lsdException w:name="Book Title" w:semiHidden="0"/>
+    <w:lsdException w:name="Bibliography" w:unhideWhenUsed="1"/>
+    <w:lsdException w:name="TOC Heading" w:unhideWhenUsed="1"/>
   </w:latentStyles>
-  <w:style w:type="paragraph" w:default="1" w:styleId="a">
+  <w:style w:type="paragraph" w:default="1" w:styleId="Normal">
     <w:name w:val="Normal"/>
     <w:qFormat/>
     <w:rsid w:val="008F2235"/>
   </w:style>
-  <w:style w:type="paragraph" w:styleId="1">
+  <w:style w:type="paragraph" w:styleId="Heading1">
     <w:name w:val="heading 1"/>
-    <w:basedOn w:val="a"/>
-    <w:next w:val="a0"/>
+    <w:basedOn w:val="Normal"/>
+    <w:next w:val="BodyText"/>
     <w:uiPriority w:val="9"/>
     <w:qFormat/>
     <w:pPr>
@@ -4124,10 +3686,10 @@
       <w:szCs w:val="32"/>
     </w:rPr>
   </w:style>
-  <w:style w:type="paragraph" w:styleId="2">
+  <w:style w:type="paragraph" w:styleId="Heading2">
     <w:name w:val="heading 2"/>
-    <w:basedOn w:val="a"/>
-    <w:next w:val="a0"/>
+    <w:basedOn w:val="Normal"/>
+    <w:next w:val="BodyText"/>
     <w:uiPriority w:val="9"/>
     <w:unhideWhenUsed/>
     <w:qFormat/>
@@ -4146,10 +3708,10 @@
       <w:szCs w:val="32"/>
     </w:rPr>
   </w:style>
-  <w:style w:type="paragraph" w:styleId="3">
+  <w:style w:type="paragraph" w:styleId="Heading3">
     <w:name w:val="heading 3"/>
-    <w:basedOn w:val="a"/>
-    <w:next w:val="a0"/>
+    <w:basedOn w:val="Normal"/>
+    <w:next w:val="BodyText"/>
     <w:uiPriority w:val="9"/>
     <w:unhideWhenUsed/>
     <w:qFormat/>
@@ -4168,10 +3730,10 @@
       <w:szCs w:val="28"/>
     </w:rPr>
   </w:style>
-  <w:style w:type="paragraph" w:styleId="4">
+  <w:style w:type="paragraph" w:styleId="Heading4">
     <w:name w:val="heading 4"/>
-    <w:basedOn w:val="a"/>
-    <w:next w:val="a0"/>
+    <w:basedOn w:val="Normal"/>
+    <w:next w:val="BodyText"/>
     <w:uiPriority w:val="9"/>
     <w:unhideWhenUsed/>
     <w:qFormat/>
@@ -4188,10 +3750,10 @@
       <w:color w:val="4F81BD" w:themeColor="accent1"/>
     </w:rPr>
   </w:style>
-  <w:style w:type="paragraph" w:styleId="5">
+  <w:style w:type="paragraph" w:styleId="Heading5">
     <w:name w:val="heading 5"/>
-    <w:basedOn w:val="a"/>
-    <w:next w:val="a0"/>
+    <w:basedOn w:val="Normal"/>
+    <w:next w:val="BodyText"/>
     <w:uiPriority w:val="9"/>
     <w:unhideWhenUsed/>
     <w:qFormat/>
@@ -4208,10 +3770,10 @@
       <w:color w:val="4F81BD" w:themeColor="accent1"/>
     </w:rPr>
   </w:style>
-  <w:style w:type="paragraph" w:styleId="6">
+  <w:style w:type="paragraph" w:styleId="Heading6">
     <w:name w:val="heading 6"/>
-    <w:basedOn w:val="a"/>
-    <w:next w:val="a0"/>
+    <w:basedOn w:val="Normal"/>
+    <w:next w:val="BodyText"/>
     <w:uiPriority w:val="9"/>
     <w:unhideWhenUsed/>
     <w:qFormat/>
@@ -4226,10 +3788,10 @@
       <w:color w:val="4F81BD" w:themeColor="accent1"/>
     </w:rPr>
   </w:style>
-  <w:style w:type="paragraph" w:styleId="7">
+  <w:style w:type="paragraph" w:styleId="Heading7">
     <w:name w:val="heading 7"/>
-    <w:basedOn w:val="a"/>
-    <w:next w:val="a0"/>
+    <w:basedOn w:val="Normal"/>
+    <w:next w:val="BodyText"/>
     <w:uiPriority w:val="9"/>
     <w:unhideWhenUsed/>
     <w:qFormat/>
@@ -4244,10 +3806,10 @@
       <w:color w:val="4F81BD" w:themeColor="accent1"/>
     </w:rPr>
   </w:style>
-  <w:style w:type="paragraph" w:styleId="8">
+  <w:style w:type="paragraph" w:styleId="Heading8">
     <w:name w:val="heading 8"/>
-    <w:basedOn w:val="a"/>
-    <w:next w:val="a0"/>
+    <w:basedOn w:val="Normal"/>
+    <w:next w:val="BodyText"/>
     <w:uiPriority w:val="9"/>
     <w:unhideWhenUsed/>
     <w:qFormat/>
@@ -4262,10 +3824,10 @@
       <w:color w:val="4F81BD" w:themeColor="accent1"/>
     </w:rPr>
   </w:style>
-  <w:style w:type="paragraph" w:styleId="9">
+  <w:style w:type="paragraph" w:styleId="Heading9">
     <w:name w:val="heading 9"/>
-    <w:basedOn w:val="a"/>
-    <w:next w:val="a0"/>
+    <w:basedOn w:val="Normal"/>
+    <w:next w:val="BodyText"/>
     <w:uiPriority w:val="9"/>
     <w:unhideWhenUsed/>
     <w:qFormat/>
@@ -4280,13 +3842,13 @@
       <w:color w:val="4F81BD" w:themeColor="accent1"/>
     </w:rPr>
   </w:style>
-  <w:style w:type="character" w:default="1" w:styleId="a1">
+  <w:style w:type="character" w:default="1" w:styleId="DefaultParagraphFont">
     <w:name w:val="Default Paragraph Font"/>
     <w:uiPriority w:val="1"/>
     <w:semiHidden/>
     <w:unhideWhenUsed/>
   </w:style>
-  <w:style w:type="table" w:default="1" w:styleId="a2">
+  <w:style w:type="table" w:default="1" w:styleId="TableNormal">
     <w:name w:val="Normal Table"/>
     <w:uiPriority w:val="99"/>
     <w:semiHidden/>
@@ -4301,16 +3863,16 @@
       </w:tblCellMar>
     </w:tblPr>
   </w:style>
-  <w:style w:type="numbering" w:default="1" w:styleId="a3">
+  <w:style w:type="numbering" w:default="1" w:styleId="NoList">
     <w:name w:val="No List"/>
     <w:uiPriority w:val="99"/>
     <w:semiHidden/>
     <w:unhideWhenUsed/>
   </w:style>
-  <w:style w:type="paragraph" w:styleId="a0">
+  <w:style w:type="paragraph" w:styleId="BodyText">
     <w:name w:val="Body Text"/>
-    <w:basedOn w:val="a"/>
-    <w:link w:val="a4"/>
+    <w:basedOn w:val="Normal"/>
+    <w:link w:val="BodyTextChar"/>
     <w:qFormat/>
     <w:pPr>
       <w:spacing w:before="180" w:after="180"/>
@@ -4318,23 +3880,23 @@
   </w:style>
   <w:style w:type="paragraph" w:customStyle="1" w:styleId="FirstParagraph">
     <w:name w:val="First Paragraph"/>
-    <w:basedOn w:val="a0"/>
-    <w:next w:val="a0"/>
+    <w:basedOn w:val="BodyText"/>
+    <w:next w:val="BodyText"/>
     <w:qFormat/>
   </w:style>
   <w:style w:type="paragraph" w:customStyle="1" w:styleId="Compact">
     <w:name w:val="Compact"/>
-    <w:basedOn w:val="a0"/>
+    <w:basedOn w:val="BodyText"/>
     <w:qFormat/>
     <w:pPr>
       <w:spacing w:before="36" w:after="36"/>
     </w:pPr>
   </w:style>
-  <w:style w:type="paragraph" w:styleId="a5">
+  <w:style w:type="paragraph" w:styleId="Title">
     <w:name w:val="Title"/>
-    <w:basedOn w:val="a"/>
-    <w:next w:val="a0"/>
-    <w:link w:val="a6"/>
+    <w:basedOn w:val="Normal"/>
+    <w:next w:val="BodyText"/>
+    <w:link w:val="TitleChar"/>
     <w:qFormat/>
     <w:pPr>
       <w:keepNext/>
@@ -4351,10 +3913,10 @@
       <w:szCs w:val="36"/>
     </w:rPr>
   </w:style>
-  <w:style w:type="paragraph" w:styleId="a7">
+  <w:style w:type="paragraph" w:styleId="Subtitle">
     <w:name w:val="Subtitle"/>
-    <w:basedOn w:val="a5"/>
-    <w:next w:val="a0"/>
+    <w:basedOn w:val="Title"/>
+    <w:next w:val="BodyText"/>
     <w:qFormat/>
     <w:pPr>
       <w:spacing w:before="240"/>
@@ -4366,7 +3928,7 @@
   </w:style>
   <w:style w:type="paragraph" w:customStyle="1" w:styleId="Author">
     <w:name w:val="Author"/>
-    <w:next w:val="a0"/>
+    <w:next w:val="BodyText"/>
     <w:qFormat/>
     <w:pPr>
       <w:keepNext/>
@@ -4374,9 +3936,9 @@
       <w:jc w:val="center"/>
     </w:pPr>
   </w:style>
-  <w:style w:type="paragraph" w:styleId="a8">
+  <w:style w:type="paragraph" w:styleId="Date">
     <w:name w:val="Date"/>
-    <w:next w:val="a0"/>
+    <w:next w:val="BodyText"/>
     <w:qFormat/>
     <w:pPr>
       <w:keepNext/>
@@ -4386,8 +3948,8 @@
   </w:style>
   <w:style w:type="paragraph" w:customStyle="1" w:styleId="Abstract">
     <w:name w:val="Abstract"/>
-    <w:basedOn w:val="a"/>
-    <w:next w:val="a0"/>
+    <w:basedOn w:val="Normal"/>
+    <w:next w:val="BodyText"/>
     <w:qFormat/>
     <w:pPr>
       <w:keepNext/>
@@ -4399,15 +3961,15 @@
       <w:szCs w:val="20"/>
     </w:rPr>
   </w:style>
-  <w:style w:type="paragraph" w:styleId="a9">
+  <w:style w:type="paragraph" w:styleId="Bibliography">
     <w:name w:val="Bibliography"/>
-    <w:basedOn w:val="a"/>
+    <w:basedOn w:val="Normal"/>
     <w:qFormat/>
   </w:style>
-  <w:style w:type="paragraph" w:styleId="aa">
+  <w:style w:type="paragraph" w:styleId="BlockText">
     <w:name w:val="Block Text"/>
-    <w:basedOn w:val="a0"/>
-    <w:next w:val="a0"/>
+    <w:basedOn w:val="BodyText"/>
+    <w:next w:val="BodyText"/>
     <w:uiPriority w:val="9"/>
     <w:unhideWhenUsed/>
     <w:qFormat/>
@@ -4421,9 +3983,9 @@
       <w:szCs w:val="20"/>
     </w:rPr>
   </w:style>
-  <w:style w:type="paragraph" w:styleId="ab">
+  <w:style w:type="paragraph" w:styleId="FootnoteText">
     <w:name w:val="footnote text"/>
-    <w:basedOn w:val="a"/>
+    <w:basedOn w:val="Normal"/>
     <w:uiPriority w:val="9"/>
     <w:unhideWhenUsed/>
     <w:qFormat/>
@@ -4445,7 +4007,7 @@
   </w:style>
   <w:style w:type="paragraph" w:customStyle="1" w:styleId="DefinitionTerm">
     <w:name w:val="Definition Term"/>
-    <w:basedOn w:val="a"/>
+    <w:basedOn w:val="Normal"/>
     <w:next w:val="Definition"/>
     <w:pPr>
       <w:keepNext/>
@@ -4458,12 +4020,12 @@
   </w:style>
   <w:style w:type="paragraph" w:customStyle="1" w:styleId="Definition">
     <w:name w:val="Definition"/>
-    <w:basedOn w:val="a"/>
-  </w:style>
-  <w:style w:type="paragraph" w:styleId="ac">
+    <w:basedOn w:val="Normal"/>
+  </w:style>
+  <w:style w:type="paragraph" w:styleId="Caption">
     <w:name w:val="caption"/>
-    <w:basedOn w:val="a"/>
-    <w:link w:val="ad"/>
+    <w:basedOn w:val="Normal"/>
+    <w:link w:val="CaptionChar"/>
     <w:pPr>
       <w:spacing w:after="120"/>
     </w:pPr>
@@ -4473,18 +4035,18 @@
   </w:style>
   <w:style w:type="paragraph" w:customStyle="1" w:styleId="TableCaption">
     <w:name w:val="Table Caption"/>
-    <w:basedOn w:val="ac"/>
+    <w:basedOn w:val="Caption"/>
     <w:pPr>
       <w:keepNext/>
     </w:pPr>
   </w:style>
   <w:style w:type="paragraph" w:customStyle="1" w:styleId="ImageCaption">
     <w:name w:val="Image Caption"/>
-    <w:basedOn w:val="ac"/>
+    <w:basedOn w:val="Caption"/>
   </w:style>
   <w:style w:type="paragraph" w:customStyle="1" w:styleId="Figure">
     <w:name w:val="Figure"/>
-    <w:basedOn w:val="a"/>
+    <w:basedOn w:val="Normal"/>
   </w:style>
   <w:style w:type="paragraph" w:customStyle="1" w:styleId="CaptionedFigure">
     <w:name w:val="Captioned Figure"/>
@@ -4493,38 +4055,38 @@
       <w:keepNext/>
     </w:pPr>
   </w:style>
-  <w:style w:type="character" w:customStyle="1" w:styleId="ad">
-    <w:name w:val="כיתוב תו"/>
-    <w:basedOn w:val="a1"/>
-    <w:link w:val="ac"/>
+  <w:style w:type="character" w:customStyle="1" w:styleId="CaptionChar">
+    <w:name w:val="Caption Char"/>
+    <w:basedOn w:val="DefaultParagraphFont"/>
+    <w:link w:val="Caption"/>
   </w:style>
   <w:style w:type="character" w:customStyle="1" w:styleId="VerbatimChar">
     <w:name w:val="Verbatim Char"/>
-    <w:basedOn w:val="ad"/>
+    <w:basedOn w:val="CaptionChar"/>
     <w:link w:val="SourceCode"/>
     <w:rPr>
       <w:rFonts w:ascii="Consolas" w:hAnsi="Consolas"/>
       <w:sz w:val="22"/>
     </w:rPr>
   </w:style>
-  <w:style w:type="character" w:styleId="ae">
+  <w:style w:type="character" w:styleId="FootnoteReference">
     <w:name w:val="footnote reference"/>
-    <w:basedOn w:val="ad"/>
+    <w:basedOn w:val="CaptionChar"/>
     <w:rPr>
       <w:vertAlign w:val="superscript"/>
     </w:rPr>
   </w:style>
   <w:style w:type="character" w:styleId="Hyperlink">
     <w:name w:val="Hyperlink"/>
-    <w:basedOn w:val="ad"/>
+    <w:basedOn w:val="CaptionChar"/>
     <w:rPr>
       <w:color w:val="4F81BD" w:themeColor="accent1"/>
     </w:rPr>
   </w:style>
-  <w:style w:type="paragraph" w:styleId="af">
+  <w:style w:type="paragraph" w:styleId="TOCHeading">
     <w:name w:val="TOC Heading"/>
-    <w:basedOn w:val="1"/>
-    <w:next w:val="a0"/>
+    <w:basedOn w:val="Heading1"/>
+    <w:next w:val="BodyText"/>
     <w:uiPriority w:val="39"/>
     <w:unhideWhenUsed/>
     <w:qFormat/>
@@ -4540,7 +4102,7 @@
   </w:style>
   <w:style w:type="paragraph" w:customStyle="1" w:styleId="SourceCode">
     <w:name w:val="Source Code"/>
-    <w:basedOn w:val="a"/>
+    <w:basedOn w:val="Normal"/>
     <w:link w:val="VerbatimChar"/>
     <w:pPr>
       <w:wordWrap w:val="0"/>
@@ -4834,10 +4396,10 @@
       <w:sz w:val="22"/>
     </w:rPr>
   </w:style>
-  <w:style w:type="paragraph" w:styleId="af0">
+  <w:style w:type="paragraph" w:styleId="Header">
     <w:name w:val="header"/>
-    <w:basedOn w:val="a"/>
-    <w:link w:val="af1"/>
+    <w:basedOn w:val="Normal"/>
+    <w:link w:val="HeaderChar"/>
     <w:uiPriority w:val="99"/>
     <w:unhideWhenUsed/>
     <w:rsid w:val="00E03F2E"/>
@@ -4849,17 +4411,17 @@
       <w:spacing w:after="0"/>
     </w:pPr>
   </w:style>
-  <w:style w:type="character" w:customStyle="1" w:styleId="af1">
-    <w:name w:val="כותרת עליונה תו"/>
-    <w:basedOn w:val="a1"/>
-    <w:link w:val="af0"/>
+  <w:style w:type="character" w:customStyle="1" w:styleId="HeaderChar">
+    <w:name w:val="Header Char"/>
+    <w:basedOn w:val="DefaultParagraphFont"/>
+    <w:link w:val="Header"/>
     <w:uiPriority w:val="99"/>
     <w:rsid w:val="00E03F2E"/>
   </w:style>
-  <w:style w:type="paragraph" w:styleId="af2">
+  <w:style w:type="paragraph" w:styleId="Footer">
     <w:name w:val="footer"/>
-    <w:basedOn w:val="a"/>
-    <w:link w:val="af3"/>
+    <w:basedOn w:val="Normal"/>
+    <w:link w:val="FooterChar"/>
     <w:unhideWhenUsed/>
     <w:rsid w:val="00E03F2E"/>
     <w:pPr>
@@ -4870,34 +4432,34 @@
       <w:spacing w:after="0"/>
     </w:pPr>
   </w:style>
-  <w:style w:type="character" w:customStyle="1" w:styleId="af3">
-    <w:name w:val="כותרת תחתונה תו"/>
-    <w:basedOn w:val="a1"/>
-    <w:link w:val="af2"/>
+  <w:style w:type="character" w:customStyle="1" w:styleId="FooterChar">
+    <w:name w:val="Footer Char"/>
+    <w:basedOn w:val="DefaultParagraphFont"/>
+    <w:link w:val="Footer"/>
     <w:rsid w:val="00E03F2E"/>
   </w:style>
-  <w:style w:type="character" w:styleId="af4">
+  <w:style w:type="character" w:styleId="PlaceholderText">
     <w:name w:val="Placeholder Text"/>
-    <w:basedOn w:val="a1"/>
+    <w:basedOn w:val="DefaultParagraphFont"/>
     <w:semiHidden/>
     <w:rsid w:val="000F272C"/>
     <w:rPr>
       <w:color w:val="808080"/>
     </w:rPr>
   </w:style>
-  <w:style w:type="paragraph" w:styleId="af5">
+  <w:style w:type="paragraph" w:styleId="ListParagraph">
     <w:name w:val="List Paragraph"/>
-    <w:basedOn w:val="a"/>
+    <w:basedOn w:val="Normal"/>
     <w:rsid w:val="00F502DB"/>
     <w:pPr>
       <w:ind w:left="720"/>
       <w:contextualSpacing/>
     </w:pPr>
   </w:style>
-  <w:style w:type="character" w:customStyle="1" w:styleId="a4">
-    <w:name w:val="גוף טקסט תו"/>
-    <w:basedOn w:val="a1"/>
-    <w:link w:val="a0"/>
+  <w:style w:type="character" w:customStyle="1" w:styleId="BodyTextChar">
+    <w:name w:val="Body Text Char"/>
+    <w:basedOn w:val="DefaultParagraphFont"/>
+    <w:link w:val="BodyText"/>
     <w:rsid w:val="006D4B55"/>
   </w:style>
   <w:style w:type="paragraph" w:customStyle="1" w:styleId="TiMiHeading1">
@@ -4948,10 +4510,10 @@
       <w:lang w:bidi="he-IL"/>
     </w:rPr>
   </w:style>
-  <w:style w:type="character" w:customStyle="1" w:styleId="a6">
-    <w:name w:val="כותרת טקסט תו"/>
-    <w:basedOn w:val="a1"/>
-    <w:link w:val="a5"/>
+  <w:style w:type="character" w:customStyle="1" w:styleId="TitleChar">
+    <w:name w:val="Title Char"/>
+    <w:basedOn w:val="DefaultParagraphFont"/>
+    <w:link w:val="Title"/>
     <w:rsid w:val="00887BB1"/>
     <w:rPr>
       <w:rFonts w:asciiTheme="majorHAnsi" w:eastAsiaTheme="majorEastAsia" w:hAnsiTheme="majorHAnsi" w:cstheme="majorBidi"/>
@@ -4962,14 +4524,15 @@
       <w:szCs w:val="36"/>
     </w:rPr>
   </w:style>
-  <w:style w:type="table" w:styleId="af6">
+  <w:style w:type="table" w:styleId="TableGrid">
     <w:name w:val="Table Grid"/>
-    <w:basedOn w:val="a2"/>
+    <w:basedOn w:val="TableNormal"/>
     <w:rsid w:val="00A91917"/>
     <w:pPr>
       <w:spacing w:after="0"/>
     </w:pPr>
     <w:tblPr>
+      <w:tblInd w:w="0" w:type="dxa"/>
       <w:tblBorders>
         <w:top w:val="single" w:sz="4" w:space="0" w:color="auto"/>
         <w:left w:val="single" w:sz="4" w:space="0" w:color="auto"/>
@@ -4978,11 +4541,17 @@
         <w:insideH w:val="single" w:sz="4" w:space="0" w:color="auto"/>
         <w:insideV w:val="single" w:sz="4" w:space="0" w:color="auto"/>
       </w:tblBorders>
+      <w:tblCellMar>
+        <w:top w:w="0" w:type="dxa"/>
+        <w:left w:w="108" w:type="dxa"/>
+        <w:bottom w:w="0" w:type="dxa"/>
+        <w:right w:w="108" w:type="dxa"/>
+      </w:tblCellMar>
     </w:tblPr>
   </w:style>
   <w:style w:type="paragraph" w:customStyle="1" w:styleId="whitespace-normal">
     <w:name w:val="whitespace-normal"/>
-    <w:basedOn w:val="a"/>
+    <w:basedOn w:val="Normal"/>
     <w:rsid w:val="00664D04"/>
     <w:pPr>
       <w:spacing w:before="100" w:beforeAutospacing="1" w:after="100" w:afterAutospacing="1"/>
@@ -4992,9 +4561,9 @@
       <w:lang w:bidi="he-IL"/>
     </w:rPr>
   </w:style>
-  <w:style w:type="character" w:styleId="af7">
+  <w:style w:type="character" w:styleId="Strong">
     <w:name w:val="Strong"/>
-    <w:basedOn w:val="a1"/>
+    <w:basedOn w:val="DefaultParagraphFont"/>
     <w:uiPriority w:val="22"/>
     <w:qFormat/>
     <w:rsid w:val="00F73442"/>
@@ -5005,7 +4574,7 @@
   </w:style>
   <w:style w:type="paragraph" w:customStyle="1" w:styleId="font-claude-response-body">
     <w:name w:val="font-claude-response-body"/>
-    <w:basedOn w:val="a"/>
+    <w:basedOn w:val="Normal"/>
     <w:rsid w:val="00EA1773"/>
     <w:pPr>
       <w:spacing w:before="100" w:beforeAutospacing="1" w:after="100" w:afterAutospacing="1"/>
@@ -5015,10 +4584,10 @@
       <w:lang w:bidi="he-IL"/>
     </w:rPr>
   </w:style>
-  <w:style w:type="paragraph" w:styleId="HTML">
+  <w:style w:type="paragraph" w:styleId="HTMLPreformatted">
     <w:name w:val="HTML Preformatted"/>
-    <w:basedOn w:val="a"/>
-    <w:link w:val="HTML0"/>
+    <w:basedOn w:val="Normal"/>
+    <w:link w:val="HTMLPreformattedChar"/>
     <w:uiPriority w:val="99"/>
     <w:semiHidden/>
     <w:unhideWhenUsed/>
@@ -5051,10 +4620,10 @@
       <w:lang w:bidi="he-IL"/>
     </w:rPr>
   </w:style>
-  <w:style w:type="character" w:customStyle="1" w:styleId="HTML0">
-    <w:name w:val="HTML מעוצב מראש תו"/>
-    <w:basedOn w:val="a1"/>
-    <w:link w:val="HTML"/>
+  <w:style w:type="character" w:customStyle="1" w:styleId="HTMLPreformattedChar">
+    <w:name w:val="HTML Preformatted Char"/>
+    <w:basedOn w:val="DefaultParagraphFont"/>
+    <w:link w:val="HTMLPreformatted"/>
     <w:uiPriority w:val="99"/>
     <w:semiHidden/>
     <w:rsid w:val="00415DC5"/>
@@ -5067,7 +4636,1281 @@
   </w:style>
   <w:style w:type="character" w:styleId="HTMLCode">
     <w:name w:val="HTML Code"/>
-    <w:basedOn w:val="a1"/>
+    <w:basedOn w:val="DefaultParagraphFont"/>
+    <w:uiPriority w:val="99"/>
+    <w:semiHidden/>
+    <w:unhideWhenUsed/>
+    <w:rsid w:val="00415DC5"/>
+    <w:rPr>
+      <w:rFonts w:ascii="Courier New" w:eastAsia="Times New Roman" w:hAnsi="Courier New" w:cs="Courier New"/>
+      <w:sz w:val="20"/>
+      <w:szCs w:val="20"/>
+    </w:rPr>
+  </w:style>
+</w:styles>
+</file>
+
+<file path=word/stylesWithEffects.xml><?xml version="1.0" encoding="utf-8"?>
+<w:styles xmlns:wpc="http://schemas.microsoft.com/office/word/2010/wordprocessingCanvas" xmlns:mc="http://schemas.openxmlformats.org/markup-compatibility/2006" xmlns:o="urn:schemas-microsoft-com:office:office" xmlns:r="http://schemas.openxmlformats.org/officeDocument/2006/relationships" xmlns:m="http://schemas.openxmlformats.org/officeDocument/2006/math" xmlns:v="urn:schemas-microsoft-com:vml" xmlns:wp14="http://schemas.microsoft.com/office/word/2010/wordprocessingDrawing" xmlns:wp="http://schemas.openxmlformats.org/drawingml/2006/wordprocessingDrawing" xmlns:w10="urn:schemas-microsoft-com:office:word" xmlns:w="http://schemas.openxmlformats.org/wordprocessingml/2006/main" xmlns:w14="http://schemas.microsoft.com/office/word/2010/wordml" xmlns:wpg="http://schemas.microsoft.com/office/word/2010/wordprocessingGroup" xmlns:wpi="http://schemas.microsoft.com/office/word/2010/wordprocessingInk" xmlns:wne="http://schemas.microsoft.com/office/word/2006/wordml" xmlns:wps="http://schemas.microsoft.com/office/word/2010/wordprocessingShape" mc:Ignorable="w14 wp14">
+  <w:docDefaults>
+    <w:rPrDefault>
+      <w:rPr>
+        <w:rFonts w:asciiTheme="minorHAnsi" w:eastAsiaTheme="minorHAnsi" w:hAnsiTheme="minorHAnsi" w:cstheme="minorBidi"/>
+        <w:sz w:val="24"/>
+        <w:szCs w:val="24"/>
+        <w:lang w:val="en-US" w:eastAsia="en-US" w:bidi="ar-SA"/>
+      </w:rPr>
+    </w:rPrDefault>
+    <w:pPrDefault>
+      <w:pPr>
+        <w:spacing w:after="200"/>
+      </w:pPr>
+    </w:pPrDefault>
+  </w:docDefaults>
+  <w:latentStyles w:defLockedState="0" w:defUIPriority="0" w:defSemiHidden="1" w:defUnhideWhenUsed="0" w:defQFormat="0" w:count="267">
+    <w:lsdException w:name="Normal" w:semiHidden="0"/>
+    <w:lsdException w:name="heading 1" w:semiHidden="0"/>
+    <w:lsdException w:name="heading 2" w:semiHidden="0"/>
+    <w:lsdException w:name="heading 3" w:semiHidden="0"/>
+    <w:lsdException w:name="heading 4" w:semiHidden="0"/>
+    <w:lsdException w:name="heading 5" w:semiHidden="0"/>
+    <w:lsdException w:name="heading 6" w:semiHidden="0"/>
+    <w:lsdException w:name="heading 7" w:semiHidden="0"/>
+    <w:lsdException w:name="heading 8" w:semiHidden="0"/>
+    <w:lsdException w:name="heading 9" w:semiHidden="0"/>
+    <w:lsdException w:name="index 1" w:unhideWhenUsed="1"/>
+    <w:lsdException w:name="index 2" w:semiHidden="0"/>
+    <w:lsdException w:name="index 3" w:semiHidden="0"/>
+    <w:lsdException w:name="index 4" w:semiHidden="0"/>
+    <w:lsdException w:name="index 5" w:semiHidden="0"/>
+    <w:lsdException w:name="index 6" w:semiHidden="0"/>
+    <w:lsdException w:name="index 7" w:unhideWhenUsed="1"/>
+    <w:lsdException w:name="index 8" w:unhideWhenUsed="1"/>
+    <w:lsdException w:name="index 9" w:unhideWhenUsed="1"/>
+    <w:lsdException w:name="toc 1" w:unhideWhenUsed="1"/>
+    <w:lsdException w:name="toc 2" w:unhideWhenUsed="1"/>
+    <w:lsdException w:name="toc 3" w:unhideWhenUsed="1"/>
+    <w:lsdException w:name="toc 4" w:unhideWhenUsed="1"/>
+    <w:lsdException w:name="toc 5" w:unhideWhenUsed="1"/>
+    <w:lsdException w:name="toc 6" w:unhideWhenUsed="1"/>
+    <w:lsdException w:name="toc 7" w:unhideWhenUsed="1"/>
+    <w:lsdException w:name="toc 8" w:unhideWhenUsed="1"/>
+    <w:lsdException w:name="toc 9" w:unhideWhenUsed="1"/>
+    <w:lsdException w:name="Normal Indent" w:unhideWhenUsed="1"/>
+    <w:lsdException w:name="footnote text" w:unhideWhenUsed="1"/>
+    <w:lsdException w:name="annotation text" w:unhideWhenUsed="1"/>
+    <w:lsdException w:name="header" w:uiPriority="99" w:unhideWhenUsed="1"/>
+    <w:lsdException w:name="footer" w:unhideWhenUsed="1"/>
+    <w:lsdException w:name="index heading" w:unhideWhenUsed="1"/>
+    <w:lsdException w:name="caption" w:unhideWhenUsed="1"/>
+    <w:lsdException w:name="table of figures" w:unhideWhenUsed="1"/>
+    <w:lsdException w:name="envelope address" w:unhideWhenUsed="1"/>
+    <w:lsdException w:name="envelope return" w:unhideWhenUsed="1"/>
+    <w:lsdException w:name="footnote reference" w:unhideWhenUsed="1"/>
+    <w:lsdException w:name="annotation reference" w:unhideWhenUsed="1"/>
+    <w:lsdException w:name="line number" w:unhideWhenUsed="1"/>
+    <w:lsdException w:name="page number" w:unhideWhenUsed="1"/>
+    <w:lsdException w:name="endnote reference" w:unhideWhenUsed="1"/>
+    <w:lsdException w:name="endnote text" w:unhideWhenUsed="1"/>
+    <w:lsdException w:name="table of authorities" w:unhideWhenUsed="1"/>
+    <w:lsdException w:name="macro" w:unhideWhenUsed="1"/>
+    <w:lsdException w:name="toa heading" w:unhideWhenUsed="1"/>
+    <w:lsdException w:name="List" w:unhideWhenUsed="1"/>
+    <w:lsdException w:name="List Bullet" w:unhideWhenUsed="1"/>
+    <w:lsdException w:name="List Number" w:unhideWhenUsed="1"/>
+    <w:lsdException w:name="List 2" w:unhideWhenUsed="1"/>
+    <w:lsdException w:name="List 3" w:unhideWhenUsed="1"/>
+    <w:lsdException w:name="List 4" w:unhideWhenUsed="1"/>
+    <w:lsdException w:name="List 5" w:unhideWhenUsed="1"/>
+    <w:lsdException w:name="List Bullet 2" w:unhideWhenUsed="1"/>
+    <w:lsdException w:name="List Bullet 3" w:unhideWhenUsed="1"/>
+    <w:lsdException w:name="List Bullet 4" w:unhideWhenUsed="1"/>
+    <w:lsdException w:name="List Bullet 5" w:unhideWhenUsed="1"/>
+    <w:lsdException w:name="List Number 2" w:semiHidden="0"/>
+    <w:lsdException w:name="List Number 3" w:unhideWhenUsed="1"/>
+    <w:lsdException w:name="List Number 4" w:unhideWhenUsed="1"/>
+    <w:lsdException w:name="List Number 5" w:semiHidden="0"/>
+    <w:lsdException w:name="Title" w:semiHidden="0"/>
+    <w:lsdException w:name="Closing" w:unhideWhenUsed="1"/>
+    <w:lsdException w:name="Signature" w:unhideWhenUsed="1"/>
+    <w:lsdException w:name="Default Paragraph Font" w:unhideWhenUsed="1"/>
+    <w:lsdException w:name="Body Text" w:unhideWhenUsed="1" w:qFormat="1"/>
+    <w:lsdException w:name="Body Text Indent" w:unhideWhenUsed="1"/>
+    <w:lsdException w:name="List Continue" w:unhideWhenUsed="1"/>
+    <w:lsdException w:name="List Continue 2" w:unhideWhenUsed="1"/>
+    <w:lsdException w:name="List Continue 3" w:unhideWhenUsed="1"/>
+    <w:lsdException w:name="List Continue 4" w:unhideWhenUsed="1"/>
+    <w:lsdException w:name="List Continue 5" w:unhideWhenUsed="1"/>
+    <w:lsdException w:name="Message Header" w:unhideWhenUsed="1"/>
+    <w:lsdException w:name="Subtitle" w:semiHidden="0"/>
+    <w:lsdException w:name="Salutation" w:unhideWhenUsed="1"/>
+    <w:lsdException w:name="Date" w:unhideWhenUsed="1"/>
+    <w:lsdException w:name="Body Text First Indent" w:unhideWhenUsed="1"/>
+    <w:lsdException w:name="Body Text First Indent 2" w:unhideWhenUsed="1"/>
+    <w:lsdException w:name="Note Heading" w:unhideWhenUsed="1"/>
+    <w:lsdException w:name="Body Text 2" w:unhideWhenUsed="1"/>
+    <w:lsdException w:name="Body Text 3" w:unhideWhenUsed="1"/>
+    <w:lsdException w:name="Body Text Indent 2" w:unhideWhenUsed="1"/>
+    <w:lsdException w:name="Body Text Indent 3" w:semiHidden="0"/>
+    <w:lsdException w:name="Block Text" w:semiHidden="0"/>
+    <w:lsdException w:name="Hyperlink" w:semiHidden="0"/>
+    <w:lsdException w:name="FollowedHyperlink" w:semiHidden="0"/>
+    <w:lsdException w:name="Strong" w:semiHidden="0" w:uiPriority="22" w:qFormat="1"/>
+    <w:lsdException w:name="Emphasis" w:semiHidden="0"/>
+    <w:lsdException w:name="Document Map" w:unhideWhenUsed="1"/>
+    <w:lsdException w:name="Plain Text" w:unhideWhenUsed="1"/>
+    <w:lsdException w:name="E-mail Signature" w:unhideWhenUsed="1"/>
+    <w:lsdException w:name="HTML Top of Form" w:unhideWhenUsed="1"/>
+    <w:lsdException w:name="HTML Bottom of Form" w:unhideWhenUsed="1"/>
+    <w:lsdException w:name="Normal (Web)" w:unhideWhenUsed="1"/>
+    <w:lsdException w:name="HTML Acronym" w:unhideWhenUsed="1"/>
+    <w:lsdException w:name="HTML Address" w:unhideWhenUsed="1"/>
+    <w:lsdException w:name="HTML Cite" w:unhideWhenUsed="1"/>
+    <w:lsdException w:name="HTML Code" w:uiPriority="99" w:unhideWhenUsed="1"/>
+    <w:lsdException w:name="HTML Definition" w:unhideWhenUsed="1"/>
+    <w:lsdException w:name="HTML Keyboard" w:unhideWhenUsed="1"/>
+    <w:lsdException w:name="HTML Preformatted" w:uiPriority="99" w:unhideWhenUsed="1"/>
+    <w:lsdException w:name="HTML Sample" w:unhideWhenUsed="1"/>
+    <w:lsdException w:name="HTML Typewriter" w:unhideWhenUsed="1"/>
+    <w:lsdException w:name="HTML Variable" w:unhideWhenUsed="1"/>
+    <w:lsdException w:name="Normal Table" w:unhideWhenUsed="1"/>
+    <w:lsdException w:name="annotation subject" w:unhideWhenUsed="1"/>
+    <w:lsdException w:name="No List" w:unhideWhenUsed="1"/>
+    <w:lsdException w:name="Outline List 1" w:unhideWhenUsed="1"/>
+    <w:lsdException w:name="Outline List 2" w:unhideWhenUsed="1"/>
+    <w:lsdException w:name="Outline List 3" w:unhideWhenUsed="1"/>
+    <w:lsdException w:name="Table Simple 1" w:unhideWhenUsed="1"/>
+    <w:lsdException w:name="Table Simple 2" w:unhideWhenUsed="1"/>
+    <w:lsdException w:name="Table Simple 3" w:unhideWhenUsed="1"/>
+    <w:lsdException w:name="Table Classic 1" w:unhideWhenUsed="1"/>
+    <w:lsdException w:name="Table Classic 2" w:unhideWhenUsed="1"/>
+    <w:lsdException w:name="Table Classic 3" w:unhideWhenUsed="1"/>
+    <w:lsdException w:name="Table Classic 4" w:unhideWhenUsed="1"/>
+    <w:lsdException w:name="Table Colorful 1" w:unhideWhenUsed="1"/>
+    <w:lsdException w:name="Table Colorful 2" w:unhideWhenUsed="1"/>
+    <w:lsdException w:name="Table Colorful 3" w:unhideWhenUsed="1"/>
+    <w:lsdException w:name="Table Columns 1" w:unhideWhenUsed="1"/>
+    <w:lsdException w:name="Table Columns 2" w:unhideWhenUsed="1"/>
+    <w:lsdException w:name="Table Columns 3" w:unhideWhenUsed="1"/>
+    <w:lsdException w:name="Table Columns 4" w:unhideWhenUsed="1"/>
+    <w:lsdException w:name="Table Columns 5" w:unhideWhenUsed="1"/>
+    <w:lsdException w:name="Table Grid 1" w:unhideWhenUsed="1"/>
+    <w:lsdException w:name="Table Grid 2" w:unhideWhenUsed="1"/>
+    <w:lsdException w:name="Table Grid 3" w:unhideWhenUsed="1"/>
+    <w:lsdException w:name="Table Grid 4" w:unhideWhenUsed="1"/>
+    <w:lsdException w:name="Table Grid 5" w:unhideWhenUsed="1"/>
+    <w:lsdException w:name="Table Grid 6" w:unhideWhenUsed="1"/>
+    <w:lsdException w:name="Table Grid 7" w:unhideWhenUsed="1"/>
+    <w:lsdException w:name="Table Grid 8" w:unhideWhenUsed="1"/>
+    <w:lsdException w:name="Table List 1" w:unhideWhenUsed="1"/>
+    <w:lsdException w:name="Table List 2" w:unhideWhenUsed="1"/>
+    <w:lsdException w:name="Table List 3" w:unhideWhenUsed="1"/>
+    <w:lsdException w:name="Table List 4" w:unhideWhenUsed="1"/>
+    <w:lsdException w:name="Table List 5" w:unhideWhenUsed="1"/>
+    <w:lsdException w:name="Table List 6" w:unhideWhenUsed="1"/>
+    <w:lsdException w:name="Table List 7" w:unhideWhenUsed="1"/>
+    <w:lsdException w:name="Table List 8" w:unhideWhenUsed="1"/>
+    <w:lsdException w:name="Table 3D effects 1" w:unhideWhenUsed="1"/>
+    <w:lsdException w:name="Table 3D effects 2" w:unhideWhenUsed="1"/>
+    <w:lsdException w:name="Table 3D effects 3" w:unhideWhenUsed="1"/>
+    <w:lsdException w:name="Table Contemporary" w:unhideWhenUsed="1"/>
+    <w:lsdException w:name="Table Elegant" w:unhideWhenUsed="1"/>
+    <w:lsdException w:name="Table Professional" w:unhideWhenUsed="1"/>
+    <w:lsdException w:name="Table Subtle 1" w:unhideWhenUsed="1"/>
+    <w:lsdException w:name="Table Subtle 2" w:unhideWhenUsed="1"/>
+    <w:lsdException w:name="Table Web 1" w:unhideWhenUsed="1"/>
+    <w:lsdException w:name="Table Web 2" w:unhideWhenUsed="1"/>
+    <w:lsdException w:name="Table Web 3" w:unhideWhenUsed="1"/>
+    <w:lsdException w:name="Balloon Text" w:unhideWhenUsed="1"/>
+    <w:lsdException w:name="Table Grid" w:semiHidden="0"/>
+    <w:lsdException w:name="Table Theme" w:unhideWhenUsed="1"/>
+    <w:lsdException w:name="No Spacing" w:semiHidden="0"/>
+    <w:lsdException w:name="Light Shading" w:semiHidden="0"/>
+    <w:lsdException w:name="Light List" w:semiHidden="0"/>
+    <w:lsdException w:name="Light Grid" w:semiHidden="0"/>
+    <w:lsdException w:name="Medium Shading 1" w:semiHidden="0"/>
+    <w:lsdException w:name="Medium Shading 2" w:semiHidden="0"/>
+    <w:lsdException w:name="Medium List 1" w:semiHidden="0"/>
+    <w:lsdException w:name="Medium List 2" w:semiHidden="0"/>
+    <w:lsdException w:name="Medium Grid 1" w:semiHidden="0"/>
+    <w:lsdException w:name="Medium Grid 2" w:semiHidden="0"/>
+    <w:lsdException w:name="Medium Grid 3" w:semiHidden="0"/>
+    <w:lsdException w:name="Dark List" w:semiHidden="0"/>
+    <w:lsdException w:name="Colorful Shading" w:semiHidden="0"/>
+    <w:lsdException w:name="Colorful List" w:semiHidden="0"/>
+    <w:lsdException w:name="Colorful Grid" w:semiHidden="0"/>
+    <w:lsdException w:name="Light Shading Accent 1" w:semiHidden="0"/>
+    <w:lsdException w:name="Light List Accent 1" w:semiHidden="0"/>
+    <w:lsdException w:name="Light Grid Accent 1" w:semiHidden="0"/>
+    <w:lsdException w:name="Medium Shading 1 Accent 1" w:semiHidden="0"/>
+    <w:lsdException w:name="Medium Shading 2 Accent 1" w:semiHidden="0"/>
+    <w:lsdException w:name="Medium List 1 Accent 1" w:semiHidden="0"/>
+    <w:lsdException w:name="List Paragraph" w:semiHidden="0"/>
+    <w:lsdException w:name="Quote" w:semiHidden="0"/>
+    <w:lsdException w:name="Intense Quote" w:semiHidden="0"/>
+    <w:lsdException w:name="Medium List 2 Accent 1" w:semiHidden="0"/>
+    <w:lsdException w:name="Medium Grid 1 Accent 1" w:semiHidden="0"/>
+    <w:lsdException w:name="Medium Grid 2 Accent 1" w:semiHidden="0"/>
+    <w:lsdException w:name="Medium Grid 3 Accent 1" w:semiHidden="0"/>
+    <w:lsdException w:name="Dark List Accent 1" w:semiHidden="0"/>
+    <w:lsdException w:name="Colorful Shading Accent 1" w:semiHidden="0"/>
+    <w:lsdException w:name="Colorful List Accent 1" w:semiHidden="0"/>
+    <w:lsdException w:name="Colorful Grid Accent 1" w:semiHidden="0"/>
+    <w:lsdException w:name="Light Shading Accent 2" w:semiHidden="0"/>
+    <w:lsdException w:name="Light List Accent 2" w:semiHidden="0"/>
+    <w:lsdException w:name="Light Grid Accent 2" w:semiHidden="0"/>
+    <w:lsdException w:name="Medium Shading 1 Accent 2" w:semiHidden="0"/>
+    <w:lsdException w:name="Medium Shading 2 Accent 2" w:semiHidden="0"/>
+    <w:lsdException w:name="Medium List 1 Accent 2" w:semiHidden="0"/>
+    <w:lsdException w:name="Medium List 2 Accent 2" w:semiHidden="0"/>
+    <w:lsdException w:name="Medium Grid 1 Accent 2" w:semiHidden="0"/>
+    <w:lsdException w:name="Medium Grid 2 Accent 2" w:semiHidden="0"/>
+    <w:lsdException w:name="Medium Grid 3 Accent 2" w:semiHidden="0"/>
+    <w:lsdException w:name="Dark List Accent 2" w:semiHidden="0"/>
+    <w:lsdException w:name="Colorful Shading Accent 2" w:semiHidden="0"/>
+    <w:lsdException w:name="Colorful List Accent 2" w:semiHidden="0"/>
+    <w:lsdException w:name="Colorful Grid Accent 2" w:semiHidden="0"/>
+    <w:lsdException w:name="Light Shading Accent 3" w:semiHidden="0"/>
+    <w:lsdException w:name="Light List Accent 3" w:semiHidden="0"/>
+    <w:lsdException w:name="Light Grid Accent 3" w:semiHidden="0"/>
+    <w:lsdException w:name="Medium Shading 1 Accent 3" w:semiHidden="0"/>
+    <w:lsdException w:name="Medium Shading 2 Accent 3" w:semiHidden="0"/>
+    <w:lsdException w:name="Medium List 1 Accent 3" w:semiHidden="0"/>
+    <w:lsdException w:name="Medium List 2 Accent 3" w:semiHidden="0"/>
+    <w:lsdException w:name="Medium Grid 1 Accent 3" w:semiHidden="0"/>
+    <w:lsdException w:name="Medium Grid 2 Accent 3" w:semiHidden="0"/>
+    <w:lsdException w:name="Medium Grid 3 Accent 3" w:semiHidden="0"/>
+    <w:lsdException w:name="Dark List Accent 3" w:semiHidden="0"/>
+    <w:lsdException w:name="Colorful Shading Accent 3" w:semiHidden="0"/>
+    <w:lsdException w:name="Colorful List Accent 3" w:semiHidden="0"/>
+    <w:lsdException w:name="Colorful Grid Accent 3" w:semiHidden="0"/>
+    <w:lsdException w:name="Light Shading Accent 4" w:semiHidden="0"/>
+    <w:lsdException w:name="Light List Accent 4" w:semiHidden="0"/>
+    <w:lsdException w:name="Light Grid Accent 4" w:semiHidden="0"/>
+    <w:lsdException w:name="Medium Shading 1 Accent 4" w:semiHidden="0"/>
+    <w:lsdException w:name="Medium Shading 2 Accent 4" w:semiHidden="0"/>
+    <w:lsdException w:name="Medium List 1 Accent 4" w:semiHidden="0"/>
+    <w:lsdException w:name="Medium List 2 Accent 4" w:semiHidden="0"/>
+    <w:lsdException w:name="Medium Grid 1 Accent 4" w:semiHidden="0"/>
+    <w:lsdException w:name="Medium Grid 2 Accent 4" w:semiHidden="0"/>
+    <w:lsdException w:name="Medium Grid 3 Accent 4" w:semiHidden="0"/>
+    <w:lsdException w:name="Dark List Accent 4" w:semiHidden="0"/>
+    <w:lsdException w:name="Colorful Shading Accent 4" w:semiHidden="0"/>
+    <w:lsdException w:name="Colorful List Accent 4" w:semiHidden="0"/>
+    <w:lsdException w:name="Colorful Grid Accent 4" w:semiHidden="0"/>
+    <w:lsdException w:name="Light Shading Accent 5" w:semiHidden="0"/>
+    <w:lsdException w:name="Light List Accent 5" w:semiHidden="0"/>
+    <w:lsdException w:name="Light Grid Accent 5" w:semiHidden="0"/>
+    <w:lsdException w:name="Medium Shading 1 Accent 5" w:semiHidden="0"/>
+    <w:lsdException w:name="Medium Shading 2 Accent 5" w:semiHidden="0"/>
+    <w:lsdException w:name="Medium List 1 Accent 5" w:semiHidden="0"/>
+    <w:lsdException w:name="Medium List 2 Accent 5" w:semiHidden="0"/>
+    <w:lsdException w:name="Medium Grid 1 Accent 5" w:semiHidden="0"/>
+    <w:lsdException w:name="Medium Grid 2 Accent 5" w:semiHidden="0"/>
+    <w:lsdException w:name="Medium Grid 3 Accent 5" w:semiHidden="0"/>
+    <w:lsdException w:name="Dark List Accent 5" w:semiHidden="0"/>
+    <w:lsdException w:name="Colorful Shading Accent 5" w:semiHidden="0"/>
+    <w:lsdException w:name="Colorful List Accent 5" w:semiHidden="0"/>
+    <w:lsdException w:name="Colorful Grid Accent 5" w:semiHidden="0"/>
+    <w:lsdException w:name="Light Shading Accent 6" w:semiHidden="0"/>
+    <w:lsdException w:name="Light List Accent 6" w:semiHidden="0"/>
+    <w:lsdException w:name="Light Grid Accent 6" w:semiHidden="0"/>
+    <w:lsdException w:name="Medium Shading 1 Accent 6" w:semiHidden="0"/>
+    <w:lsdException w:name="Medium Shading 2 Accent 6" w:semiHidden="0"/>
+    <w:lsdException w:name="Medium List 1 Accent 6" w:semiHidden="0"/>
+    <w:lsdException w:name="Medium List 2 Accent 6" w:semiHidden="0"/>
+    <w:lsdException w:name="Medium Grid 1 Accent 6" w:semiHidden="0"/>
+    <w:lsdException w:name="Medium Grid 2 Accent 6" w:semiHidden="0"/>
+    <w:lsdException w:name="Medium Grid 3 Accent 6" w:semiHidden="0"/>
+    <w:lsdException w:name="Dark List Accent 6" w:semiHidden="0"/>
+    <w:lsdException w:name="Colorful Shading Accent 6" w:semiHidden="0"/>
+    <w:lsdException w:name="Colorful List Accent 6" w:semiHidden="0"/>
+    <w:lsdException w:name="Colorful Grid Accent 6" w:semiHidden="0"/>
+    <w:lsdException w:name="Subtle Emphasis" w:semiHidden="0"/>
+    <w:lsdException w:name="Intense Emphasis" w:semiHidden="0"/>
+    <w:lsdException w:name="Subtle Reference" w:semiHidden="0"/>
+    <w:lsdException w:name="Intense Reference" w:semiHidden="0"/>
+    <w:lsdException w:name="Book Title" w:semiHidden="0"/>
+    <w:lsdException w:name="Bibliography" w:unhideWhenUsed="1"/>
+    <w:lsdException w:name="TOC Heading" w:unhideWhenUsed="1"/>
+  </w:latentStyles>
+  <w:style w:type="paragraph" w:default="1" w:styleId="Normal">
+    <w:name w:val="Normal"/>
+    <w:qFormat/>
+    <w:rsid w:val="008F2235"/>
+  </w:style>
+  <w:style w:type="paragraph" w:styleId="Heading1">
+    <w:name w:val="heading 1"/>
+    <w:basedOn w:val="Normal"/>
+    <w:next w:val="BodyText"/>
+    <w:uiPriority w:val="9"/>
+    <w:qFormat/>
+    <w:pPr>
+      <w:keepNext/>
+      <w:keepLines/>
+      <w:spacing w:before="480" w:after="0"/>
+      <w:outlineLvl w:val="0"/>
+    </w:pPr>
+    <w:rPr>
+      <w:rFonts w:asciiTheme="majorHAnsi" w:eastAsiaTheme="majorEastAsia" w:hAnsiTheme="majorHAnsi" w:cstheme="majorBidi"/>
+      <w:b/>
+      <w:bCs/>
+      <w:color w:val="345A8A" w:themeColor="accent1" w:themeShade="B5"/>
+      <w:sz w:val="32"/>
+      <w:szCs w:val="32"/>
+    </w:rPr>
+  </w:style>
+  <w:style w:type="paragraph" w:styleId="Heading2">
+    <w:name w:val="heading 2"/>
+    <w:basedOn w:val="Normal"/>
+    <w:next w:val="BodyText"/>
+    <w:uiPriority w:val="9"/>
+    <w:unhideWhenUsed/>
+    <w:qFormat/>
+    <w:pPr>
+      <w:keepNext/>
+      <w:keepLines/>
+      <w:spacing w:before="200" w:after="0"/>
+      <w:outlineLvl w:val="1"/>
+    </w:pPr>
+    <w:rPr>
+      <w:rFonts w:asciiTheme="majorHAnsi" w:eastAsiaTheme="majorEastAsia" w:hAnsiTheme="majorHAnsi" w:cstheme="majorBidi"/>
+      <w:b/>
+      <w:bCs/>
+      <w:color w:val="4F81BD" w:themeColor="accent1"/>
+      <w:sz w:val="32"/>
+      <w:szCs w:val="32"/>
+    </w:rPr>
+  </w:style>
+  <w:style w:type="paragraph" w:styleId="Heading3">
+    <w:name w:val="heading 3"/>
+    <w:basedOn w:val="Normal"/>
+    <w:next w:val="BodyText"/>
+    <w:uiPriority w:val="9"/>
+    <w:unhideWhenUsed/>
+    <w:qFormat/>
+    <w:pPr>
+      <w:keepNext/>
+      <w:keepLines/>
+      <w:spacing w:before="200" w:after="0"/>
+      <w:outlineLvl w:val="2"/>
+    </w:pPr>
+    <w:rPr>
+      <w:rFonts w:asciiTheme="majorHAnsi" w:eastAsiaTheme="majorEastAsia" w:hAnsiTheme="majorHAnsi" w:cstheme="majorBidi"/>
+      <w:b/>
+      <w:bCs/>
+      <w:color w:val="4F81BD" w:themeColor="accent1"/>
+      <w:sz w:val="28"/>
+      <w:szCs w:val="28"/>
+    </w:rPr>
+  </w:style>
+  <w:style w:type="paragraph" w:styleId="Heading4">
+    <w:name w:val="heading 4"/>
+    <w:basedOn w:val="Normal"/>
+    <w:next w:val="BodyText"/>
+    <w:uiPriority w:val="9"/>
+    <w:unhideWhenUsed/>
+    <w:qFormat/>
+    <w:pPr>
+      <w:keepNext/>
+      <w:keepLines/>
+      <w:spacing w:before="200" w:after="0"/>
+      <w:outlineLvl w:val="3"/>
+    </w:pPr>
+    <w:rPr>
+      <w:rFonts w:asciiTheme="majorHAnsi" w:eastAsiaTheme="majorEastAsia" w:hAnsiTheme="majorHAnsi" w:cstheme="majorBidi"/>
+      <w:b/>
+      <w:bCs/>
+      <w:color w:val="4F81BD" w:themeColor="accent1"/>
+    </w:rPr>
+  </w:style>
+  <w:style w:type="paragraph" w:styleId="Heading5">
+    <w:name w:val="heading 5"/>
+    <w:basedOn w:val="Normal"/>
+    <w:next w:val="BodyText"/>
+    <w:uiPriority w:val="9"/>
+    <w:unhideWhenUsed/>
+    <w:qFormat/>
+    <w:pPr>
+      <w:keepNext/>
+      <w:keepLines/>
+      <w:spacing w:before="200" w:after="0"/>
+      <w:outlineLvl w:val="4"/>
+    </w:pPr>
+    <w:rPr>
+      <w:rFonts w:asciiTheme="majorHAnsi" w:eastAsiaTheme="majorEastAsia" w:hAnsiTheme="majorHAnsi" w:cstheme="majorBidi"/>
+      <w:i/>
+      <w:iCs/>
+      <w:color w:val="4F81BD" w:themeColor="accent1"/>
+    </w:rPr>
+  </w:style>
+  <w:style w:type="paragraph" w:styleId="Heading6">
+    <w:name w:val="heading 6"/>
+    <w:basedOn w:val="Normal"/>
+    <w:next w:val="BodyText"/>
+    <w:uiPriority w:val="9"/>
+    <w:unhideWhenUsed/>
+    <w:qFormat/>
+    <w:pPr>
+      <w:keepNext/>
+      <w:keepLines/>
+      <w:spacing w:before="200" w:after="0"/>
+      <w:outlineLvl w:val="5"/>
+    </w:pPr>
+    <w:rPr>
+      <w:rFonts w:asciiTheme="majorHAnsi" w:eastAsiaTheme="majorEastAsia" w:hAnsiTheme="majorHAnsi" w:cstheme="majorBidi"/>
+      <w:color w:val="4F81BD" w:themeColor="accent1"/>
+    </w:rPr>
+  </w:style>
+  <w:style w:type="paragraph" w:styleId="Heading7">
+    <w:name w:val="heading 7"/>
+    <w:basedOn w:val="Normal"/>
+    <w:next w:val="BodyText"/>
+    <w:uiPriority w:val="9"/>
+    <w:unhideWhenUsed/>
+    <w:qFormat/>
+    <w:pPr>
+      <w:keepNext/>
+      <w:keepLines/>
+      <w:spacing w:before="200" w:after="0"/>
+      <w:outlineLvl w:val="6"/>
+    </w:pPr>
+    <w:rPr>
+      <w:rFonts w:asciiTheme="majorHAnsi" w:eastAsiaTheme="majorEastAsia" w:hAnsiTheme="majorHAnsi" w:cstheme="majorBidi"/>
+      <w:color w:val="4F81BD" w:themeColor="accent1"/>
+    </w:rPr>
+  </w:style>
+  <w:style w:type="paragraph" w:styleId="Heading8">
+    <w:name w:val="heading 8"/>
+    <w:basedOn w:val="Normal"/>
+    <w:next w:val="BodyText"/>
+    <w:uiPriority w:val="9"/>
+    <w:unhideWhenUsed/>
+    <w:qFormat/>
+    <w:pPr>
+      <w:keepNext/>
+      <w:keepLines/>
+      <w:spacing w:before="200" w:after="0"/>
+      <w:outlineLvl w:val="7"/>
+    </w:pPr>
+    <w:rPr>
+      <w:rFonts w:asciiTheme="majorHAnsi" w:eastAsiaTheme="majorEastAsia" w:hAnsiTheme="majorHAnsi" w:cstheme="majorBidi"/>
+      <w:color w:val="4F81BD" w:themeColor="accent1"/>
+    </w:rPr>
+  </w:style>
+  <w:style w:type="paragraph" w:styleId="Heading9">
+    <w:name w:val="heading 9"/>
+    <w:basedOn w:val="Normal"/>
+    <w:next w:val="BodyText"/>
+    <w:uiPriority w:val="9"/>
+    <w:unhideWhenUsed/>
+    <w:qFormat/>
+    <w:pPr>
+      <w:keepNext/>
+      <w:keepLines/>
+      <w:spacing w:before="200" w:after="0"/>
+      <w:outlineLvl w:val="8"/>
+    </w:pPr>
+    <w:rPr>
+      <w:rFonts w:asciiTheme="majorHAnsi" w:eastAsiaTheme="majorEastAsia" w:hAnsiTheme="majorHAnsi" w:cstheme="majorBidi"/>
+      <w:color w:val="4F81BD" w:themeColor="accent1"/>
+    </w:rPr>
+  </w:style>
+  <w:style w:type="character" w:default="1" w:styleId="DefaultParagraphFont">
+    <w:name w:val="Default Paragraph Font"/>
+    <w:uiPriority w:val="1"/>
+    <w:semiHidden/>
+    <w:unhideWhenUsed/>
+  </w:style>
+  <w:style w:type="table" w:default="1" w:styleId="TableNormal">
+    <w:name w:val="Normal Table"/>
+    <w:uiPriority w:val="99"/>
+    <w:semiHidden/>
+    <w:unhideWhenUsed/>
+    <w:tblPr>
+      <w:tblInd w:w="0" w:type="dxa"/>
+      <w:tblCellMar>
+        <w:top w:w="0" w:type="dxa"/>
+        <w:left w:w="108" w:type="dxa"/>
+        <w:bottom w:w="0" w:type="dxa"/>
+        <w:right w:w="108" w:type="dxa"/>
+      </w:tblCellMar>
+    </w:tblPr>
+  </w:style>
+  <w:style w:type="numbering" w:default="1" w:styleId="NoList">
+    <w:name w:val="No List"/>
+    <w:uiPriority w:val="99"/>
+    <w:semiHidden/>
+    <w:unhideWhenUsed/>
+  </w:style>
+  <w:style w:type="paragraph" w:styleId="BodyText">
+    <w:name w:val="Body Text"/>
+    <w:basedOn w:val="Normal"/>
+    <w:link w:val="BodyTextChar"/>
+    <w:qFormat/>
+    <w:pPr>
+      <w:spacing w:before="180" w:after="180"/>
+    </w:pPr>
+  </w:style>
+  <w:style w:type="paragraph" w:customStyle="1" w:styleId="FirstParagraph">
+    <w:name w:val="First Paragraph"/>
+    <w:basedOn w:val="BodyText"/>
+    <w:next w:val="BodyText"/>
+    <w:qFormat/>
+  </w:style>
+  <w:style w:type="paragraph" w:customStyle="1" w:styleId="Compact">
+    <w:name w:val="Compact"/>
+    <w:basedOn w:val="BodyText"/>
+    <w:qFormat/>
+    <w:pPr>
+      <w:spacing w:before="36" w:after="36"/>
+    </w:pPr>
+  </w:style>
+  <w:style w:type="paragraph" w:styleId="Title">
+    <w:name w:val="Title"/>
+    <w:basedOn w:val="Normal"/>
+    <w:next w:val="BodyText"/>
+    <w:link w:val="TitleChar"/>
+    <w:qFormat/>
+    <w:pPr>
+      <w:keepNext/>
+      <w:keepLines/>
+      <w:spacing w:before="480" w:after="240"/>
+      <w:jc w:val="center"/>
+    </w:pPr>
+    <w:rPr>
+      <w:rFonts w:asciiTheme="majorHAnsi" w:eastAsiaTheme="majorEastAsia" w:hAnsiTheme="majorHAnsi" w:cstheme="majorBidi"/>
+      <w:b/>
+      <w:bCs/>
+      <w:color w:val="345A8A" w:themeColor="accent1" w:themeShade="B5"/>
+      <w:sz w:val="36"/>
+      <w:szCs w:val="36"/>
+    </w:rPr>
+  </w:style>
+  <w:style w:type="paragraph" w:styleId="Subtitle">
+    <w:name w:val="Subtitle"/>
+    <w:basedOn w:val="Title"/>
+    <w:next w:val="BodyText"/>
+    <w:qFormat/>
+    <w:pPr>
+      <w:spacing w:before="240"/>
+    </w:pPr>
+    <w:rPr>
+      <w:sz w:val="30"/>
+      <w:szCs w:val="30"/>
+    </w:rPr>
+  </w:style>
+  <w:style w:type="paragraph" w:customStyle="1" w:styleId="Author">
+    <w:name w:val="Author"/>
+    <w:next w:val="BodyText"/>
+    <w:qFormat/>
+    <w:pPr>
+      <w:keepNext/>
+      <w:keepLines/>
+      <w:jc w:val="center"/>
+    </w:pPr>
+  </w:style>
+  <w:style w:type="paragraph" w:styleId="Date">
+    <w:name w:val="Date"/>
+    <w:next w:val="BodyText"/>
+    <w:qFormat/>
+    <w:pPr>
+      <w:keepNext/>
+      <w:keepLines/>
+      <w:jc w:val="center"/>
+    </w:pPr>
+  </w:style>
+  <w:style w:type="paragraph" w:customStyle="1" w:styleId="Abstract">
+    <w:name w:val="Abstract"/>
+    <w:basedOn w:val="Normal"/>
+    <w:next w:val="BodyText"/>
+    <w:qFormat/>
+    <w:pPr>
+      <w:keepNext/>
+      <w:keepLines/>
+      <w:spacing w:before="300" w:after="300"/>
+    </w:pPr>
+    <w:rPr>
+      <w:sz w:val="20"/>
+      <w:szCs w:val="20"/>
+    </w:rPr>
+  </w:style>
+  <w:style w:type="paragraph" w:styleId="Bibliography">
+    <w:name w:val="Bibliography"/>
+    <w:basedOn w:val="Normal"/>
+    <w:qFormat/>
+  </w:style>
+  <w:style w:type="paragraph" w:styleId="BlockText">
+    <w:name w:val="Block Text"/>
+    <w:basedOn w:val="BodyText"/>
+    <w:next w:val="BodyText"/>
+    <w:uiPriority w:val="9"/>
+    <w:unhideWhenUsed/>
+    <w:qFormat/>
+    <w:pPr>
+      <w:spacing w:before="100" w:after="100"/>
+    </w:pPr>
+    <w:rPr>
+      <w:rFonts w:asciiTheme="majorHAnsi" w:eastAsiaTheme="majorEastAsia" w:hAnsiTheme="majorHAnsi" w:cstheme="majorBidi"/>
+      <w:bCs/>
+      <w:sz w:val="20"/>
+      <w:szCs w:val="20"/>
+    </w:rPr>
+  </w:style>
+  <w:style w:type="paragraph" w:styleId="FootnoteText">
+    <w:name w:val="footnote text"/>
+    <w:basedOn w:val="Normal"/>
+    <w:uiPriority w:val="9"/>
+    <w:unhideWhenUsed/>
+    <w:qFormat/>
+  </w:style>
+  <w:style w:type="table" w:customStyle="1" w:styleId="Table">
+    <w:name w:val="Table"/>
+    <w:semiHidden/>
+    <w:unhideWhenUsed/>
+    <w:qFormat/>
+    <w:tblPr>
+      <w:tblInd w:w="0" w:type="dxa"/>
+      <w:tblCellMar>
+        <w:top w:w="0" w:type="dxa"/>
+        <w:left w:w="108" w:type="dxa"/>
+        <w:bottom w:w="0" w:type="dxa"/>
+        <w:right w:w="108" w:type="dxa"/>
+      </w:tblCellMar>
+    </w:tblPr>
+  </w:style>
+  <w:style w:type="paragraph" w:customStyle="1" w:styleId="DefinitionTerm">
+    <w:name w:val="Definition Term"/>
+    <w:basedOn w:val="Normal"/>
+    <w:next w:val="Definition"/>
+    <w:pPr>
+      <w:keepNext/>
+      <w:keepLines/>
+      <w:spacing w:after="0"/>
+    </w:pPr>
+    <w:rPr>
+      <w:b/>
+    </w:rPr>
+  </w:style>
+  <w:style w:type="paragraph" w:customStyle="1" w:styleId="Definition">
+    <w:name w:val="Definition"/>
+    <w:basedOn w:val="Normal"/>
+  </w:style>
+  <w:style w:type="paragraph" w:styleId="Caption">
+    <w:name w:val="caption"/>
+    <w:basedOn w:val="Normal"/>
+    <w:link w:val="CaptionChar"/>
+    <w:pPr>
+      <w:spacing w:after="120"/>
+    </w:pPr>
+    <w:rPr>
+      <w:i/>
+    </w:rPr>
+  </w:style>
+  <w:style w:type="paragraph" w:customStyle="1" w:styleId="TableCaption">
+    <w:name w:val="Table Caption"/>
+    <w:basedOn w:val="Caption"/>
+    <w:pPr>
+      <w:keepNext/>
+    </w:pPr>
+  </w:style>
+  <w:style w:type="paragraph" w:customStyle="1" w:styleId="ImageCaption">
+    <w:name w:val="Image Caption"/>
+    <w:basedOn w:val="Caption"/>
+  </w:style>
+  <w:style w:type="paragraph" w:customStyle="1" w:styleId="Figure">
+    <w:name w:val="Figure"/>
+    <w:basedOn w:val="Normal"/>
+  </w:style>
+  <w:style w:type="paragraph" w:customStyle="1" w:styleId="CaptionedFigure">
+    <w:name w:val="Captioned Figure"/>
+    <w:basedOn w:val="Figure"/>
+    <w:pPr>
+      <w:keepNext/>
+    </w:pPr>
+  </w:style>
+  <w:style w:type="character" w:customStyle="1" w:styleId="CaptionChar">
+    <w:name w:val="Caption Char"/>
+    <w:basedOn w:val="DefaultParagraphFont"/>
+    <w:link w:val="Caption"/>
+  </w:style>
+  <w:style w:type="character" w:customStyle="1" w:styleId="VerbatimChar">
+    <w:name w:val="Verbatim Char"/>
+    <w:basedOn w:val="CaptionChar"/>
+    <w:link w:val="SourceCode"/>
+    <w:rPr>
+      <w:rFonts w:ascii="Consolas" w:hAnsi="Consolas"/>
+      <w:sz w:val="22"/>
+    </w:rPr>
+  </w:style>
+  <w:style w:type="character" w:styleId="FootnoteReference">
+    <w:name w:val="footnote reference"/>
+    <w:basedOn w:val="CaptionChar"/>
+    <w:rPr>
+      <w:vertAlign w:val="superscript"/>
+    </w:rPr>
+  </w:style>
+  <w:style w:type="character" w:styleId="Hyperlink">
+    <w:name w:val="Hyperlink"/>
+    <w:basedOn w:val="CaptionChar"/>
+    <w:rPr>
+      <w:color w:val="4F81BD" w:themeColor="accent1"/>
+    </w:rPr>
+  </w:style>
+  <w:style w:type="paragraph" w:styleId="TOCHeading">
+    <w:name w:val="TOC Heading"/>
+    <w:basedOn w:val="Heading1"/>
+    <w:next w:val="BodyText"/>
+    <w:uiPriority w:val="39"/>
+    <w:unhideWhenUsed/>
+    <w:qFormat/>
+    <w:pPr>
+      <w:spacing w:before="240" w:line="259" w:lineRule="auto"/>
+      <w:outlineLvl w:val="9"/>
+    </w:pPr>
+    <w:rPr>
+      <w:b w:val="0"/>
+      <w:bCs w:val="0"/>
+      <w:color w:val="365F91" w:themeColor="accent1" w:themeShade="BF"/>
+    </w:rPr>
+  </w:style>
+  <w:style w:type="paragraph" w:customStyle="1" w:styleId="SourceCode">
+    <w:name w:val="Source Code"/>
+    <w:basedOn w:val="Normal"/>
+    <w:link w:val="VerbatimChar"/>
+    <w:pPr>
+      <w:wordWrap w:val="0"/>
+    </w:pPr>
+  </w:style>
+  <w:style w:type="character" w:customStyle="1" w:styleId="KeywordTok">
+    <w:name w:val="KeywordTok"/>
+    <w:basedOn w:val="VerbatimChar"/>
+    <w:rPr>
+      <w:rFonts w:ascii="Consolas" w:hAnsi="Consolas"/>
+      <w:b/>
+      <w:color w:val="007020"/>
+      <w:sz w:val="22"/>
+    </w:rPr>
+  </w:style>
+  <w:style w:type="character" w:customStyle="1" w:styleId="DataTypeTok">
+    <w:name w:val="DataTypeTok"/>
+    <w:basedOn w:val="VerbatimChar"/>
+    <w:rPr>
+      <w:rFonts w:ascii="Consolas" w:hAnsi="Consolas"/>
+      <w:color w:val="902000"/>
+      <w:sz w:val="22"/>
+    </w:rPr>
+  </w:style>
+  <w:style w:type="character" w:customStyle="1" w:styleId="DecValTok">
+    <w:name w:val="DecValTok"/>
+    <w:basedOn w:val="VerbatimChar"/>
+    <w:rPr>
+      <w:rFonts w:ascii="Consolas" w:hAnsi="Consolas"/>
+      <w:color w:val="40A070"/>
+      <w:sz w:val="22"/>
+    </w:rPr>
+  </w:style>
+  <w:style w:type="character" w:customStyle="1" w:styleId="BaseNTok">
+    <w:name w:val="BaseNTok"/>
+    <w:basedOn w:val="VerbatimChar"/>
+    <w:rPr>
+      <w:rFonts w:ascii="Consolas" w:hAnsi="Consolas"/>
+      <w:color w:val="40A070"/>
+      <w:sz w:val="22"/>
+    </w:rPr>
+  </w:style>
+  <w:style w:type="character" w:customStyle="1" w:styleId="FloatTok">
+    <w:name w:val="FloatTok"/>
+    <w:basedOn w:val="VerbatimChar"/>
+    <w:rPr>
+      <w:rFonts w:ascii="Consolas" w:hAnsi="Consolas"/>
+      <w:color w:val="40A070"/>
+      <w:sz w:val="22"/>
+    </w:rPr>
+  </w:style>
+  <w:style w:type="character" w:customStyle="1" w:styleId="ConstantTok">
+    <w:name w:val="ConstantTok"/>
+    <w:basedOn w:val="VerbatimChar"/>
+    <w:rPr>
+      <w:rFonts w:ascii="Consolas" w:hAnsi="Consolas"/>
+      <w:color w:val="880000"/>
+      <w:sz w:val="22"/>
+    </w:rPr>
+  </w:style>
+  <w:style w:type="character" w:customStyle="1" w:styleId="CharTok">
+    <w:name w:val="CharTok"/>
+    <w:basedOn w:val="VerbatimChar"/>
+    <w:rPr>
+      <w:rFonts w:ascii="Consolas" w:hAnsi="Consolas"/>
+      <w:color w:val="4070A0"/>
+      <w:sz w:val="22"/>
+    </w:rPr>
+  </w:style>
+  <w:style w:type="character" w:customStyle="1" w:styleId="SpecialCharTok">
+    <w:name w:val="SpecialCharTok"/>
+    <w:basedOn w:val="VerbatimChar"/>
+    <w:rPr>
+      <w:rFonts w:ascii="Consolas" w:hAnsi="Consolas"/>
+      <w:color w:val="4070A0"/>
+      <w:sz w:val="22"/>
+    </w:rPr>
+  </w:style>
+  <w:style w:type="character" w:customStyle="1" w:styleId="StringTok">
+    <w:name w:val="StringTok"/>
+    <w:basedOn w:val="VerbatimChar"/>
+    <w:rPr>
+      <w:rFonts w:ascii="Consolas" w:hAnsi="Consolas"/>
+      <w:color w:val="4070A0"/>
+      <w:sz w:val="22"/>
+    </w:rPr>
+  </w:style>
+  <w:style w:type="character" w:customStyle="1" w:styleId="VerbatimStringTok">
+    <w:name w:val="VerbatimStringTok"/>
+    <w:basedOn w:val="VerbatimChar"/>
+    <w:rPr>
+      <w:rFonts w:ascii="Consolas" w:hAnsi="Consolas"/>
+      <w:color w:val="4070A0"/>
+      <w:sz w:val="22"/>
+    </w:rPr>
+  </w:style>
+  <w:style w:type="character" w:customStyle="1" w:styleId="SpecialStringTok">
+    <w:name w:val="SpecialStringTok"/>
+    <w:basedOn w:val="VerbatimChar"/>
+    <w:rPr>
+      <w:rFonts w:ascii="Consolas" w:hAnsi="Consolas"/>
+      <w:color w:val="BB6688"/>
+      <w:sz w:val="22"/>
+    </w:rPr>
+  </w:style>
+  <w:style w:type="character" w:customStyle="1" w:styleId="ImportTok">
+    <w:name w:val="ImportTok"/>
+    <w:basedOn w:val="VerbatimChar"/>
+    <w:rPr>
+      <w:rFonts w:ascii="Consolas" w:hAnsi="Consolas"/>
+      <w:sz w:val="22"/>
+    </w:rPr>
+  </w:style>
+  <w:style w:type="character" w:customStyle="1" w:styleId="CommentTok">
+    <w:name w:val="CommentTok"/>
+    <w:basedOn w:val="VerbatimChar"/>
+    <w:rPr>
+      <w:rFonts w:ascii="Consolas" w:hAnsi="Consolas"/>
+      <w:i/>
+      <w:color w:val="60A0B0"/>
+      <w:sz w:val="22"/>
+    </w:rPr>
+  </w:style>
+  <w:style w:type="character" w:customStyle="1" w:styleId="DocumentationTok">
+    <w:name w:val="DocumentationTok"/>
+    <w:basedOn w:val="VerbatimChar"/>
+    <w:rPr>
+      <w:rFonts w:ascii="Consolas" w:hAnsi="Consolas"/>
+      <w:i/>
+      <w:color w:val="BA2121"/>
+      <w:sz w:val="22"/>
+    </w:rPr>
+  </w:style>
+  <w:style w:type="character" w:customStyle="1" w:styleId="AnnotationTok">
+    <w:name w:val="AnnotationTok"/>
+    <w:basedOn w:val="VerbatimChar"/>
+    <w:rPr>
+      <w:rFonts w:ascii="Consolas" w:hAnsi="Consolas"/>
+      <w:b/>
+      <w:i/>
+      <w:color w:val="60A0B0"/>
+      <w:sz w:val="22"/>
+    </w:rPr>
+  </w:style>
+  <w:style w:type="character" w:customStyle="1" w:styleId="CommentVarTok">
+    <w:name w:val="CommentVarTok"/>
+    <w:basedOn w:val="VerbatimChar"/>
+    <w:rPr>
+      <w:rFonts w:ascii="Consolas" w:hAnsi="Consolas"/>
+      <w:b/>
+      <w:i/>
+      <w:color w:val="60A0B0"/>
+      <w:sz w:val="22"/>
+    </w:rPr>
+  </w:style>
+  <w:style w:type="character" w:customStyle="1" w:styleId="OtherTok">
+    <w:name w:val="OtherTok"/>
+    <w:basedOn w:val="VerbatimChar"/>
+    <w:rPr>
+      <w:rFonts w:ascii="Consolas" w:hAnsi="Consolas"/>
+      <w:color w:val="007020"/>
+      <w:sz w:val="22"/>
+    </w:rPr>
+  </w:style>
+  <w:style w:type="character" w:customStyle="1" w:styleId="FunctionTok">
+    <w:name w:val="FunctionTok"/>
+    <w:basedOn w:val="VerbatimChar"/>
+    <w:rPr>
+      <w:rFonts w:ascii="Consolas" w:hAnsi="Consolas"/>
+      <w:color w:val="06287E"/>
+      <w:sz w:val="22"/>
+    </w:rPr>
+  </w:style>
+  <w:style w:type="character" w:customStyle="1" w:styleId="VariableTok">
+    <w:name w:val="VariableTok"/>
+    <w:basedOn w:val="VerbatimChar"/>
+    <w:rPr>
+      <w:rFonts w:ascii="Consolas" w:hAnsi="Consolas"/>
+      <w:color w:val="19177C"/>
+      <w:sz w:val="22"/>
+    </w:rPr>
+  </w:style>
+  <w:style w:type="character" w:customStyle="1" w:styleId="ControlFlowTok">
+    <w:name w:val="ControlFlowTok"/>
+    <w:basedOn w:val="VerbatimChar"/>
+    <w:rPr>
+      <w:rFonts w:ascii="Consolas" w:hAnsi="Consolas"/>
+      <w:b/>
+      <w:color w:val="007020"/>
+      <w:sz w:val="22"/>
+    </w:rPr>
+  </w:style>
+  <w:style w:type="character" w:customStyle="1" w:styleId="OperatorTok">
+    <w:name w:val="OperatorTok"/>
+    <w:basedOn w:val="VerbatimChar"/>
+    <w:rPr>
+      <w:rFonts w:ascii="Consolas" w:hAnsi="Consolas"/>
+      <w:color w:val="666666"/>
+      <w:sz w:val="22"/>
+    </w:rPr>
+  </w:style>
+  <w:style w:type="character" w:customStyle="1" w:styleId="BuiltInTok">
+    <w:name w:val="BuiltInTok"/>
+    <w:basedOn w:val="VerbatimChar"/>
+    <w:rPr>
+      <w:rFonts w:ascii="Consolas" w:hAnsi="Consolas"/>
+      <w:sz w:val="22"/>
+    </w:rPr>
+  </w:style>
+  <w:style w:type="character" w:customStyle="1" w:styleId="ExtensionTok">
+    <w:name w:val="ExtensionTok"/>
+    <w:basedOn w:val="VerbatimChar"/>
+    <w:rPr>
+      <w:rFonts w:ascii="Consolas" w:hAnsi="Consolas"/>
+      <w:sz w:val="22"/>
+    </w:rPr>
+  </w:style>
+  <w:style w:type="character" w:customStyle="1" w:styleId="PreprocessorTok">
+    <w:name w:val="PreprocessorTok"/>
+    <w:basedOn w:val="VerbatimChar"/>
+    <w:rPr>
+      <w:rFonts w:ascii="Consolas" w:hAnsi="Consolas"/>
+      <w:color w:val="BC7A00"/>
+      <w:sz w:val="22"/>
+    </w:rPr>
+  </w:style>
+  <w:style w:type="character" w:customStyle="1" w:styleId="AttributeTok">
+    <w:name w:val="AttributeTok"/>
+    <w:basedOn w:val="VerbatimChar"/>
+    <w:rPr>
+      <w:rFonts w:ascii="Consolas" w:hAnsi="Consolas"/>
+      <w:color w:val="7D9029"/>
+      <w:sz w:val="22"/>
+    </w:rPr>
+  </w:style>
+  <w:style w:type="character" w:customStyle="1" w:styleId="RegionMarkerTok">
+    <w:name w:val="RegionMarkerTok"/>
+    <w:basedOn w:val="VerbatimChar"/>
+    <w:rPr>
+      <w:rFonts w:ascii="Consolas" w:hAnsi="Consolas"/>
+      <w:sz w:val="22"/>
+    </w:rPr>
+  </w:style>
+  <w:style w:type="character" w:customStyle="1" w:styleId="InformationTok">
+    <w:name w:val="InformationTok"/>
+    <w:basedOn w:val="VerbatimChar"/>
+    <w:rPr>
+      <w:rFonts w:ascii="Consolas" w:hAnsi="Consolas"/>
+      <w:b/>
+      <w:i/>
+      <w:color w:val="60A0B0"/>
+      <w:sz w:val="22"/>
+    </w:rPr>
+  </w:style>
+  <w:style w:type="character" w:customStyle="1" w:styleId="WarningTok">
+    <w:name w:val="WarningTok"/>
+    <w:basedOn w:val="VerbatimChar"/>
+    <w:rPr>
+      <w:rFonts w:ascii="Consolas" w:hAnsi="Consolas"/>
+      <w:b/>
+      <w:i/>
+      <w:color w:val="60A0B0"/>
+      <w:sz w:val="22"/>
+    </w:rPr>
+  </w:style>
+  <w:style w:type="character" w:customStyle="1" w:styleId="AlertTok">
+    <w:name w:val="AlertTok"/>
+    <w:basedOn w:val="VerbatimChar"/>
+    <w:rPr>
+      <w:rFonts w:ascii="Consolas" w:hAnsi="Consolas"/>
+      <w:b/>
+      <w:color w:val="FF0000"/>
+      <w:sz w:val="22"/>
+    </w:rPr>
+  </w:style>
+  <w:style w:type="character" w:customStyle="1" w:styleId="ErrorTok">
+    <w:name w:val="ErrorTok"/>
+    <w:basedOn w:val="VerbatimChar"/>
+    <w:rPr>
+      <w:rFonts w:ascii="Consolas" w:hAnsi="Consolas"/>
+      <w:b/>
+      <w:color w:val="FF0000"/>
+      <w:sz w:val="22"/>
+    </w:rPr>
+  </w:style>
+  <w:style w:type="character" w:customStyle="1" w:styleId="NormalTok">
+    <w:name w:val="NormalTok"/>
+    <w:basedOn w:val="VerbatimChar"/>
+    <w:rPr>
+      <w:rFonts w:ascii="Consolas" w:hAnsi="Consolas"/>
+      <w:sz w:val="22"/>
+    </w:rPr>
+  </w:style>
+  <w:style w:type="paragraph" w:styleId="Header">
+    <w:name w:val="header"/>
+    <w:basedOn w:val="Normal"/>
+    <w:link w:val="HeaderChar"/>
+    <w:uiPriority w:val="99"/>
+    <w:unhideWhenUsed/>
+    <w:rsid w:val="00E03F2E"/>
+    <w:pPr>
+      <w:tabs>
+        <w:tab w:val="center" w:pos="4153"/>
+        <w:tab w:val="right" w:pos="8306"/>
+      </w:tabs>
+      <w:spacing w:after="0"/>
+    </w:pPr>
+  </w:style>
+  <w:style w:type="character" w:customStyle="1" w:styleId="HeaderChar">
+    <w:name w:val="Header Char"/>
+    <w:basedOn w:val="DefaultParagraphFont"/>
+    <w:link w:val="Header"/>
+    <w:uiPriority w:val="99"/>
+    <w:rsid w:val="00E03F2E"/>
+  </w:style>
+  <w:style w:type="paragraph" w:styleId="Footer">
+    <w:name w:val="footer"/>
+    <w:basedOn w:val="Normal"/>
+    <w:link w:val="FooterChar"/>
+    <w:unhideWhenUsed/>
+    <w:rsid w:val="00E03F2E"/>
+    <w:pPr>
+      <w:tabs>
+        <w:tab w:val="center" w:pos="4153"/>
+        <w:tab w:val="right" w:pos="8306"/>
+      </w:tabs>
+      <w:spacing w:after="0"/>
+    </w:pPr>
+  </w:style>
+  <w:style w:type="character" w:customStyle="1" w:styleId="FooterChar">
+    <w:name w:val="Footer Char"/>
+    <w:basedOn w:val="DefaultParagraphFont"/>
+    <w:link w:val="Footer"/>
+    <w:rsid w:val="00E03F2E"/>
+  </w:style>
+  <w:style w:type="character" w:styleId="PlaceholderText">
+    <w:name w:val="Placeholder Text"/>
+    <w:basedOn w:val="DefaultParagraphFont"/>
+    <w:semiHidden/>
+    <w:rsid w:val="000F272C"/>
+    <w:rPr>
+      <w:color w:val="808080"/>
+    </w:rPr>
+  </w:style>
+  <w:style w:type="paragraph" w:styleId="ListParagraph">
+    <w:name w:val="List Paragraph"/>
+    <w:basedOn w:val="Normal"/>
+    <w:rsid w:val="00F502DB"/>
+    <w:pPr>
+      <w:ind w:left="720"/>
+      <w:contextualSpacing/>
+    </w:pPr>
+  </w:style>
+  <w:style w:type="character" w:customStyle="1" w:styleId="BodyTextChar">
+    <w:name w:val="Body Text Char"/>
+    <w:basedOn w:val="DefaultParagraphFont"/>
+    <w:link w:val="BodyText"/>
+    <w:rsid w:val="006D4B55"/>
+  </w:style>
+  <w:style w:type="paragraph" w:customStyle="1" w:styleId="TiMiHeading1">
+    <w:name w:val="TiMi Heading 1"/>
+    <w:qFormat/>
+    <w:rsid w:val="003618F6"/>
+    <w:pPr>
+      <w:spacing w:after="0"/>
+    </w:pPr>
+    <w:rPr>
+      <w:rFonts w:ascii="Arial" w:eastAsia="Arial" w:hAnsi="Arial" w:cs="Arial"/>
+      <w:b/>
+      <w:bCs/>
+      <w:color w:val="365F91"/>
+      <w:sz w:val="28"/>
+      <w:szCs w:val="28"/>
+      <w:rtl/>
+      <w:lang w:bidi="he-IL"/>
+    </w:rPr>
+  </w:style>
+  <w:style w:type="paragraph" w:customStyle="1" w:styleId="TiMiNormal">
+    <w:name w:val="TiMi Normal"/>
+    <w:qFormat/>
+    <w:rsid w:val="003618F6"/>
+    <w:pPr>
+      <w:spacing w:after="0"/>
+    </w:pPr>
+    <w:rPr>
+      <w:rFonts w:ascii="Arial" w:eastAsia="Arial" w:hAnsi="Arial" w:cs="Arial"/>
+      <w:color w:val="000000"/>
+      <w:rtl/>
+      <w:lang w:bidi="he-IL"/>
+    </w:rPr>
+  </w:style>
+  <w:style w:type="paragraph" w:customStyle="1" w:styleId="TiMiTitle">
+    <w:name w:val="TiMi Title"/>
+    <w:qFormat/>
+    <w:rsid w:val="003618F6"/>
+    <w:pPr>
+      <w:spacing w:after="0"/>
+    </w:pPr>
+    <w:rPr>
+      <w:rFonts w:ascii="Arial" w:eastAsia="Arial" w:hAnsi="Arial" w:cs="Arial"/>
+      <w:color w:val="17365D"/>
+      <w:sz w:val="52"/>
+      <w:szCs w:val="52"/>
+      <w:rtl/>
+      <w:lang w:bidi="he-IL"/>
+    </w:rPr>
+  </w:style>
+  <w:style w:type="character" w:customStyle="1" w:styleId="TitleChar">
+    <w:name w:val="Title Char"/>
+    <w:basedOn w:val="DefaultParagraphFont"/>
+    <w:link w:val="Title"/>
+    <w:rsid w:val="00887BB1"/>
+    <w:rPr>
+      <w:rFonts w:asciiTheme="majorHAnsi" w:eastAsiaTheme="majorEastAsia" w:hAnsiTheme="majorHAnsi" w:cstheme="majorBidi"/>
+      <w:b/>
+      <w:bCs/>
+      <w:color w:val="345A8A" w:themeColor="accent1" w:themeShade="B5"/>
+      <w:sz w:val="36"/>
+      <w:szCs w:val="36"/>
+    </w:rPr>
+  </w:style>
+  <w:style w:type="table" w:styleId="TableGrid">
+    <w:name w:val="Table Grid"/>
+    <w:basedOn w:val="TableNormal"/>
+    <w:rsid w:val="00A91917"/>
+    <w:pPr>
+      <w:spacing w:after="0"/>
+    </w:pPr>
+    <w:tblPr>
+      <w:tblInd w:w="0" w:type="dxa"/>
+      <w:tblBorders>
+        <w:top w:val="single" w:sz="4" w:space="0" w:color="auto"/>
+        <w:left w:val="single" w:sz="4" w:space="0" w:color="auto"/>
+        <w:bottom w:val="single" w:sz="4" w:space="0" w:color="auto"/>
+        <w:right w:val="single" w:sz="4" w:space="0" w:color="auto"/>
+        <w:insideH w:val="single" w:sz="4" w:space="0" w:color="auto"/>
+        <w:insideV w:val="single" w:sz="4" w:space="0" w:color="auto"/>
+      </w:tblBorders>
+      <w:tblCellMar>
+        <w:top w:w="0" w:type="dxa"/>
+        <w:left w:w="108" w:type="dxa"/>
+        <w:bottom w:w="0" w:type="dxa"/>
+        <w:right w:w="108" w:type="dxa"/>
+      </w:tblCellMar>
+    </w:tblPr>
+  </w:style>
+  <w:style w:type="paragraph" w:customStyle="1" w:styleId="whitespace-normal">
+    <w:name w:val="whitespace-normal"/>
+    <w:basedOn w:val="Normal"/>
+    <w:rsid w:val="00664D04"/>
+    <w:pPr>
+      <w:spacing w:before="100" w:beforeAutospacing="1" w:after="100" w:afterAutospacing="1"/>
+    </w:pPr>
+    <w:rPr>
+      <w:rFonts w:ascii="Times New Roman" w:eastAsia="Times New Roman" w:hAnsi="Times New Roman" w:cs="Times New Roman"/>
+      <w:lang w:bidi="he-IL"/>
+    </w:rPr>
+  </w:style>
+  <w:style w:type="character" w:styleId="Strong">
+    <w:name w:val="Strong"/>
+    <w:basedOn w:val="DefaultParagraphFont"/>
+    <w:uiPriority w:val="22"/>
+    <w:qFormat/>
+    <w:rsid w:val="00F73442"/>
+    <w:rPr>
+      <w:b/>
+      <w:bCs/>
+    </w:rPr>
+  </w:style>
+  <w:style w:type="paragraph" w:customStyle="1" w:styleId="font-claude-response-body">
+    <w:name w:val="font-claude-response-body"/>
+    <w:basedOn w:val="Normal"/>
+    <w:rsid w:val="00EA1773"/>
+    <w:pPr>
+      <w:spacing w:before="100" w:beforeAutospacing="1" w:after="100" w:afterAutospacing="1"/>
+    </w:pPr>
+    <w:rPr>
+      <w:rFonts w:ascii="Times New Roman" w:eastAsia="Times New Roman" w:hAnsi="Times New Roman" w:cs="Times New Roman"/>
+      <w:lang w:bidi="he-IL"/>
+    </w:rPr>
+  </w:style>
+  <w:style w:type="paragraph" w:styleId="HTMLPreformatted">
+    <w:name w:val="HTML Preformatted"/>
+    <w:basedOn w:val="Normal"/>
+    <w:link w:val="HTMLPreformattedChar"/>
+    <w:uiPriority w:val="99"/>
+    <w:semiHidden/>
+    <w:unhideWhenUsed/>
+    <w:rsid w:val="00415DC5"/>
+    <w:pPr>
+      <w:tabs>
+        <w:tab w:val="left" w:pos="916"/>
+        <w:tab w:val="left" w:pos="1832"/>
+        <w:tab w:val="left" w:pos="2748"/>
+        <w:tab w:val="left" w:pos="3664"/>
+        <w:tab w:val="left" w:pos="4580"/>
+        <w:tab w:val="left" w:pos="5496"/>
+        <w:tab w:val="left" w:pos="6412"/>
+        <w:tab w:val="left" w:pos="7328"/>
+        <w:tab w:val="left" w:pos="8244"/>
+        <w:tab w:val="left" w:pos="9160"/>
+        <w:tab w:val="left" w:pos="10076"/>
+        <w:tab w:val="left" w:pos="10992"/>
+        <w:tab w:val="left" w:pos="11908"/>
+        <w:tab w:val="left" w:pos="12824"/>
+        <w:tab w:val="left" w:pos="13740"/>
+        <w:tab w:val="left" w:pos="14656"/>
+      </w:tabs>
+      <w:spacing w:after="0"/>
+    </w:pPr>
+    <w:rPr>
+      <w:rFonts w:ascii="Courier New" w:eastAsia="Times New Roman" w:hAnsi="Courier New" w:cs="Courier New"/>
+      <w:sz w:val="20"/>
+      <w:szCs w:val="20"/>
+      <w:lang w:bidi="he-IL"/>
+    </w:rPr>
+  </w:style>
+  <w:style w:type="character" w:customStyle="1" w:styleId="HTMLPreformattedChar">
+    <w:name w:val="HTML Preformatted Char"/>
+    <w:basedOn w:val="DefaultParagraphFont"/>
+    <w:link w:val="HTMLPreformatted"/>
+    <w:uiPriority w:val="99"/>
+    <w:semiHidden/>
+    <w:rsid w:val="00415DC5"/>
+    <w:rPr>
+      <w:rFonts w:ascii="Courier New" w:eastAsia="Times New Roman" w:hAnsi="Courier New" w:cs="Courier New"/>
+      <w:sz w:val="20"/>
+      <w:szCs w:val="20"/>
+      <w:lang w:bidi="he-IL"/>
+    </w:rPr>
+  </w:style>
+  <w:style w:type="character" w:styleId="HTMLCode">
+    <w:name w:val="HTML Code"/>
+    <w:basedOn w:val="DefaultParagraphFont"/>
     <w:uiPriority w:val="99"/>
     <w:semiHidden/>
     <w:unhideWhenUsed/>
@@ -5423,7 +6266,7 @@
 </file>
 
 <file path=customXml/itemProps2.xml><?xml version="1.0" encoding="utf-8"?>
-<ds:datastoreItem xmlns:ds="http://schemas.openxmlformats.org/officeDocument/2006/customXml" ds:itemID="{464FF088-6FAB-44A8-BC5E-B558D57831F8}">
+<ds:datastoreItem xmlns:ds="http://schemas.openxmlformats.org/officeDocument/2006/customXml" ds:itemID="{79DE6DD6-F1D1-44F9-AF4B-93414D07F7A6}">
   <ds:schemaRefs>
     <ds:schemaRef ds:uri="http://schemas.openxmlformats.org/officeDocument/2006/bibliography"/>
   </ds:schemaRefs>

</xml_diff>